<commit_message>
Implemented Book Borrow Entity
</commit_message>
<xml_diff>
--- a/SystemAnalysisReport.docx
+++ b/SystemAnalysisReport.docx
@@ -90,7 +90,7 @@
           </mc:Choice>
           <mc:Fallback>
             <w:pict>
-              <v:shape w14:anchorId="26838024" id="Graphic 1" o:spid="_x0000_s1026" style="position:absolute;margin-left:0;margin-top:0;width:595.3pt;height:841.9pt;z-index:-16495104;visibility:visible;mso-wrap-style:square;mso-wrap-distance-left:0;mso-wrap-distance-top:0;mso-wrap-distance-right:0;mso-wrap-distance-bottom:0;mso-position-horizontal:absolute;mso-position-horizontal-relative:page;mso-position-vertical:absolute;mso-position-vertical-relative:page;v-text-anchor:top" coordsize="7560309,10692130" o:gfxdata="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" path="m7560005,l,,,10692003r7560005,l7560005,xe" fillcolor="#0c1a2a" stroked="f">
+              <v:shape w14:anchorId="6F5531DE" id="Graphic 1" o:spid="_x0000_s1026" style="position:absolute;margin-left:0;margin-top:0;width:595.3pt;height:841.9pt;z-index:-16495104;visibility:visible;mso-wrap-style:square;mso-wrap-distance-left:0;mso-wrap-distance-top:0;mso-wrap-distance-right:0;mso-wrap-distance-bottom:0;mso-position-horizontal:absolute;mso-position-horizontal-relative:page;mso-position-vertical:absolute;mso-position-vertical-relative:page;v-text-anchor:top" coordsize="7560309,10692130" o:gfxdata="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" path="m7560005,l,,,10692003r7560005,l7560005,xe" fillcolor="#0c1a2a" stroked="f">
                 <v:path arrowok="t"/>
                 <w10:wrap anchorx="page" anchory="page"/>
               </v:shape>
@@ -178,7 +178,7 @@
           </mc:Choice>
           <mc:Fallback>
             <w:pict>
-              <v:shape w14:anchorId="1A54ED83" id="Graphic 2" o:spid="_x0000_s1026" style="position:absolute;margin-left:0;margin-top:502.15pt;width:595.3pt;height:3pt;z-index:15729664;visibility:visible;mso-wrap-style:square;mso-wrap-distance-left:0;mso-wrap-distance-top:0;mso-wrap-distance-right:0;mso-wrap-distance-bottom:0;mso-position-horizontal:absolute;mso-position-horizontal-relative:page;mso-position-vertical:absolute;mso-position-vertical-relative:page;v-text-anchor:top" coordsize="7560309,38100" o:gfxdata="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" path="m7560005,l,,,38100r7560005,l7560005,xe" fillcolor="#2d85dd" stroked="f">
+              <v:shape w14:anchorId="4FA5638C" id="Graphic 2" o:spid="_x0000_s1026" style="position:absolute;margin-left:0;margin-top:502.15pt;width:595.3pt;height:3pt;z-index:15729664;visibility:visible;mso-wrap-style:square;mso-wrap-distance-left:0;mso-wrap-distance-top:0;mso-wrap-distance-right:0;mso-wrap-distance-bottom:0;mso-position-horizontal:absolute;mso-position-horizontal-relative:page;mso-position-vertical:absolute;mso-position-vertical-relative:page;v-text-anchor:top" coordsize="7560309,38100" o:gfxdata="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" path="m7560005,l,,,38100r7560005,l7560005,xe" fillcolor="#2d85dd" stroked="f">
                 <v:path arrowok="t"/>
                 <w10:wrap anchorx="page" anchory="page"/>
               </v:shape>
@@ -402,7 +402,7 @@
           </mc:Choice>
           <mc:Fallback>
             <w:pict>
-              <v:shape w14:anchorId="3463D324" id="Graphic 3" o:spid="_x0000_s1026" style="position:absolute;margin-left:168.4pt;margin-top:23.35pt;width:258.45pt;height:.1pt;z-index:-15728640;visibility:visible;mso-wrap-style:square;mso-wrap-distance-left:0;mso-wrap-distance-top:0;mso-wrap-distance-right:0;mso-wrap-distance-bottom:0;mso-position-horizontal:absolute;mso-position-horizontal-relative:page;mso-position-vertical:absolute;mso-position-vertical-relative:text;v-text-anchor:top" coordsize="3282315,1270" o:gfxdata="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" path="m,l3282175,e" filled="f" strokecolor="#2d85dd" strokeweight="2pt">
+              <v:shape w14:anchorId="6D83F6BC" id="Graphic 3" o:spid="_x0000_s1026" style="position:absolute;margin-left:168.4pt;margin-top:23.35pt;width:258.45pt;height:.1pt;z-index:-15728640;visibility:visible;mso-wrap-style:square;mso-wrap-distance-left:0;mso-wrap-distance-top:0;mso-wrap-distance-right:0;mso-wrap-distance-bottom:0;mso-position-horizontal:absolute;mso-position-horizontal-relative:page;mso-position-vertical:absolute;mso-position-vertical-relative:text;v-text-anchor:top" coordsize="3282315,1270" o:gfxdata="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" path="m,l3282175,e" filled="f" strokecolor="#2d85dd" strokeweight="2pt">
                 <v:path arrowok="t"/>
                 <w10:wrap type="topAndBottom" anchorx="page"/>
               </v:shape>
@@ -429,21 +429,7 @@
         <w:rPr>
           <w:color w:val="BCD4EF"/>
         </w:rPr>
-        <w:t xml:space="preserve">Think about </w:t>
-      </w:r>
-      <w:proofErr w:type="gramStart"/>
-      <w:r>
-        <w:rPr>
-          <w:color w:val="BCD4EF"/>
-        </w:rPr>
-        <w:t>the business</w:t>
-      </w:r>
-      <w:proofErr w:type="gramEnd"/>
-      <w:r>
-        <w:rPr>
-          <w:color w:val="BCD4EF"/>
-        </w:rPr>
-        <w:t xml:space="preserve">. Extract the models. Assign the </w:t>
+        <w:t xml:space="preserve">Think about the business. Extract the models. Assign the </w:t>
       </w:r>
       <w:r>
         <w:rPr>
@@ -1166,7 +1152,7 @@
           </mc:Choice>
           <mc:Fallback>
             <w:pict>
-              <v:group w14:anchorId="5525D280" id="Group 12" o:spid="_x0000_s1026" style="width:476.25pt;height:.3pt;mso-position-horizontal-relative:char;mso-position-vertical-relative:line" coordsize="60483,38" o:gfxdata="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">
+              <v:group w14:anchorId="1CDE7AD1" id="Group 12" o:spid="_x0000_s1026" style="width:476.25pt;height:.3pt;mso-position-horizontal-relative:char;mso-position-vertical-relative:line" coordsize="60483,38" o:gfxdata="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">
                 <v:shape id="Graphic 13" o:spid="_x0000_s1027" style="position:absolute;top:19;width:60483;height:12;visibility:visible;mso-wrap-style:square;v-text-anchor:top" coordsize="6048375,1270" o:gfxdata="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" path="m,l6047994,e" filled="f" strokecolor="#cdd4df" strokeweight=".3pt">
                   <v:path arrowok="t"/>
                 </v:shape>
@@ -1399,7 +1385,6 @@
         </w:rPr>
         <w:t xml:space="preserve"> </w:t>
       </w:r>
-      <w:proofErr w:type="gramStart"/>
       <w:r>
         <w:rPr>
           <w:color w:val="1A1A2D"/>
@@ -1407,7 +1392,6 @@
         </w:rPr>
         <w:t>types</w:t>
       </w:r>
-      <w:proofErr w:type="gramEnd"/>
       <w:r>
         <w:rPr>
           <w:color w:val="1A1A2D"/>
@@ -1461,7 +1445,6 @@
         </w:rPr>
         <w:t xml:space="preserve"> </w:t>
       </w:r>
-      <w:proofErr w:type="gramStart"/>
       <w:r>
         <w:rPr>
           <w:color w:val="1A1A2D"/>
@@ -1469,7 +1452,6 @@
         </w:rPr>
         <w:t>at</w:t>
       </w:r>
-      <w:proofErr w:type="gramEnd"/>
       <w:r>
         <w:rPr>
           <w:color w:val="1A1A2D"/>
@@ -1680,7 +1662,7 @@
           </mc:Choice>
           <mc:Fallback>
             <w:pict>
-              <v:group w14:anchorId="33B1C63D" id="Group 15" o:spid="_x0000_s1026" style="width:476.25pt;height:.3pt;mso-position-horizontal-relative:char;mso-position-vertical-relative:line" coordsize="60483,38" o:gfxdata="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">
+              <v:group w14:anchorId="4CB42E38" id="Group 15" o:spid="_x0000_s1026" style="width:476.25pt;height:.3pt;mso-position-horizontal-relative:char;mso-position-vertical-relative:line" coordsize="60483,38" o:gfxdata="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">
                 <v:shape id="Graphic 16" o:spid="_x0000_s1027" style="position:absolute;top:19;width:60483;height:12;visibility:visible;mso-wrap-style:square;v-text-anchor:top" coordsize="6048375,1270" o:gfxdata="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" path="m,l6047994,e" filled="f" strokecolor="#cdd4df" strokeweight=".3pt">
                   <v:path arrowok="t"/>
                 </v:shape>
@@ -2228,7 +2210,7 @@
           </mc:Choice>
           <mc:Fallback>
             <w:pict>
-              <v:group w14:anchorId="255FEAA0" id="Group 18" o:spid="_x0000_s1026" style="width:476.25pt;height:.3pt;mso-position-horizontal-relative:char;mso-position-vertical-relative:line" coordsize="60483,38" o:gfxdata="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">
+              <v:group w14:anchorId="3B3D7207" id="Group 18" o:spid="_x0000_s1026" style="width:476.25pt;height:.3pt;mso-position-horizontal-relative:char;mso-position-vertical-relative:line" coordsize="60483,38" o:gfxdata="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">
                 <v:shape id="Graphic 19" o:spid="_x0000_s1027" style="position:absolute;top:19;width:60483;height:12;visibility:visible;mso-wrap-style:square;v-text-anchor:top" coordsize="6048375,1270" o:gfxdata="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" path="m,l6047994,e" filled="f" strokecolor="#cdd4df" strokeweight=".3pt">
                   <v:path arrowok="t"/>
                 </v:shape>
@@ -2421,23 +2403,7 @@
           <w:color w:val="1A1A2D"/>
           <w:sz w:val="19"/>
         </w:rPr>
-        <w:t xml:space="preserve">Derived automatically from another object already in memory — no user prompt. Example: appointment date copied from a chosen </w:t>
-      </w:r>
-      <w:proofErr w:type="gramStart"/>
-      <w:r>
-        <w:rPr>
-          <w:color w:val="1A1A2D"/>
-          <w:sz w:val="19"/>
-        </w:rPr>
-        <w:t>slot,</w:t>
-      </w:r>
-      <w:proofErr w:type="gramEnd"/>
-      <w:r>
-        <w:rPr>
-          <w:color w:val="1A1A2D"/>
-          <w:sz w:val="19"/>
-        </w:rPr>
-        <w:t xml:space="preserve"> fee copied from a doctor.</w:t>
+        <w:t>Derived automatically from another object already in memory — no user prompt. Example: appointment date copied from a chosen slot, fee copied from a doctor.</w:t>
       </w:r>
     </w:p>
     <w:p>
@@ -2552,7 +2518,7 @@
           </mc:Choice>
           <mc:Fallback>
             <w:pict>
-              <v:group w14:anchorId="26607613" id="Group 21" o:spid="_x0000_s1026" style="width:476.25pt;height:.3pt;mso-position-horizontal-relative:char;mso-position-vertical-relative:line" coordsize="60483,38" o:gfxdata="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">
+              <v:group w14:anchorId="108FC47A" id="Group 21" o:spid="_x0000_s1026" style="width:476.25pt;height:.3pt;mso-position-horizontal-relative:char;mso-position-vertical-relative:line" coordsize="60483,38" o:gfxdata="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">
                 <v:shape id="Graphic 22" o:spid="_x0000_s1027" style="position:absolute;top:19;width:60483;height:12;visibility:visible;mso-wrap-style:square;v-text-anchor:top" coordsize="6048375,1270" o:gfxdata="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" path="m,l6047994,e" filled="f" strokecolor="#cdd4df" strokeweight=".3pt">
                   <v:path arrowok="t"/>
                 </v:shape>
@@ -2769,39 +2735,7 @@
           <w:color w:val="1A1A2D"/>
           <w:sz w:val="19"/>
         </w:rPr>
-        <w:t xml:space="preserve">The user selects </w:t>
-      </w:r>
-      <w:proofErr w:type="gramStart"/>
-      <w:r>
-        <w:rPr>
-          <w:color w:val="1A1A2D"/>
-          <w:sz w:val="19"/>
-        </w:rPr>
-        <w:t>a value</w:t>
-      </w:r>
-      <w:proofErr w:type="gramEnd"/>
-      <w:r>
-        <w:rPr>
-          <w:color w:val="1A1A2D"/>
-          <w:sz w:val="19"/>
-        </w:rPr>
-        <w:t xml:space="preserve"> from a list of options displayed on screen. Example: choosing a </w:t>
-      </w:r>
-      <w:proofErr w:type="gramStart"/>
-      <w:r>
-        <w:rPr>
-          <w:color w:val="1A1A2D"/>
-          <w:sz w:val="19"/>
-        </w:rPr>
-        <w:t>doctor</w:t>
-      </w:r>
-      <w:proofErr w:type="gramEnd"/>
-      <w:r>
-        <w:rPr>
-          <w:color w:val="1A1A2D"/>
-          <w:sz w:val="19"/>
-        </w:rPr>
-        <w:t xml:space="preserve"> ID from a printed list of doctors.</w:t>
+        <w:t>The user selects a value from a list of options displayed on screen. Example: choosing a doctor ID from a printed list of doctors.</w:t>
       </w:r>
     </w:p>
     <w:p>
@@ -2915,7 +2849,7 @@
           </mc:Choice>
           <mc:Fallback>
             <w:pict>
-              <v:group w14:anchorId="6CF2B59C" id="Group 24" o:spid="_x0000_s1026" style="width:476.25pt;height:.3pt;mso-position-horizontal-relative:char;mso-position-vertical-relative:line" coordsize="60483,38" o:gfxdata="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">
+              <v:group w14:anchorId="0559EA04" id="Group 24" o:spid="_x0000_s1026" style="width:476.25pt;height:.3pt;mso-position-horizontal-relative:char;mso-position-vertical-relative:line" coordsize="60483,38" o:gfxdata="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">
                 <v:shape id="Graphic 25" o:spid="_x0000_s1027" style="position:absolute;top:19;width:60483;height:12;visibility:visible;mso-wrap-style:square;v-text-anchor:top" coordsize="6048375,1270" o:gfxdata="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" path="m,l6047994,e" filled="f" strokecolor="#cdd4df" strokeweight=".3pt">
                   <v:path arrowok="t"/>
                 </v:shape>
@@ -3518,23 +3452,7 @@
                                 <w:color w:val="0C1A2A"/>
                                 <w:sz w:val="21"/>
                               </w:rPr>
-                              <w:t xml:space="preserve">A public library allows community members to register and borrow books. Each book has a title, author, genre, and a fixed number of physical copies in stock. A registered member can borrow an available book copy and must return it within 14 days. If the book is returned late, the system calculates a fine based on how many days </w:t>
-                            </w:r>
-                            <w:proofErr w:type="gramStart"/>
-                            <w:r>
-                              <w:rPr>
-                                <w:color w:val="0C1A2A"/>
-                                <w:sz w:val="21"/>
-                              </w:rPr>
-                              <w:t>overdue</w:t>
-                            </w:r>
-                            <w:proofErr w:type="gramEnd"/>
-                            <w:r>
-                              <w:rPr>
-                                <w:color w:val="0C1A2A"/>
-                                <w:sz w:val="21"/>
-                              </w:rPr>
-                              <w:t xml:space="preserve"> it is. A member can also reserve a book that is currently fully borrowed so they are notified when it becomes available. The librarian needs to see</w:t>
+                              <w:t>A public library allows community members to register and borrow books. Each book has a title, author, genre, and a fixed number of physical copies in stock. A registered member can borrow an available book copy and must return it within 14 days. If the book is returned late, the system calculates a fine based on how many days overdue it is. A member can also reserve a book that is currently fully borrowed so they are notified when it becomes available. The librarian needs to see</w:t>
                             </w:r>
                             <w:r>
                               <w:rPr>
@@ -3849,23 +3767,7 @@
                           <w:color w:val="0C1A2A"/>
                           <w:sz w:val="21"/>
                         </w:rPr>
-                        <w:t xml:space="preserve">A public library allows community members to register and borrow books. Each book has a title, author, genre, and a fixed number of physical copies in stock. A registered member can borrow an available book copy and must return it within 14 days. If the book is returned late, the system calculates a fine based on how many days </w:t>
-                      </w:r>
-                      <w:proofErr w:type="gramStart"/>
-                      <w:r>
-                        <w:rPr>
-                          <w:color w:val="0C1A2A"/>
-                          <w:sz w:val="21"/>
-                        </w:rPr>
-                        <w:t>overdue</w:t>
-                      </w:r>
-                      <w:proofErr w:type="gramEnd"/>
-                      <w:r>
-                        <w:rPr>
-                          <w:color w:val="0C1A2A"/>
-                          <w:sz w:val="21"/>
-                        </w:rPr>
-                        <w:t xml:space="preserve"> it is. A member can also reserve a book that is currently fully borrowed so they are notified when it becomes available. The librarian needs to see</w:t>
+                        <w:t>A public library allows community members to register and borrow books. Each book has a title, author, genre, and a fixed number of physical copies in stock. A registered member can borrow an available book copy and must return it within 14 days. If the book is returned late, the system calculates a fine based on how many days overdue it is. A member can also reserve a book that is currently fully borrowed so they are notified when it becomes available. The librarian needs to see</w:t>
                       </w:r>
                       <w:r>
                         <w:rPr>
@@ -4183,21 +4085,7 @@
         <w:rPr>
           <w:color w:val="1A1A2D"/>
         </w:rPr>
-        <w:t xml:space="preserve">From the description above, identify the main real-world objects (classes) the system must track. Write each </w:t>
-      </w:r>
-      <w:proofErr w:type="gramStart"/>
-      <w:r>
-        <w:rPr>
-          <w:color w:val="1A1A2D"/>
-        </w:rPr>
-        <w:t>entity</w:t>
-      </w:r>
-      <w:proofErr w:type="gramEnd"/>
-      <w:r>
-        <w:rPr>
-          <w:color w:val="1A1A2D"/>
-        </w:rPr>
-        <w:t xml:space="preserve"> name, its properties, the data type for each, and the source tag that describes how each property gets its value.</w:t>
+        <w:t>From the description above, identify the main real-world objects (classes) the system must track. Write each entity name, its properties, the data type for each, and the source tag that describes how each property gets its value.</w:t>
       </w:r>
     </w:p>
     <w:p>
@@ -4546,7 +4434,7 @@
                 </mc:Choice>
                 <mc:Fallback>
                   <w:pict>
-                    <v:group w14:anchorId="281A2E29" id="Group 31" o:spid="_x0000_s1026" style="width:140.15pt;height:.6pt;mso-position-horizontal-relative:char;mso-position-vertical-relative:line" coordsize="17799,76" o:gfxdata="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">
+                    <v:group w14:anchorId="3934DD5D" id="Group 31" o:spid="_x0000_s1026" style="width:140.15pt;height:.6pt;mso-position-horizontal-relative:char;mso-position-vertical-relative:line" coordsize="17799,76" o:gfxdata="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">
                       <v:shape id="Graphic 32" o:spid="_x0000_s1027" style="position:absolute;top:36;width:17799;height:12;visibility:visible;mso-wrap-style:square;v-text-anchor:top" coordsize="1779905,1270" o:gfxdata="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" path="m,l1779910,e" filled="f" strokecolor="#ccd3de" strokeweight=".20156mm">
                         <v:path arrowok="t"/>
                       </v:shape>
@@ -4674,7 +4562,7 @@
                 </mc:Choice>
                 <mc:Fallback>
                   <w:pict>
-                    <v:group w14:anchorId="4E3E9614" id="Group 33" o:spid="_x0000_s1026" style="width:60.1pt;height:.6pt;mso-position-horizontal-relative:char;mso-position-vertical-relative:line" coordsize="7632,76" o:gfxdata="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">
+                    <v:group w14:anchorId="245A35C0" id="Group 33" o:spid="_x0000_s1026" style="width:60.1pt;height:.6pt;mso-position-horizontal-relative:char;mso-position-vertical-relative:line" coordsize="7632,76" o:gfxdata="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">
                       <v:shape id="Graphic 34" o:spid="_x0000_s1027" style="position:absolute;top:36;width:7632;height:12;visibility:visible;mso-wrap-style:square;v-text-anchor:top" coordsize="763270,1270" o:gfxdata="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" path="m,l762818,e" filled="f" strokecolor="#ccd3de" strokeweight=".20156mm">
                         <v:path arrowok="t"/>
                       </v:shape>
@@ -4802,7 +4690,7 @@
                 </mc:Choice>
                 <mc:Fallback>
                   <w:pict>
-                    <v:group w14:anchorId="1F14FE9F" id="Group 35" o:spid="_x0000_s1026" style="width:100.15pt;height:.6pt;mso-position-horizontal-relative:char;mso-position-vertical-relative:line" coordsize="12719,76" o:gfxdata="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">
+                    <v:group w14:anchorId="1054CF62" id="Group 35" o:spid="_x0000_s1026" style="width:100.15pt;height:.6pt;mso-position-horizontal-relative:char;mso-position-vertical-relative:line" coordsize="12719,76" o:gfxdata="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">
                       <v:shape id="Graphic 36" o:spid="_x0000_s1027" style="position:absolute;top:36;width:12719;height:12;visibility:visible;mso-wrap-style:square;v-text-anchor:top" coordsize="1271905,1270" o:gfxdata="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" path="m,l1271364,e" filled="f" strokecolor="#ccd3de" strokeweight=".20156mm">
                         <v:path arrowok="t"/>
                       </v:shape>
@@ -4936,7 +4824,7 @@
                 </mc:Choice>
                 <mc:Fallback>
                   <w:pict>
-                    <v:group w14:anchorId="562326ED" id="Group 37" o:spid="_x0000_s1026" style="width:140.15pt;height:.6pt;mso-position-horizontal-relative:char;mso-position-vertical-relative:line" coordsize="17799,76" o:gfxdata="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">
+                    <v:group w14:anchorId="1F063D51" id="Group 37" o:spid="_x0000_s1026" style="width:140.15pt;height:.6pt;mso-position-horizontal-relative:char;mso-position-vertical-relative:line" coordsize="17799,76" o:gfxdata="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">
                       <v:shape id="Graphic 38" o:spid="_x0000_s1027" style="position:absolute;top:36;width:17799;height:12;visibility:visible;mso-wrap-style:square;v-text-anchor:top" coordsize="1779905,1270" o:gfxdata="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" path="m,l1779910,e" filled="f" strokecolor="#ccd3de" strokeweight=".20156mm">
                         <v:path arrowok="t"/>
                       </v:shape>
@@ -5065,7 +4953,7 @@
                 </mc:Choice>
                 <mc:Fallback>
                   <w:pict>
-                    <v:group w14:anchorId="18843A2B" id="Group 39" o:spid="_x0000_s1026" style="width:60.1pt;height:.6pt;mso-position-horizontal-relative:char;mso-position-vertical-relative:line" coordsize="7632,76" o:gfxdata="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">
+                    <v:group w14:anchorId="3A93AF6C" id="Group 39" o:spid="_x0000_s1026" style="width:60.1pt;height:.6pt;mso-position-horizontal-relative:char;mso-position-vertical-relative:line" coordsize="7632,76" o:gfxdata="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">
                       <v:shape id="Graphic 40" o:spid="_x0000_s1027" style="position:absolute;top:36;width:7632;height:12;visibility:visible;mso-wrap-style:square;v-text-anchor:top" coordsize="763270,1270" o:gfxdata="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" path="m,l762818,e" filled="f" strokecolor="#ccd3de" strokeweight=".20156mm">
                         <v:path arrowok="t"/>
                       </v:shape>
@@ -5194,7 +5082,7 @@
                 </mc:Choice>
                 <mc:Fallback>
                   <w:pict>
-                    <v:group w14:anchorId="78DA6A82" id="Group 41" o:spid="_x0000_s1026" style="width:100.15pt;height:.6pt;mso-position-horizontal-relative:char;mso-position-vertical-relative:line" coordsize="12719,76" o:gfxdata="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">
+                    <v:group w14:anchorId="1467E081" id="Group 41" o:spid="_x0000_s1026" style="width:100.15pt;height:.6pt;mso-position-horizontal-relative:char;mso-position-vertical-relative:line" coordsize="12719,76" o:gfxdata="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">
                       <v:shape id="Graphic 42" o:spid="_x0000_s1027" style="position:absolute;top:36;width:12719;height:12;visibility:visible;mso-wrap-style:square;v-text-anchor:top" coordsize="1271905,1270" o:gfxdata="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" path="m,l1271364,e" filled="f" strokecolor="#ccd3de" strokeweight=".20156mm">
                         <v:path arrowok="t"/>
                       </v:shape>
@@ -5327,7 +5215,7 @@
                 </mc:Choice>
                 <mc:Fallback>
                   <w:pict>
-                    <v:group w14:anchorId="55FBC394" id="Group 43" o:spid="_x0000_s1026" style="width:140.15pt;height:.6pt;mso-position-horizontal-relative:char;mso-position-vertical-relative:line" coordsize="17799,76" o:gfxdata="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">
+                    <v:group w14:anchorId="260F1B0D" id="Group 43" o:spid="_x0000_s1026" style="width:140.15pt;height:.6pt;mso-position-horizontal-relative:char;mso-position-vertical-relative:line" coordsize="17799,76" o:gfxdata="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">
                       <v:shape id="Graphic 44" o:spid="_x0000_s1027" style="position:absolute;top:36;width:17799;height:12;visibility:visible;mso-wrap-style:square;v-text-anchor:top" coordsize="1779905,1270" o:gfxdata="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" path="m,l1779910,e" filled="f" strokecolor="#ccd3de" strokeweight=".20156mm">
                         <v:path arrowok="t"/>
                       </v:shape>
@@ -5455,7 +5343,7 @@
                 </mc:Choice>
                 <mc:Fallback>
                   <w:pict>
-                    <v:group w14:anchorId="374EDCA3" id="Group 45" o:spid="_x0000_s1026" style="width:60.1pt;height:.6pt;mso-position-horizontal-relative:char;mso-position-vertical-relative:line" coordsize="7632,76" o:gfxdata="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">
+                    <v:group w14:anchorId="075041C9" id="Group 45" o:spid="_x0000_s1026" style="width:60.1pt;height:.6pt;mso-position-horizontal-relative:char;mso-position-vertical-relative:line" coordsize="7632,76" o:gfxdata="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">
                       <v:shape id="Graphic 46" o:spid="_x0000_s1027" style="position:absolute;top:36;width:7632;height:12;visibility:visible;mso-wrap-style:square;v-text-anchor:top" coordsize="763270,1270" o:gfxdata="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" path="m,l762818,e" filled="f" strokecolor="#ccd3de" strokeweight=".20156mm">
                         <v:path arrowok="t"/>
                       </v:shape>
@@ -5583,7 +5471,7 @@
                 </mc:Choice>
                 <mc:Fallback>
                   <w:pict>
-                    <v:group w14:anchorId="07924036" id="Group 47" o:spid="_x0000_s1026" style="width:100.15pt;height:.6pt;mso-position-horizontal-relative:char;mso-position-vertical-relative:line" coordsize="12719,76" o:gfxdata="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">
+                    <v:group w14:anchorId="21B0EE32" id="Group 47" o:spid="_x0000_s1026" style="width:100.15pt;height:.6pt;mso-position-horizontal-relative:char;mso-position-vertical-relative:line" coordsize="12719,76" o:gfxdata="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">
                       <v:shape id="Graphic 48" o:spid="_x0000_s1027" style="position:absolute;top:36;width:12719;height:12;visibility:visible;mso-wrap-style:square;v-text-anchor:top" coordsize="1271905,1270" o:gfxdata="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" path="m,l1271364,e" filled="f" strokecolor="#ccd3de" strokeweight=".20156mm">
                         <v:path arrowok="t"/>
                       </v:shape>
@@ -5717,7 +5605,7 @@
                 </mc:Choice>
                 <mc:Fallback>
                   <w:pict>
-                    <v:group w14:anchorId="2067835C" id="Group 49" o:spid="_x0000_s1026" style="width:140.15pt;height:.6pt;mso-position-horizontal-relative:char;mso-position-vertical-relative:line" coordsize="17799,76" o:gfxdata="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">
+                    <v:group w14:anchorId="3E43C913" id="Group 49" o:spid="_x0000_s1026" style="width:140.15pt;height:.6pt;mso-position-horizontal-relative:char;mso-position-vertical-relative:line" coordsize="17799,76" o:gfxdata="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">
                       <v:shape id="Graphic 50" o:spid="_x0000_s1027" style="position:absolute;top:36;width:17799;height:12;visibility:visible;mso-wrap-style:square;v-text-anchor:top" coordsize="1779905,1270" o:gfxdata="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" path="m,l1779910,e" filled="f" strokecolor="#ccd3de" strokeweight=".20156mm">
                         <v:path arrowok="t"/>
                       </v:shape>
@@ -5846,7 +5734,7 @@
                 </mc:Choice>
                 <mc:Fallback>
                   <w:pict>
-                    <v:group w14:anchorId="67F5359B" id="Group 51" o:spid="_x0000_s1026" style="width:60.1pt;height:.6pt;mso-position-horizontal-relative:char;mso-position-vertical-relative:line" coordsize="7632,76" o:gfxdata="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">
+                    <v:group w14:anchorId="4A94B3B5" id="Group 51" o:spid="_x0000_s1026" style="width:60.1pt;height:.6pt;mso-position-horizontal-relative:char;mso-position-vertical-relative:line" coordsize="7632,76" o:gfxdata="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">
                       <v:shape id="Graphic 52" o:spid="_x0000_s1027" style="position:absolute;top:36;width:7632;height:12;visibility:visible;mso-wrap-style:square;v-text-anchor:top" coordsize="763270,1270" o:gfxdata="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" path="m,l762818,e" filled="f" strokecolor="#ccd3de" strokeweight=".20156mm">
                         <v:path arrowok="t"/>
                       </v:shape>
@@ -5975,7 +5863,7 @@
                 </mc:Choice>
                 <mc:Fallback>
                   <w:pict>
-                    <v:group w14:anchorId="69BC165B" id="Group 53" o:spid="_x0000_s1026" style="width:100.15pt;height:.6pt;mso-position-horizontal-relative:char;mso-position-vertical-relative:line" coordsize="12719,76" o:gfxdata="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">
+                    <v:group w14:anchorId="1D11D111" id="Group 53" o:spid="_x0000_s1026" style="width:100.15pt;height:.6pt;mso-position-horizontal-relative:char;mso-position-vertical-relative:line" coordsize="12719,76" o:gfxdata="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">
                       <v:shape id="Graphic 54" o:spid="_x0000_s1027" style="position:absolute;top:36;width:12719;height:12;visibility:visible;mso-wrap-style:square;v-text-anchor:top" coordsize="1271905,1270" o:gfxdata="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" path="m,l1271364,e" filled="f" strokecolor="#ccd3de" strokeweight=".20156mm">
                         <v:path arrowok="t"/>
                       </v:shape>
@@ -6110,7 +5998,7 @@
                 </mc:Choice>
                 <mc:Fallback>
                   <w:pict>
-                    <v:group w14:anchorId="0AE86DC1" id="Group 55" o:spid="_x0000_s1026" style="width:140.15pt;height:.6pt;mso-position-horizontal-relative:char;mso-position-vertical-relative:line" coordsize="17799,76" o:gfxdata="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">
+                    <v:group w14:anchorId="7627A033" id="Group 55" o:spid="_x0000_s1026" style="width:140.15pt;height:.6pt;mso-position-horizontal-relative:char;mso-position-vertical-relative:line" coordsize="17799,76" o:gfxdata="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">
                       <v:shape id="Graphic 56" o:spid="_x0000_s1027" style="position:absolute;top:36;width:17799;height:12;visibility:visible;mso-wrap-style:square;v-text-anchor:top" coordsize="1779905,1270" o:gfxdata="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" path="m,l1779910,e" filled="f" strokecolor="#ccd3de" strokeweight=".20156mm">
                         <v:path arrowok="t"/>
                       </v:shape>
@@ -6238,7 +6126,7 @@
                 </mc:Choice>
                 <mc:Fallback>
                   <w:pict>
-                    <v:group w14:anchorId="7B852F8A" id="Group 57" o:spid="_x0000_s1026" style="width:60.1pt;height:.6pt;mso-position-horizontal-relative:char;mso-position-vertical-relative:line" coordsize="7632,76" o:gfxdata="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">
+                    <v:group w14:anchorId="4F381DE4" id="Group 57" o:spid="_x0000_s1026" style="width:60.1pt;height:.6pt;mso-position-horizontal-relative:char;mso-position-vertical-relative:line" coordsize="7632,76" o:gfxdata="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">
                       <v:shape id="Graphic 58" o:spid="_x0000_s1027" style="position:absolute;top:36;width:7632;height:12;visibility:visible;mso-wrap-style:square;v-text-anchor:top" coordsize="763270,1270" o:gfxdata="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" path="m,l762818,e" filled="f" strokecolor="#ccd3de" strokeweight=".20156mm">
                         <v:path arrowok="t"/>
                       </v:shape>
@@ -6366,7 +6254,7 @@
                 </mc:Choice>
                 <mc:Fallback>
                   <w:pict>
-                    <v:group w14:anchorId="21BFABDF" id="Group 59" o:spid="_x0000_s1026" style="width:100.15pt;height:.6pt;mso-position-horizontal-relative:char;mso-position-vertical-relative:line" coordsize="12719,76" o:gfxdata="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">
+                    <v:group w14:anchorId="49D1AEB7" id="Group 59" o:spid="_x0000_s1026" style="width:100.15pt;height:.6pt;mso-position-horizontal-relative:char;mso-position-vertical-relative:line" coordsize="12719,76" o:gfxdata="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">
                       <v:shape id="Graphic 60" o:spid="_x0000_s1027" style="position:absolute;top:36;width:12719;height:12;visibility:visible;mso-wrap-style:square;v-text-anchor:top" coordsize="1271905,1270" o:gfxdata="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" path="m,l1271364,e" filled="f" strokecolor="#ccd3de" strokeweight=".20156mm">
                         <v:path arrowok="t"/>
                       </v:shape>
@@ -6493,7 +6381,7 @@
                 </mc:Choice>
                 <mc:Fallback>
                   <w:pict>
-                    <v:group w14:anchorId="1830CDA2" id="Group 61" o:spid="_x0000_s1026" style="width:140.15pt;height:.6pt;mso-position-horizontal-relative:char;mso-position-vertical-relative:line" coordsize="17799,76" o:gfxdata="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">
+                    <v:group w14:anchorId="6879BA29" id="Group 61" o:spid="_x0000_s1026" style="width:140.15pt;height:.6pt;mso-position-horizontal-relative:char;mso-position-vertical-relative:line" coordsize="17799,76" o:gfxdata="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">
                       <v:shape id="Graphic 62" o:spid="_x0000_s1027" style="position:absolute;top:36;width:17799;height:12;visibility:visible;mso-wrap-style:square;v-text-anchor:top" coordsize="1779905,1270" o:gfxdata="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" path="m,l1779910,e" filled="f" strokecolor="#ccd3de" strokeweight=".20156mm">
                         <v:path arrowok="t"/>
                       </v:shape>
@@ -6615,7 +6503,7 @@
                 </mc:Choice>
                 <mc:Fallback>
                   <w:pict>
-                    <v:group w14:anchorId="5D3F909E" id="Group 63" o:spid="_x0000_s1026" style="width:60.1pt;height:.6pt;mso-position-horizontal-relative:char;mso-position-vertical-relative:line" coordsize="7632,76" o:gfxdata="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">
+                    <v:group w14:anchorId="3621CA90" id="Group 63" o:spid="_x0000_s1026" style="width:60.1pt;height:.6pt;mso-position-horizontal-relative:char;mso-position-vertical-relative:line" coordsize="7632,76" o:gfxdata="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">
                       <v:shape id="Graphic 64" o:spid="_x0000_s1027" style="position:absolute;top:36;width:7632;height:12;visibility:visible;mso-wrap-style:square;v-text-anchor:top" coordsize="763270,1270" o:gfxdata="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" path="m,l762818,e" filled="f" strokecolor="#ccd3de" strokeweight=".20156mm">
                         <v:path arrowok="t"/>
                       </v:shape>
@@ -6737,7 +6625,7 @@
                 </mc:Choice>
                 <mc:Fallback>
                   <w:pict>
-                    <v:group w14:anchorId="37B8D0FA" id="Group 65" o:spid="_x0000_s1026" style="width:100.15pt;height:.6pt;mso-position-horizontal-relative:char;mso-position-vertical-relative:line" coordsize="12719,76" o:gfxdata="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">
+                    <v:group w14:anchorId="33949A1E" id="Group 65" o:spid="_x0000_s1026" style="width:100.15pt;height:.6pt;mso-position-horizontal-relative:char;mso-position-vertical-relative:line" coordsize="12719,76" o:gfxdata="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">
                       <v:shape id="Graphic 66" o:spid="_x0000_s1027" style="position:absolute;top:36;width:12719;height:12;visibility:visible;mso-wrap-style:square;v-text-anchor:top" coordsize="1271905,1270" o:gfxdata="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" path="m,l1271364,e" filled="f" strokecolor="#ccd3de" strokeweight=".20156mm">
                         <v:path arrowok="t"/>
                       </v:shape>
@@ -6863,7 +6751,7 @@
                 </mc:Choice>
                 <mc:Fallback>
                   <w:pict>
-                    <v:group w14:anchorId="522928B9" id="Group 67" o:spid="_x0000_s1026" style="width:140.15pt;height:.6pt;mso-position-horizontal-relative:char;mso-position-vertical-relative:line" coordsize="17799,76" o:gfxdata="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">
+                    <v:group w14:anchorId="19B3161B" id="Group 67" o:spid="_x0000_s1026" style="width:140.15pt;height:.6pt;mso-position-horizontal-relative:char;mso-position-vertical-relative:line" coordsize="17799,76" o:gfxdata="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">
                       <v:shape id="Graphic 68" o:spid="_x0000_s1027" style="position:absolute;top:36;width:17799;height:12;visibility:visible;mso-wrap-style:square;v-text-anchor:top" coordsize="1779905,1270" o:gfxdata="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" path="m,l1779910,e" filled="f" strokecolor="#ccd3de" strokeweight=".20156mm">
                         <v:path arrowok="t"/>
                       </v:shape>
@@ -6984,7 +6872,7 @@
                 </mc:Choice>
                 <mc:Fallback>
                   <w:pict>
-                    <v:group w14:anchorId="5487F811" id="Group 69" o:spid="_x0000_s1026" style="width:60.1pt;height:.6pt;mso-position-horizontal-relative:char;mso-position-vertical-relative:line" coordsize="7632,76" o:gfxdata="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">
+                    <v:group w14:anchorId="28FAA06B" id="Group 69" o:spid="_x0000_s1026" style="width:60.1pt;height:.6pt;mso-position-horizontal-relative:char;mso-position-vertical-relative:line" coordsize="7632,76" o:gfxdata="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">
                       <v:shape id="Graphic 70" o:spid="_x0000_s1027" style="position:absolute;top:36;width:7632;height:12;visibility:visible;mso-wrap-style:square;v-text-anchor:top" coordsize="763270,1270" o:gfxdata="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" path="m,l762818,e" filled="f" strokecolor="#ccd3de" strokeweight=".20156mm">
                         <v:path arrowok="t"/>
                       </v:shape>
@@ -7105,7 +6993,7 @@
                 </mc:Choice>
                 <mc:Fallback>
                   <w:pict>
-                    <v:group w14:anchorId="4FF88CD9" id="Group 71" o:spid="_x0000_s1026" style="width:100.15pt;height:.6pt;mso-position-horizontal-relative:char;mso-position-vertical-relative:line" coordsize="12719,76" o:gfxdata="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">
+                    <v:group w14:anchorId="36754418" id="Group 71" o:spid="_x0000_s1026" style="width:100.15pt;height:.6pt;mso-position-horizontal-relative:char;mso-position-vertical-relative:line" coordsize="12719,76" o:gfxdata="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">
                       <v:shape id="Graphic 72" o:spid="_x0000_s1027" style="position:absolute;top:36;width:12719;height:12;visibility:visible;mso-wrap-style:square;v-text-anchor:top" coordsize="1271905,1270" o:gfxdata="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" path="m,l1271364,e" filled="f" strokecolor="#ccd3de" strokeweight=".20156mm">
                         <v:path arrowok="t"/>
                       </v:shape>
@@ -7450,7 +7338,7 @@
                 </mc:Choice>
                 <mc:Fallback>
                   <w:pict>
-                    <v:group w14:anchorId="7910DBBE" id="Group 73" o:spid="_x0000_s1026" style="width:140.15pt;height:.6pt;mso-position-horizontal-relative:char;mso-position-vertical-relative:line" coordsize="17799,76" o:gfxdata="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">
+                    <v:group w14:anchorId="73A7F317" id="Group 73" o:spid="_x0000_s1026" style="width:140.15pt;height:.6pt;mso-position-horizontal-relative:char;mso-position-vertical-relative:line" coordsize="17799,76" o:gfxdata="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">
                       <v:shape id="Graphic 74" o:spid="_x0000_s1027" style="position:absolute;top:36;width:17799;height:12;visibility:visible;mso-wrap-style:square;v-text-anchor:top" coordsize="1779905,1270" o:gfxdata="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" path="m,l1779910,e" filled="f" strokecolor="#ccd3de" strokeweight=".20156mm">
                         <v:path arrowok="t"/>
                       </v:shape>
@@ -7578,7 +7466,7 @@
                 </mc:Choice>
                 <mc:Fallback>
                   <w:pict>
-                    <v:group w14:anchorId="064536E4" id="Group 75" o:spid="_x0000_s1026" style="width:60.1pt;height:.6pt;mso-position-horizontal-relative:char;mso-position-vertical-relative:line" coordsize="7632,76" o:gfxdata="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">
+                    <v:group w14:anchorId="5644DE19" id="Group 75" o:spid="_x0000_s1026" style="width:60.1pt;height:.6pt;mso-position-horizontal-relative:char;mso-position-vertical-relative:line" coordsize="7632,76" o:gfxdata="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">
                       <v:shape id="Graphic 76" o:spid="_x0000_s1027" style="position:absolute;top:36;width:7632;height:12;visibility:visible;mso-wrap-style:square;v-text-anchor:top" coordsize="763270,1270" o:gfxdata="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" path="m,l762818,e" filled="f" strokecolor="#ccd3de" strokeweight=".20156mm">
                         <v:path arrowok="t"/>
                       </v:shape>
@@ -7706,7 +7594,7 @@
                 </mc:Choice>
                 <mc:Fallback>
                   <w:pict>
-                    <v:group w14:anchorId="48F8DCB5" id="Group 77" o:spid="_x0000_s1026" style="width:100.15pt;height:.6pt;mso-position-horizontal-relative:char;mso-position-vertical-relative:line" coordsize="12719,76" o:gfxdata="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">
+                    <v:group w14:anchorId="205FEF3C" id="Group 77" o:spid="_x0000_s1026" style="width:100.15pt;height:.6pt;mso-position-horizontal-relative:char;mso-position-vertical-relative:line" coordsize="12719,76" o:gfxdata="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">
                       <v:shape id="Graphic 78" o:spid="_x0000_s1027" style="position:absolute;top:36;width:12719;height:12;visibility:visible;mso-wrap-style:square;v-text-anchor:top" coordsize="1271905,1270" o:gfxdata="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" path="m,l1271364,e" filled="f" strokecolor="#ccd3de" strokeweight=".20156mm">
                         <v:path arrowok="t"/>
                       </v:shape>
@@ -7842,7 +7730,7 @@
                 </mc:Choice>
                 <mc:Fallback>
                   <w:pict>
-                    <v:group w14:anchorId="35897AEC" id="Group 79" o:spid="_x0000_s1026" style="width:140.15pt;height:.6pt;mso-position-horizontal-relative:char;mso-position-vertical-relative:line" coordsize="17799,76" o:gfxdata="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">
+                    <v:group w14:anchorId="2BDAA841" id="Group 79" o:spid="_x0000_s1026" style="width:140.15pt;height:.6pt;mso-position-horizontal-relative:char;mso-position-vertical-relative:line" coordsize="17799,76" o:gfxdata="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">
                       <v:shape id="Graphic 80" o:spid="_x0000_s1027" style="position:absolute;top:36;width:17799;height:12;visibility:visible;mso-wrap-style:square;v-text-anchor:top" coordsize="1779905,1270" o:gfxdata="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" path="m,l1779910,e" filled="f" strokecolor="#ccd3de" strokeweight=".20156mm">
                         <v:path arrowok="t"/>
                       </v:shape>
@@ -7971,7 +7859,7 @@
                 </mc:Choice>
                 <mc:Fallback>
                   <w:pict>
-                    <v:group w14:anchorId="1ABCC1F1" id="Group 81" o:spid="_x0000_s1026" style="width:60.1pt;height:.6pt;mso-position-horizontal-relative:char;mso-position-vertical-relative:line" coordsize="7632,76" o:gfxdata="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">
+                    <v:group w14:anchorId="1091D3A4" id="Group 81" o:spid="_x0000_s1026" style="width:60.1pt;height:.6pt;mso-position-horizontal-relative:char;mso-position-vertical-relative:line" coordsize="7632,76" o:gfxdata="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">
                       <v:shape id="Graphic 82" o:spid="_x0000_s1027" style="position:absolute;top:36;width:7632;height:12;visibility:visible;mso-wrap-style:square;v-text-anchor:top" coordsize="763270,1270" o:gfxdata="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" path="m,l762818,e" filled="f" strokecolor="#ccd3de" strokeweight=".20156mm">
                         <v:path arrowok="t"/>
                       </v:shape>
@@ -8100,7 +7988,7 @@
                 </mc:Choice>
                 <mc:Fallback>
                   <w:pict>
-                    <v:group w14:anchorId="72B88BF6" id="Group 83" o:spid="_x0000_s1026" style="width:100.15pt;height:.6pt;mso-position-horizontal-relative:char;mso-position-vertical-relative:line" coordsize="12719,76" o:gfxdata="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">
+                    <v:group w14:anchorId="19E1BD72" id="Group 83" o:spid="_x0000_s1026" style="width:100.15pt;height:.6pt;mso-position-horizontal-relative:char;mso-position-vertical-relative:line" coordsize="12719,76" o:gfxdata="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">
                       <v:shape id="Graphic 84" o:spid="_x0000_s1027" style="position:absolute;top:36;width:12719;height:12;visibility:visible;mso-wrap-style:square;v-text-anchor:top" coordsize="1271905,1270" o:gfxdata="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" path="m,l1271364,e" filled="f" strokecolor="#ccd3de" strokeweight=".20156mm">
                         <v:path arrowok="t"/>
                       </v:shape>
@@ -8235,7 +8123,7 @@
                 </mc:Choice>
                 <mc:Fallback>
                   <w:pict>
-                    <v:group w14:anchorId="281B329E" id="Group 85" o:spid="_x0000_s1026" style="width:140.15pt;height:.6pt;mso-position-horizontal-relative:char;mso-position-vertical-relative:line" coordsize="17799,76" o:gfxdata="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">
+                    <v:group w14:anchorId="509E8E54" id="Group 85" o:spid="_x0000_s1026" style="width:140.15pt;height:.6pt;mso-position-horizontal-relative:char;mso-position-vertical-relative:line" coordsize="17799,76" o:gfxdata="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">
                       <v:shape id="Graphic 86" o:spid="_x0000_s1027" style="position:absolute;top:36;width:17799;height:12;visibility:visible;mso-wrap-style:square;v-text-anchor:top" coordsize="1779905,1270" o:gfxdata="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" path="m,l1779910,e" filled="f" strokecolor="#ccd3de" strokeweight=".20156mm">
                         <v:path arrowok="t"/>
                       </v:shape>
@@ -8363,7 +8251,7 @@
                 </mc:Choice>
                 <mc:Fallback>
                   <w:pict>
-                    <v:group w14:anchorId="6C5C0B0D" id="Group 87" o:spid="_x0000_s1026" style="width:60.1pt;height:.6pt;mso-position-horizontal-relative:char;mso-position-vertical-relative:line" coordsize="7632,76" o:gfxdata="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">
+                    <v:group w14:anchorId="016CBC71" id="Group 87" o:spid="_x0000_s1026" style="width:60.1pt;height:.6pt;mso-position-horizontal-relative:char;mso-position-vertical-relative:line" coordsize="7632,76" o:gfxdata="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">
                       <v:shape id="Graphic 88" o:spid="_x0000_s1027" style="position:absolute;top:36;width:7632;height:12;visibility:visible;mso-wrap-style:square;v-text-anchor:top" coordsize="763270,1270" o:gfxdata="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" path="m,l762818,e" filled="f" strokecolor="#ccd3de" strokeweight=".20156mm">
                         <v:path arrowok="t"/>
                       </v:shape>
@@ -8491,7 +8379,7 @@
                 </mc:Choice>
                 <mc:Fallback>
                   <w:pict>
-                    <v:group w14:anchorId="2A855D44" id="Group 89" o:spid="_x0000_s1026" style="width:100.15pt;height:.6pt;mso-position-horizontal-relative:char;mso-position-vertical-relative:line" coordsize="12719,76" o:gfxdata="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">
+                    <v:group w14:anchorId="18259186" id="Group 89" o:spid="_x0000_s1026" style="width:100.15pt;height:.6pt;mso-position-horizontal-relative:char;mso-position-vertical-relative:line" coordsize="12719,76" o:gfxdata="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">
                       <v:shape id="Graphic 90" o:spid="_x0000_s1027" style="position:absolute;top:36;width:12719;height:12;visibility:visible;mso-wrap-style:square;v-text-anchor:top" coordsize="1271905,1270" o:gfxdata="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" path="m,l1271364,e" filled="f" strokecolor="#ccd3de" strokeweight=".20156mm">
                         <v:path arrowok="t"/>
                       </v:shape>
@@ -8627,7 +8515,7 @@
                 </mc:Choice>
                 <mc:Fallback>
                   <w:pict>
-                    <v:group w14:anchorId="777B94A8" id="Group 91" o:spid="_x0000_s1026" style="width:140.15pt;height:.6pt;mso-position-horizontal-relative:char;mso-position-vertical-relative:line" coordsize="17799,76" o:gfxdata="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">
+                    <v:group w14:anchorId="2067435E" id="Group 91" o:spid="_x0000_s1026" style="width:140.15pt;height:.6pt;mso-position-horizontal-relative:char;mso-position-vertical-relative:line" coordsize="17799,76" o:gfxdata="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">
                       <v:shape id="Graphic 92" o:spid="_x0000_s1027" style="position:absolute;top:36;width:17799;height:12;visibility:visible;mso-wrap-style:square;v-text-anchor:top" coordsize="1779905,1270" o:gfxdata="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" path="m,l1779910,e" filled="f" strokecolor="#ccd3de" strokeweight=".20156mm">
                         <v:path arrowok="t"/>
                       </v:shape>
@@ -8758,7 +8646,7 @@
                 </mc:Choice>
                 <mc:Fallback>
                   <w:pict>
-                    <v:group w14:anchorId="6D71D954" id="Group 93" o:spid="_x0000_s1026" style="width:60.1pt;height:.6pt;mso-position-horizontal-relative:char;mso-position-vertical-relative:line" coordsize="7632,76" o:gfxdata="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">
+                    <v:group w14:anchorId="55FF08FB" id="Group 93" o:spid="_x0000_s1026" style="width:60.1pt;height:.6pt;mso-position-horizontal-relative:char;mso-position-vertical-relative:line" coordsize="7632,76" o:gfxdata="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">
                       <v:shape id="Graphic 94" o:spid="_x0000_s1027" style="position:absolute;top:36;width:7632;height:12;visibility:visible;mso-wrap-style:square;v-text-anchor:top" coordsize="763270,1270" o:gfxdata="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" path="m,l762818,e" filled="f" strokecolor="#ccd3de" strokeweight=".20156mm">
                         <v:path arrowok="t"/>
                       </v:shape>
@@ -8887,7 +8775,7 @@
                 </mc:Choice>
                 <mc:Fallback>
                   <w:pict>
-                    <v:group w14:anchorId="111B9DE4" id="Group 95" o:spid="_x0000_s1026" style="width:100.15pt;height:.6pt;mso-position-horizontal-relative:char;mso-position-vertical-relative:line" coordsize="12719,76" o:gfxdata="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">
+                    <v:group w14:anchorId="050D83F5" id="Group 95" o:spid="_x0000_s1026" style="width:100.15pt;height:.6pt;mso-position-horizontal-relative:char;mso-position-vertical-relative:line" coordsize="12719,76" o:gfxdata="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">
                       <v:shape id="Graphic 96" o:spid="_x0000_s1027" style="position:absolute;top:36;width:12719;height:12;visibility:visible;mso-wrap-style:square;v-text-anchor:top" coordsize="1271905,1270" o:gfxdata="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" path="m,l1271364,e" filled="f" strokecolor="#ccd3de" strokeweight=".20156mm">
                         <v:path arrowok="t"/>
                       </v:shape>
@@ -9022,7 +8910,7 @@
                 </mc:Choice>
                 <mc:Fallback>
                   <w:pict>
-                    <v:group w14:anchorId="5ECF3D37" id="Group 97" o:spid="_x0000_s1026" style="width:140.15pt;height:.6pt;mso-position-horizontal-relative:char;mso-position-vertical-relative:line" coordsize="17799,76" o:gfxdata="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">
+                    <v:group w14:anchorId="35C22235" id="Group 97" o:spid="_x0000_s1026" style="width:140.15pt;height:.6pt;mso-position-horizontal-relative:char;mso-position-vertical-relative:line" coordsize="17799,76" o:gfxdata="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">
                       <v:shape id="Graphic 98" o:spid="_x0000_s1027" style="position:absolute;top:36;width:17799;height:12;visibility:visible;mso-wrap-style:square;v-text-anchor:top" coordsize="1779905,1270" o:gfxdata="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" path="m,l1779910,e" filled="f" strokecolor="#ccd3de" strokeweight=".20156mm">
                         <v:path arrowok="t"/>
                       </v:shape>
@@ -9152,7 +9040,7 @@
                 </mc:Choice>
                 <mc:Fallback>
                   <w:pict>
-                    <v:group w14:anchorId="38C2CF1F" id="Group 99" o:spid="_x0000_s1026" style="width:60.1pt;height:.6pt;mso-position-horizontal-relative:char;mso-position-vertical-relative:line" coordsize="7632,76" o:gfxdata="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">
+                    <v:group w14:anchorId="720D0D11" id="Group 99" o:spid="_x0000_s1026" style="width:60.1pt;height:.6pt;mso-position-horizontal-relative:char;mso-position-vertical-relative:line" coordsize="7632,76" o:gfxdata="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">
                       <v:shape id="Graphic 100" o:spid="_x0000_s1027" style="position:absolute;top:36;width:7632;height:12;visibility:visible;mso-wrap-style:square;v-text-anchor:top" coordsize="763270,1270" o:gfxdata="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" path="m,l762818,e" filled="f" strokecolor="#ccd3de" strokeweight=".20156mm">
                         <v:path arrowok="t"/>
                       </v:shape>
@@ -9280,7 +9168,7 @@
                 </mc:Choice>
                 <mc:Fallback>
                   <w:pict>
-                    <v:group w14:anchorId="5C5D0719" id="Group 101" o:spid="_x0000_s1026" style="width:100.15pt;height:.6pt;mso-position-horizontal-relative:char;mso-position-vertical-relative:line" coordsize="12719,76" o:gfxdata="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">
+                    <v:group w14:anchorId="171DB58F" id="Group 101" o:spid="_x0000_s1026" style="width:100.15pt;height:.6pt;mso-position-horizontal-relative:char;mso-position-vertical-relative:line" coordsize="12719,76" o:gfxdata="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">
                       <v:shape id="Graphic 102" o:spid="_x0000_s1027" style="position:absolute;top:36;width:12719;height:12;visibility:visible;mso-wrap-style:square;v-text-anchor:top" coordsize="1271905,1270" o:gfxdata="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" path="m,l1271364,e" filled="f" strokecolor="#ccd3de" strokeweight=".20156mm">
                         <v:path arrowok="t"/>
                       </v:shape>
@@ -9416,7 +9304,7 @@
                 </mc:Choice>
                 <mc:Fallback>
                   <w:pict>
-                    <v:group w14:anchorId="10400A94" id="Group 103" o:spid="_x0000_s1026" style="width:140.15pt;height:.6pt;mso-position-horizontal-relative:char;mso-position-vertical-relative:line" coordsize="17799,76" o:gfxdata="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">
+                    <v:group w14:anchorId="19C8F119" id="Group 103" o:spid="_x0000_s1026" style="width:140.15pt;height:.6pt;mso-position-horizontal-relative:char;mso-position-vertical-relative:line" coordsize="17799,76" o:gfxdata="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">
                       <v:shape id="Graphic 104" o:spid="_x0000_s1027" style="position:absolute;top:36;width:17799;height:12;visibility:visible;mso-wrap-style:square;v-text-anchor:top" coordsize="1779905,1270" o:gfxdata="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" path="m,l1779910,e" filled="f" strokecolor="#ccd3de" strokeweight=".20156mm">
                         <v:path arrowok="t"/>
                       </v:shape>
@@ -9545,7 +9433,7 @@
                 </mc:Choice>
                 <mc:Fallback>
                   <w:pict>
-                    <v:group w14:anchorId="27BBB4DD" id="Group 105" o:spid="_x0000_s1026" style="width:60.1pt;height:.6pt;mso-position-horizontal-relative:char;mso-position-vertical-relative:line" coordsize="7632,76" o:gfxdata="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">
+                    <v:group w14:anchorId="5B9A4289" id="Group 105" o:spid="_x0000_s1026" style="width:60.1pt;height:.6pt;mso-position-horizontal-relative:char;mso-position-vertical-relative:line" coordsize="7632,76" o:gfxdata="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">
                       <v:shape id="Graphic 106" o:spid="_x0000_s1027" style="position:absolute;top:36;width:7632;height:12;visibility:visible;mso-wrap-style:square;v-text-anchor:top" coordsize="763270,1270" o:gfxdata="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" path="m,l762818,e" filled="f" strokecolor="#ccd3de" strokeweight=".20156mm">
                         <v:path arrowok="t"/>
                       </v:shape>
@@ -9674,7 +9562,7 @@
                 </mc:Choice>
                 <mc:Fallback>
                   <w:pict>
-                    <v:group w14:anchorId="4ACFAA67" id="Group 107" o:spid="_x0000_s1026" style="width:100.15pt;height:.6pt;mso-position-horizontal-relative:char;mso-position-vertical-relative:line" coordsize="12719,76" o:gfxdata="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">
+                    <v:group w14:anchorId="2648FE0F" id="Group 107" o:spid="_x0000_s1026" style="width:100.15pt;height:.6pt;mso-position-horizontal-relative:char;mso-position-vertical-relative:line" coordsize="12719,76" o:gfxdata="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">
                       <v:shape id="Graphic 108" o:spid="_x0000_s1027" style="position:absolute;top:36;width:12719;height:12;visibility:visible;mso-wrap-style:square;v-text-anchor:top" coordsize="1271905,1270" o:gfxdata="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" path="m,l1271364,e" filled="f" strokecolor="#ccd3de" strokeweight=".20156mm">
                         <v:path arrowok="t"/>
                       </v:shape>
@@ -9800,7 +9688,7 @@
                 </mc:Choice>
                 <mc:Fallback>
                   <w:pict>
-                    <v:group w14:anchorId="5DC04EFF" id="Group 109" o:spid="_x0000_s1026" style="width:140.15pt;height:.6pt;mso-position-horizontal-relative:char;mso-position-vertical-relative:line" coordsize="17799,76" o:gfxdata="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">
+                    <v:group w14:anchorId="397D493A" id="Group 109" o:spid="_x0000_s1026" style="width:140.15pt;height:.6pt;mso-position-horizontal-relative:char;mso-position-vertical-relative:line" coordsize="17799,76" o:gfxdata="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">
                       <v:shape id="Graphic 110" o:spid="_x0000_s1027" style="position:absolute;top:36;width:17799;height:12;visibility:visible;mso-wrap-style:square;v-text-anchor:top" coordsize="1779905,1270" o:gfxdata="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" path="m,l1779910,e" filled="f" strokecolor="#ccd3de" strokeweight=".20156mm">
                         <v:path arrowok="t"/>
                       </v:shape>
@@ -9921,7 +9809,7 @@
                 </mc:Choice>
                 <mc:Fallback>
                   <w:pict>
-                    <v:group w14:anchorId="3CF19623" id="Group 111" o:spid="_x0000_s1026" style="width:60.1pt;height:.6pt;mso-position-horizontal-relative:char;mso-position-vertical-relative:line" coordsize="7632,76" o:gfxdata="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">
+                    <v:group w14:anchorId="3FC7AC8E" id="Group 111" o:spid="_x0000_s1026" style="width:60.1pt;height:.6pt;mso-position-horizontal-relative:char;mso-position-vertical-relative:line" coordsize="7632,76" o:gfxdata="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">
                       <v:shape id="Graphic 112" o:spid="_x0000_s1027" style="position:absolute;top:36;width:7632;height:12;visibility:visible;mso-wrap-style:square;v-text-anchor:top" coordsize="763270,1270" o:gfxdata="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" path="m,l762818,e" filled="f" strokecolor="#ccd3de" strokeweight=".20156mm">
                         <v:path arrowok="t"/>
                       </v:shape>
@@ -10042,7 +9930,7 @@
                 </mc:Choice>
                 <mc:Fallback>
                   <w:pict>
-                    <v:group w14:anchorId="53C22DF9" id="Group 113" o:spid="_x0000_s1026" style="width:100.15pt;height:.6pt;mso-position-horizontal-relative:char;mso-position-vertical-relative:line" coordsize="12719,76" o:gfxdata="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">
+                    <v:group w14:anchorId="51BBCFDB" id="Group 113" o:spid="_x0000_s1026" style="width:100.15pt;height:.6pt;mso-position-horizontal-relative:char;mso-position-vertical-relative:line" coordsize="12719,76" o:gfxdata="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">
                       <v:shape id="Graphic 114" o:spid="_x0000_s1027" style="position:absolute;top:36;width:12719;height:12;visibility:visible;mso-wrap-style:square;v-text-anchor:top" coordsize="1271905,1270" o:gfxdata="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" path="m,l1271364,e" filled="f" strokecolor="#ccd3de" strokeweight=".20156mm">
                         <v:path arrowok="t"/>
                       </v:shape>
@@ -10132,6 +10020,14 @@
             <w:r>
               <w:rPr>
                 <w:b/>
+                <w:color w:val="00B050"/>
+                <w:sz w:val="21"/>
+              </w:rPr>
+              <w:t>Book Borrow</w:t>
+            </w:r>
+            <w:r>
+              <w:rPr>
+                <w:b/>
                 <w:color w:val="AAAAAA"/>
                 <w:sz w:val="21"/>
                 <w:u w:val="single" w:color="A9A9A9"/>
@@ -10284,23 +10180,37 @@
             <w:pPr>
               <w:pStyle w:val="TableParagraph"/>
               <w:spacing w:before="135"/>
-              <w:rPr>
+              <w:jc w:val="center"/>
+              <w:rPr>
+                <w:color w:val="00B050"/>
                 <w:sz w:val="20"/>
               </w:rPr>
             </w:pPr>
+            <w:proofErr w:type="spellStart"/>
+            <w:r>
+              <w:rPr>
+                <w:color w:val="00B050"/>
+                <w:sz w:val="20"/>
+              </w:rPr>
+              <w:t>borrowId</w:t>
+            </w:r>
+            <w:proofErr w:type="spellEnd"/>
           </w:p>
           <w:p>
             <w:pPr>
               <w:pStyle w:val="TableParagraph"/>
               <w:spacing w:line="20" w:lineRule="exact"/>
               <w:ind w:left="165"/>
-              <w:rPr>
+              <w:jc w:val="center"/>
+              <w:rPr>
+                <w:color w:val="00B050"/>
                 <w:sz w:val="2"/>
               </w:rPr>
             </w:pPr>
             <w:r>
               <w:rPr>
                 <w:noProof/>
+                <w:color w:val="00B050"/>
                 <w:sz w:val="2"/>
               </w:rPr>
               <mc:AlternateContent>
@@ -10374,7 +10284,7 @@
                 </mc:Choice>
                 <mc:Fallback>
                   <w:pict>
-                    <v:group w14:anchorId="17685A71" id="Group 115" o:spid="_x0000_s1026" style="width:140.15pt;height:.6pt;mso-position-horizontal-relative:char;mso-position-vertical-relative:line" coordsize="17799,76" o:gfxdata="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">
+                    <v:group w14:anchorId="69C46A5D" id="Group 115" o:spid="_x0000_s1026" style="width:140.15pt;height:.6pt;mso-position-horizontal-relative:char;mso-position-vertical-relative:line" coordsize="17799,76" o:gfxdata="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">
                       <v:shape id="Graphic 116" o:spid="_x0000_s1027" style="position:absolute;top:36;width:17799;height:12;visibility:visible;mso-wrap-style:square;v-text-anchor:top" coordsize="1779905,1270" o:gfxdata="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" path="m,l1779910,e" filled="f" strokecolor="#ccd3de" strokeweight=".20156mm">
                         <v:path arrowok="t"/>
                       </v:shape>
@@ -10400,23 +10310,35 @@
             <w:pPr>
               <w:pStyle w:val="TableParagraph"/>
               <w:spacing w:before="135"/>
-              <w:rPr>
+              <w:jc w:val="center"/>
+              <w:rPr>
+                <w:color w:val="00B050"/>
                 <w:sz w:val="20"/>
               </w:rPr>
             </w:pPr>
+            <w:r>
+              <w:rPr>
+                <w:color w:val="00B050"/>
+                <w:sz w:val="20"/>
+              </w:rPr>
+              <w:t>int</w:t>
+            </w:r>
           </w:p>
           <w:p>
             <w:pPr>
               <w:pStyle w:val="TableParagraph"/>
               <w:spacing w:line="20" w:lineRule="exact"/>
               <w:ind w:left="165"/>
-              <w:rPr>
+              <w:jc w:val="center"/>
+              <w:rPr>
+                <w:color w:val="00B050"/>
                 <w:sz w:val="2"/>
               </w:rPr>
             </w:pPr>
             <w:r>
               <w:rPr>
                 <w:noProof/>
+                <w:color w:val="00B050"/>
                 <w:sz w:val="2"/>
               </w:rPr>
               <mc:AlternateContent>
@@ -10490,7 +10412,7 @@
                 </mc:Choice>
                 <mc:Fallback>
                   <w:pict>
-                    <v:group w14:anchorId="17969015" id="Group 117" o:spid="_x0000_s1026" style="width:60.1pt;height:.6pt;mso-position-horizontal-relative:char;mso-position-vertical-relative:line" coordsize="7632,76" o:gfxdata="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">
+                    <v:group w14:anchorId="405015C2" id="Group 117" o:spid="_x0000_s1026" style="width:60.1pt;height:.6pt;mso-position-horizontal-relative:char;mso-position-vertical-relative:line" coordsize="7632,76" o:gfxdata="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">
                       <v:shape id="Graphic 118" o:spid="_x0000_s1027" style="position:absolute;top:36;width:7632;height:12;visibility:visible;mso-wrap-style:square;v-text-anchor:top" coordsize="763270,1270" o:gfxdata="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" path="m,l762818,e" filled="f" strokecolor="#ccd3de" strokeweight=".20156mm">
                         <v:path arrowok="t"/>
                       </v:shape>
@@ -10516,23 +10438,35 @@
             <w:pPr>
               <w:pStyle w:val="TableParagraph"/>
               <w:spacing w:before="135"/>
-              <w:rPr>
+              <w:jc w:val="center"/>
+              <w:rPr>
+                <w:color w:val="00B050"/>
                 <w:sz w:val="20"/>
               </w:rPr>
             </w:pPr>
+            <w:r>
+              <w:rPr>
+                <w:color w:val="00B050"/>
+                <w:sz w:val="20"/>
+              </w:rPr>
+              <w:t>System Generated</w:t>
+            </w:r>
           </w:p>
           <w:p>
             <w:pPr>
               <w:pStyle w:val="TableParagraph"/>
               <w:spacing w:line="20" w:lineRule="exact"/>
               <w:ind w:left="165"/>
-              <w:rPr>
+              <w:jc w:val="center"/>
+              <w:rPr>
+                <w:color w:val="00B050"/>
                 <w:sz w:val="2"/>
               </w:rPr>
             </w:pPr>
             <w:r>
               <w:rPr>
                 <w:noProof/>
+                <w:color w:val="00B050"/>
                 <w:sz w:val="2"/>
               </w:rPr>
               <mc:AlternateContent>
@@ -10606,7 +10540,7 @@
                 </mc:Choice>
                 <mc:Fallback>
                   <w:pict>
-                    <v:group w14:anchorId="4AAF1A52" id="Group 119" o:spid="_x0000_s1026" style="width:100.15pt;height:.6pt;mso-position-horizontal-relative:char;mso-position-vertical-relative:line" coordsize="12719,76" o:gfxdata="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">
+                    <v:group w14:anchorId="11D8678B" id="Group 119" o:spid="_x0000_s1026" style="width:100.15pt;height:.6pt;mso-position-horizontal-relative:char;mso-position-vertical-relative:line" coordsize="12719,76" o:gfxdata="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">
                       <v:shape id="Graphic 120" o:spid="_x0000_s1027" style="position:absolute;top:36;width:12719;height:12;visibility:visible;mso-wrap-style:square;v-text-anchor:top" coordsize="1271905,1270" o:gfxdata="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" path="m,l1271364,e" filled="f" strokecolor="#ccd3de" strokeweight=".20156mm">
                         <v:path arrowok="t"/>
                       </v:shape>
@@ -10638,23 +10572,37 @@
             <w:pPr>
               <w:pStyle w:val="TableParagraph"/>
               <w:spacing w:before="135"/>
-              <w:rPr>
+              <w:jc w:val="center"/>
+              <w:rPr>
+                <w:color w:val="00B050"/>
                 <w:sz w:val="20"/>
               </w:rPr>
             </w:pPr>
+            <w:proofErr w:type="spellStart"/>
+            <w:r>
+              <w:rPr>
+                <w:color w:val="00B050"/>
+                <w:sz w:val="20"/>
+              </w:rPr>
+              <w:t>memberId</w:t>
+            </w:r>
+            <w:proofErr w:type="spellEnd"/>
           </w:p>
           <w:p>
             <w:pPr>
               <w:pStyle w:val="TableParagraph"/>
               <w:spacing w:line="20" w:lineRule="exact"/>
               <w:ind w:left="165"/>
-              <w:rPr>
+              <w:jc w:val="center"/>
+              <w:rPr>
+                <w:color w:val="00B050"/>
                 <w:sz w:val="2"/>
               </w:rPr>
             </w:pPr>
             <w:r>
               <w:rPr>
                 <w:noProof/>
+                <w:color w:val="00B050"/>
                 <w:sz w:val="2"/>
               </w:rPr>
               <mc:AlternateContent>
@@ -10728,7 +10676,7 @@
                 </mc:Choice>
                 <mc:Fallback>
                   <w:pict>
-                    <v:group w14:anchorId="15922F8A" id="Group 121" o:spid="_x0000_s1026" style="width:140.15pt;height:.6pt;mso-position-horizontal-relative:char;mso-position-vertical-relative:line" coordsize="17799,76" o:gfxdata="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">
+                    <v:group w14:anchorId="418EBC2F" id="Group 121" o:spid="_x0000_s1026" style="width:140.15pt;height:.6pt;mso-position-horizontal-relative:char;mso-position-vertical-relative:line" coordsize="17799,76" o:gfxdata="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">
                       <v:shape id="Graphic 122" o:spid="_x0000_s1027" style="position:absolute;top:36;width:17799;height:12;visibility:visible;mso-wrap-style:square;v-text-anchor:top" coordsize="1779905,1270" o:gfxdata="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" path="m,l1779910,e" filled="f" strokecolor="#ccd3de" strokeweight=".20156mm">
                         <v:path arrowok="t"/>
                       </v:shape>
@@ -10755,23 +10703,35 @@
             <w:pPr>
               <w:pStyle w:val="TableParagraph"/>
               <w:spacing w:before="135"/>
-              <w:rPr>
+              <w:jc w:val="center"/>
+              <w:rPr>
+                <w:color w:val="00B050"/>
                 <w:sz w:val="20"/>
               </w:rPr>
             </w:pPr>
+            <w:r>
+              <w:rPr>
+                <w:color w:val="00B050"/>
+                <w:sz w:val="20"/>
+              </w:rPr>
+              <w:t>int</w:t>
+            </w:r>
           </w:p>
           <w:p>
             <w:pPr>
               <w:pStyle w:val="TableParagraph"/>
               <w:spacing w:line="20" w:lineRule="exact"/>
               <w:ind w:left="165"/>
-              <w:rPr>
+              <w:jc w:val="center"/>
+              <w:rPr>
+                <w:color w:val="00B050"/>
                 <w:sz w:val="2"/>
               </w:rPr>
             </w:pPr>
             <w:r>
               <w:rPr>
                 <w:noProof/>
+                <w:color w:val="00B050"/>
                 <w:sz w:val="2"/>
               </w:rPr>
               <mc:AlternateContent>
@@ -10845,7 +10805,7 @@
                 </mc:Choice>
                 <mc:Fallback>
                   <w:pict>
-                    <v:group w14:anchorId="3BDAB589" id="Group 123" o:spid="_x0000_s1026" style="width:60.1pt;height:.6pt;mso-position-horizontal-relative:char;mso-position-vertical-relative:line" coordsize="7632,76" o:gfxdata="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">
+                    <v:group w14:anchorId="2256C315" id="Group 123" o:spid="_x0000_s1026" style="width:60.1pt;height:.6pt;mso-position-horizontal-relative:char;mso-position-vertical-relative:line" coordsize="7632,76" o:gfxdata="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">
                       <v:shape id="Graphic 124" o:spid="_x0000_s1027" style="position:absolute;top:36;width:7632;height:12;visibility:visible;mso-wrap-style:square;v-text-anchor:top" coordsize="763270,1270" o:gfxdata="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" path="m,l762818,e" filled="f" strokecolor="#ccd3de" strokeweight=".20156mm">
                         <v:path arrowok="t"/>
                       </v:shape>
@@ -10872,23 +10832,35 @@
             <w:pPr>
               <w:pStyle w:val="TableParagraph"/>
               <w:spacing w:before="135"/>
-              <w:rPr>
+              <w:jc w:val="center"/>
+              <w:rPr>
+                <w:color w:val="00B050"/>
                 <w:sz w:val="20"/>
               </w:rPr>
             </w:pPr>
+            <w:r>
+              <w:rPr>
+                <w:color w:val="00B050"/>
+                <w:sz w:val="20"/>
+              </w:rPr>
+              <w:t>From List</w:t>
+            </w:r>
           </w:p>
           <w:p>
             <w:pPr>
               <w:pStyle w:val="TableParagraph"/>
               <w:spacing w:line="20" w:lineRule="exact"/>
               <w:ind w:left="165"/>
-              <w:rPr>
+              <w:jc w:val="center"/>
+              <w:rPr>
+                <w:color w:val="00B050"/>
                 <w:sz w:val="2"/>
               </w:rPr>
             </w:pPr>
             <w:r>
               <w:rPr>
                 <w:noProof/>
+                <w:color w:val="00B050"/>
                 <w:sz w:val="2"/>
               </w:rPr>
               <mc:AlternateContent>
@@ -10962,7 +10934,7 @@
                 </mc:Choice>
                 <mc:Fallback>
                   <w:pict>
-                    <v:group w14:anchorId="5CC71384" id="Group 125" o:spid="_x0000_s1026" style="width:100.15pt;height:.6pt;mso-position-horizontal-relative:char;mso-position-vertical-relative:line" coordsize="12719,76" o:gfxdata="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">
+                    <v:group w14:anchorId="1B1ECC80" id="Group 125" o:spid="_x0000_s1026" style="width:100.15pt;height:.6pt;mso-position-horizontal-relative:char;mso-position-vertical-relative:line" coordsize="12719,76" o:gfxdata="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">
                       <v:shape id="Graphic 126" o:spid="_x0000_s1027" style="position:absolute;top:36;width:12719;height:12;visibility:visible;mso-wrap-style:square;v-text-anchor:top" coordsize="1271905,1270" o:gfxdata="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" path="m,l1271364,e" filled="f" strokecolor="#ccd3de" strokeweight=".20156mm">
                         <v:path arrowok="t"/>
                       </v:shape>
@@ -10993,23 +10965,37 @@
             <w:pPr>
               <w:pStyle w:val="TableParagraph"/>
               <w:spacing w:before="135"/>
-              <w:rPr>
+              <w:jc w:val="center"/>
+              <w:rPr>
+                <w:color w:val="00B050"/>
                 <w:sz w:val="20"/>
               </w:rPr>
             </w:pPr>
+            <w:proofErr w:type="spellStart"/>
+            <w:r>
+              <w:rPr>
+                <w:color w:val="00B050"/>
+                <w:sz w:val="20"/>
+              </w:rPr>
+              <w:t>bookId</w:t>
+            </w:r>
+            <w:proofErr w:type="spellEnd"/>
           </w:p>
           <w:p>
             <w:pPr>
               <w:pStyle w:val="TableParagraph"/>
               <w:spacing w:line="20" w:lineRule="exact"/>
               <w:ind w:left="165"/>
-              <w:rPr>
+              <w:jc w:val="center"/>
+              <w:rPr>
+                <w:color w:val="00B050"/>
                 <w:sz w:val="2"/>
               </w:rPr>
             </w:pPr>
             <w:r>
               <w:rPr>
                 <w:noProof/>
+                <w:color w:val="00B050"/>
                 <w:sz w:val="2"/>
               </w:rPr>
               <mc:AlternateContent>
@@ -11083,7 +11069,7 @@
                 </mc:Choice>
                 <mc:Fallback>
                   <w:pict>
-                    <v:group w14:anchorId="19702540" id="Group 127" o:spid="_x0000_s1026" style="width:140.15pt;height:.6pt;mso-position-horizontal-relative:char;mso-position-vertical-relative:line" coordsize="17799,76" o:gfxdata="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">
+                    <v:group w14:anchorId="0772999B" id="Group 127" o:spid="_x0000_s1026" style="width:140.15pt;height:.6pt;mso-position-horizontal-relative:char;mso-position-vertical-relative:line" coordsize="17799,76" o:gfxdata="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">
                       <v:shape id="Graphic 128" o:spid="_x0000_s1027" style="position:absolute;top:36;width:17799;height:12;visibility:visible;mso-wrap-style:square;v-text-anchor:top" coordsize="1779905,1270" o:gfxdata="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" path="m,l1779910,e" filled="f" strokecolor="#ccd3de" strokeweight=".20156mm">
                         <v:path arrowok="t"/>
                       </v:shape>
@@ -11109,23 +11095,35 @@
             <w:pPr>
               <w:pStyle w:val="TableParagraph"/>
               <w:spacing w:before="135"/>
-              <w:rPr>
+              <w:jc w:val="center"/>
+              <w:rPr>
+                <w:color w:val="00B050"/>
                 <w:sz w:val="20"/>
               </w:rPr>
             </w:pPr>
+            <w:r>
+              <w:rPr>
+                <w:color w:val="00B050"/>
+                <w:sz w:val="20"/>
+              </w:rPr>
+              <w:t>int</w:t>
+            </w:r>
           </w:p>
           <w:p>
             <w:pPr>
               <w:pStyle w:val="TableParagraph"/>
               <w:spacing w:line="20" w:lineRule="exact"/>
               <w:ind w:left="165"/>
-              <w:rPr>
+              <w:jc w:val="center"/>
+              <w:rPr>
+                <w:color w:val="00B050"/>
                 <w:sz w:val="2"/>
               </w:rPr>
             </w:pPr>
             <w:r>
               <w:rPr>
                 <w:noProof/>
+                <w:color w:val="00B050"/>
                 <w:sz w:val="2"/>
               </w:rPr>
               <mc:AlternateContent>
@@ -11199,7 +11197,7 @@
                 </mc:Choice>
                 <mc:Fallback>
                   <w:pict>
-                    <v:group w14:anchorId="4EDFE8C4" id="Group 129" o:spid="_x0000_s1026" style="width:60.1pt;height:.6pt;mso-position-horizontal-relative:char;mso-position-vertical-relative:line" coordsize="7632,76" o:gfxdata="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">
+                    <v:group w14:anchorId="1A1B1E01" id="Group 129" o:spid="_x0000_s1026" style="width:60.1pt;height:.6pt;mso-position-horizontal-relative:char;mso-position-vertical-relative:line" coordsize="7632,76" o:gfxdata="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">
                       <v:shape id="Graphic 130" o:spid="_x0000_s1027" style="position:absolute;top:36;width:7632;height:12;visibility:visible;mso-wrap-style:square;v-text-anchor:top" coordsize="763270,1270" o:gfxdata="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" path="m,l762818,e" filled="f" strokecolor="#ccd3de" strokeweight=".20156mm">
                         <v:path arrowok="t"/>
                       </v:shape>
@@ -11225,23 +11223,35 @@
             <w:pPr>
               <w:pStyle w:val="TableParagraph"/>
               <w:spacing w:before="135"/>
-              <w:rPr>
+              <w:jc w:val="center"/>
+              <w:rPr>
+                <w:color w:val="00B050"/>
                 <w:sz w:val="20"/>
               </w:rPr>
             </w:pPr>
+            <w:r>
+              <w:rPr>
+                <w:color w:val="00B050"/>
+                <w:sz w:val="20"/>
+              </w:rPr>
+              <w:t>From List</w:t>
+            </w:r>
           </w:p>
           <w:p>
             <w:pPr>
               <w:pStyle w:val="TableParagraph"/>
               <w:spacing w:line="20" w:lineRule="exact"/>
               <w:ind w:left="165"/>
-              <w:rPr>
+              <w:jc w:val="center"/>
+              <w:rPr>
+                <w:color w:val="00B050"/>
                 <w:sz w:val="2"/>
               </w:rPr>
             </w:pPr>
             <w:r>
               <w:rPr>
                 <w:noProof/>
+                <w:color w:val="00B050"/>
                 <w:sz w:val="2"/>
               </w:rPr>
               <mc:AlternateContent>
@@ -11315,7 +11325,7 @@
                 </mc:Choice>
                 <mc:Fallback>
                   <w:pict>
-                    <v:group w14:anchorId="5CE7BBAC" id="Group 131" o:spid="_x0000_s1026" style="width:100.15pt;height:.6pt;mso-position-horizontal-relative:char;mso-position-vertical-relative:line" coordsize="12719,76" o:gfxdata="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">
+                    <v:group w14:anchorId="45E399AE" id="Group 131" o:spid="_x0000_s1026" style="width:100.15pt;height:.6pt;mso-position-horizontal-relative:char;mso-position-vertical-relative:line" coordsize="12719,76" o:gfxdata="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">
                       <v:shape id="Graphic 132" o:spid="_x0000_s1027" style="position:absolute;top:36;width:12719;height:12;visibility:visible;mso-wrap-style:square;v-text-anchor:top" coordsize="1271905,1270" o:gfxdata="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" path="m,l1271364,e" filled="f" strokecolor="#ccd3de" strokeweight=".20156mm">
                         <v:path arrowok="t"/>
                       </v:shape>
@@ -11347,23 +11357,37 @@
             <w:pPr>
               <w:pStyle w:val="TableParagraph"/>
               <w:spacing w:before="135"/>
-              <w:rPr>
+              <w:jc w:val="center"/>
+              <w:rPr>
+                <w:color w:val="00B050"/>
                 <w:sz w:val="20"/>
               </w:rPr>
             </w:pPr>
+            <w:proofErr w:type="spellStart"/>
+            <w:r>
+              <w:rPr>
+                <w:color w:val="00B050"/>
+                <w:sz w:val="20"/>
+              </w:rPr>
+              <w:t>borrowDate</w:t>
+            </w:r>
+            <w:proofErr w:type="spellEnd"/>
           </w:p>
           <w:p>
             <w:pPr>
               <w:pStyle w:val="TableParagraph"/>
               <w:spacing w:line="20" w:lineRule="exact"/>
               <w:ind w:left="165"/>
-              <w:rPr>
+              <w:jc w:val="center"/>
+              <w:rPr>
+                <w:color w:val="00B050"/>
                 <w:sz w:val="2"/>
               </w:rPr>
             </w:pPr>
             <w:r>
               <w:rPr>
                 <w:noProof/>
+                <w:color w:val="00B050"/>
                 <w:sz w:val="2"/>
               </w:rPr>
               <mc:AlternateContent>
@@ -11437,7 +11461,7 @@
                 </mc:Choice>
                 <mc:Fallback>
                   <w:pict>
-                    <v:group w14:anchorId="2E281C37" id="Group 133" o:spid="_x0000_s1026" style="width:140.15pt;height:.6pt;mso-position-horizontal-relative:char;mso-position-vertical-relative:line" coordsize="17799,76" o:gfxdata="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">
+                    <v:group w14:anchorId="0EEE3364" id="Group 133" o:spid="_x0000_s1026" style="width:140.15pt;height:.6pt;mso-position-horizontal-relative:char;mso-position-vertical-relative:line" coordsize="17799,76" o:gfxdata="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">
                       <v:shape id="Graphic 134" o:spid="_x0000_s1027" style="position:absolute;top:36;width:17799;height:12;visibility:visible;mso-wrap-style:square;v-text-anchor:top" coordsize="1779905,1270" o:gfxdata="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" path="m,l1779910,e" filled="f" strokecolor="#ccd3de" strokeweight=".20156mm">
                         <v:path arrowok="t"/>
                       </v:shape>
@@ -11464,23 +11488,37 @@
             <w:pPr>
               <w:pStyle w:val="TableParagraph"/>
               <w:spacing w:before="135"/>
-              <w:rPr>
+              <w:jc w:val="center"/>
+              <w:rPr>
+                <w:color w:val="00B050"/>
                 <w:sz w:val="20"/>
               </w:rPr>
             </w:pPr>
+            <w:proofErr w:type="spellStart"/>
+            <w:r>
+              <w:rPr>
+                <w:color w:val="00B050"/>
+                <w:sz w:val="20"/>
+              </w:rPr>
+              <w:t>DateTime</w:t>
+            </w:r>
+            <w:proofErr w:type="spellEnd"/>
           </w:p>
           <w:p>
             <w:pPr>
               <w:pStyle w:val="TableParagraph"/>
               <w:spacing w:line="20" w:lineRule="exact"/>
               <w:ind w:left="165"/>
-              <w:rPr>
+              <w:jc w:val="center"/>
+              <w:rPr>
+                <w:color w:val="00B050"/>
                 <w:sz w:val="2"/>
               </w:rPr>
             </w:pPr>
             <w:r>
               <w:rPr>
                 <w:noProof/>
+                <w:color w:val="00B050"/>
                 <w:sz w:val="2"/>
               </w:rPr>
               <mc:AlternateContent>
@@ -11554,7 +11592,7 @@
                 </mc:Choice>
                 <mc:Fallback>
                   <w:pict>
-                    <v:group w14:anchorId="7E29E7F7" id="Group 135" o:spid="_x0000_s1026" style="width:60.1pt;height:.6pt;mso-position-horizontal-relative:char;mso-position-vertical-relative:line" coordsize="7632,76" o:gfxdata="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">
+                    <v:group w14:anchorId="04D8BAB7" id="Group 135" o:spid="_x0000_s1026" style="width:60.1pt;height:.6pt;mso-position-horizontal-relative:char;mso-position-vertical-relative:line" coordsize="7632,76" o:gfxdata="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">
                       <v:shape id="Graphic 136" o:spid="_x0000_s1027" style="position:absolute;top:36;width:7632;height:12;visibility:visible;mso-wrap-style:square;v-text-anchor:top" coordsize="763270,1270" o:gfxdata="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" path="m,l762818,e" filled="f" strokecolor="#ccd3de" strokeweight=".20156mm">
                         <v:path arrowok="t"/>
                       </v:shape>
@@ -11581,23 +11619,35 @@
             <w:pPr>
               <w:pStyle w:val="TableParagraph"/>
               <w:spacing w:before="135"/>
-              <w:rPr>
+              <w:jc w:val="center"/>
+              <w:rPr>
+                <w:color w:val="00B050"/>
                 <w:sz w:val="20"/>
               </w:rPr>
             </w:pPr>
+            <w:r>
+              <w:rPr>
+                <w:color w:val="00B050"/>
+                <w:sz w:val="20"/>
+              </w:rPr>
+              <w:t>Default Value</w:t>
+            </w:r>
           </w:p>
           <w:p>
             <w:pPr>
               <w:pStyle w:val="TableParagraph"/>
               <w:spacing w:line="20" w:lineRule="exact"/>
               <w:ind w:left="165"/>
-              <w:rPr>
+              <w:jc w:val="center"/>
+              <w:rPr>
+                <w:color w:val="00B050"/>
                 <w:sz w:val="2"/>
               </w:rPr>
             </w:pPr>
             <w:r>
               <w:rPr>
                 <w:noProof/>
+                <w:color w:val="00B050"/>
                 <w:sz w:val="2"/>
               </w:rPr>
               <mc:AlternateContent>
@@ -11671,7 +11721,7 @@
                 </mc:Choice>
                 <mc:Fallback>
                   <w:pict>
-                    <v:group w14:anchorId="272F9E3D" id="Group 137" o:spid="_x0000_s1026" style="width:100.15pt;height:.6pt;mso-position-horizontal-relative:char;mso-position-vertical-relative:line" coordsize="12719,76" o:gfxdata="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">
+                    <v:group w14:anchorId="0D05A3AD" id="Group 137" o:spid="_x0000_s1026" style="width:100.15pt;height:.6pt;mso-position-horizontal-relative:char;mso-position-vertical-relative:line" coordsize="12719,76" o:gfxdata="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">
                       <v:shape id="Graphic 138" o:spid="_x0000_s1027" style="position:absolute;top:36;width:12719;height:12;visibility:visible;mso-wrap-style:square;v-text-anchor:top" coordsize="1271905,1270" o:gfxdata="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" path="m,l1271364,e" filled="f" strokecolor="#ccd3de" strokeweight=".20156mm">
                         <v:path arrowok="t"/>
                       </v:shape>
@@ -11702,23 +11752,44 @@
             <w:pPr>
               <w:pStyle w:val="TableParagraph"/>
               <w:spacing w:before="135"/>
-              <w:rPr>
+              <w:jc w:val="center"/>
+              <w:rPr>
+                <w:color w:val="00B050"/>
                 <w:sz w:val="20"/>
               </w:rPr>
             </w:pPr>
+            <w:proofErr w:type="spellStart"/>
+            <w:r>
+              <w:rPr>
+                <w:color w:val="00B050"/>
+                <w:sz w:val="20"/>
+              </w:rPr>
+              <w:t>dueDate</w:t>
+            </w:r>
+            <w:proofErr w:type="spellEnd"/>
+            <w:r>
+              <w:rPr>
+                <w:color w:val="00B050"/>
+                <w:sz w:val="20"/>
+              </w:rPr>
+              <w:t xml:space="preserve"> </w:t>
+            </w:r>
           </w:p>
           <w:p>
             <w:pPr>
               <w:pStyle w:val="TableParagraph"/>
               <w:spacing w:line="20" w:lineRule="exact"/>
               <w:ind w:left="165"/>
-              <w:rPr>
+              <w:jc w:val="center"/>
+              <w:rPr>
+                <w:color w:val="00B050"/>
                 <w:sz w:val="2"/>
               </w:rPr>
             </w:pPr>
             <w:r>
               <w:rPr>
                 <w:noProof/>
+                <w:color w:val="00B050"/>
                 <w:sz w:val="2"/>
               </w:rPr>
               <mc:AlternateContent>
@@ -11792,7 +11863,7 @@
                 </mc:Choice>
                 <mc:Fallback>
                   <w:pict>
-                    <v:group w14:anchorId="22C992CC" id="Group 139" o:spid="_x0000_s1026" style="width:140.15pt;height:.6pt;mso-position-horizontal-relative:char;mso-position-vertical-relative:line" coordsize="17799,76" o:gfxdata="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">
+                    <v:group w14:anchorId="46C7D3AD" id="Group 139" o:spid="_x0000_s1026" style="width:140.15pt;height:.6pt;mso-position-horizontal-relative:char;mso-position-vertical-relative:line" coordsize="17799,76" o:gfxdata="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">
                       <v:shape id="Graphic 140" o:spid="_x0000_s1027" style="position:absolute;top:36;width:17799;height:12;visibility:visible;mso-wrap-style:square;v-text-anchor:top" coordsize="1779905,1270" o:gfxdata="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" path="m,l1779910,e" filled="f" strokecolor="#ccd3de" strokeweight=".20156mm">
                         <v:path arrowok="t"/>
                       </v:shape>
@@ -11818,23 +11889,37 @@
             <w:pPr>
               <w:pStyle w:val="TableParagraph"/>
               <w:spacing w:before="135"/>
-              <w:rPr>
+              <w:jc w:val="center"/>
+              <w:rPr>
+                <w:color w:val="00B050"/>
                 <w:sz w:val="20"/>
               </w:rPr>
             </w:pPr>
+            <w:proofErr w:type="spellStart"/>
+            <w:r>
+              <w:rPr>
+                <w:color w:val="00B050"/>
+                <w:sz w:val="20"/>
+              </w:rPr>
+              <w:t>DateTime</w:t>
+            </w:r>
+            <w:proofErr w:type="spellEnd"/>
           </w:p>
           <w:p>
             <w:pPr>
               <w:pStyle w:val="TableParagraph"/>
               <w:spacing w:line="20" w:lineRule="exact"/>
               <w:ind w:left="165"/>
-              <w:rPr>
+              <w:jc w:val="center"/>
+              <w:rPr>
+                <w:color w:val="00B050"/>
                 <w:sz w:val="2"/>
               </w:rPr>
             </w:pPr>
             <w:r>
               <w:rPr>
                 <w:noProof/>
+                <w:color w:val="00B050"/>
                 <w:sz w:val="2"/>
               </w:rPr>
               <mc:AlternateContent>
@@ -11908,7 +11993,7 @@
                 </mc:Choice>
                 <mc:Fallback>
                   <w:pict>
-                    <v:group w14:anchorId="27045EC5" id="Group 141" o:spid="_x0000_s1026" style="width:60.1pt;height:.6pt;mso-position-horizontal-relative:char;mso-position-vertical-relative:line" coordsize="7632,76" o:gfxdata="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">
+                    <v:group w14:anchorId="583517EE" id="Group 141" o:spid="_x0000_s1026" style="width:60.1pt;height:.6pt;mso-position-horizontal-relative:char;mso-position-vertical-relative:line" coordsize="7632,76" o:gfxdata="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">
                       <v:shape id="Graphic 142" o:spid="_x0000_s1027" style="position:absolute;top:36;width:7632;height:12;visibility:visible;mso-wrap-style:square;v-text-anchor:top" coordsize="763270,1270" o:gfxdata="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" path="m,l762818,e" filled="f" strokecolor="#ccd3de" strokeweight=".20156mm">
                         <v:path arrowok="t"/>
                       </v:shape>
@@ -11934,23 +12019,35 @@
             <w:pPr>
               <w:pStyle w:val="TableParagraph"/>
               <w:spacing w:before="135"/>
-              <w:rPr>
+              <w:jc w:val="center"/>
+              <w:rPr>
+                <w:color w:val="00B050"/>
                 <w:sz w:val="20"/>
               </w:rPr>
             </w:pPr>
+            <w:r>
+              <w:rPr>
+                <w:color w:val="00B050"/>
+                <w:sz w:val="20"/>
+              </w:rPr>
+              <w:t>Calculated</w:t>
+            </w:r>
           </w:p>
           <w:p>
             <w:pPr>
               <w:pStyle w:val="TableParagraph"/>
               <w:spacing w:line="20" w:lineRule="exact"/>
               <w:ind w:left="165"/>
-              <w:rPr>
+              <w:jc w:val="center"/>
+              <w:rPr>
+                <w:color w:val="00B050"/>
                 <w:sz w:val="2"/>
               </w:rPr>
             </w:pPr>
             <w:r>
               <w:rPr>
                 <w:noProof/>
+                <w:color w:val="00B050"/>
                 <w:sz w:val="2"/>
               </w:rPr>
               <mc:AlternateContent>
@@ -12024,7 +12121,7 @@
                 </mc:Choice>
                 <mc:Fallback>
                   <w:pict>
-                    <v:group w14:anchorId="5E3351A7" id="Group 143" o:spid="_x0000_s1026" style="width:100.15pt;height:.6pt;mso-position-horizontal-relative:char;mso-position-vertical-relative:line" coordsize="12719,76" o:gfxdata="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">
+                    <v:group w14:anchorId="76EB714B" id="Group 143" o:spid="_x0000_s1026" style="width:100.15pt;height:.6pt;mso-position-horizontal-relative:char;mso-position-vertical-relative:line" coordsize="12719,76" o:gfxdata="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">
                       <v:shape id="Graphic 144" o:spid="_x0000_s1027" style="position:absolute;top:36;width:12719;height:12;visibility:visible;mso-wrap-style:square;v-text-anchor:top" coordsize="1271905,1270" o:gfxdata="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" path="m,l1271364,e" filled="f" strokecolor="#ccd3de" strokeweight=".20156mm">
                         <v:path arrowok="t"/>
                       </v:shape>
@@ -12056,23 +12153,37 @@
             <w:pPr>
               <w:pStyle w:val="TableParagraph"/>
               <w:spacing w:before="135"/>
-              <w:rPr>
+              <w:jc w:val="center"/>
+              <w:rPr>
+                <w:color w:val="00B050"/>
                 <w:sz w:val="20"/>
               </w:rPr>
             </w:pPr>
+            <w:proofErr w:type="spellStart"/>
+            <w:r>
+              <w:rPr>
+                <w:color w:val="00B050"/>
+                <w:sz w:val="20"/>
+              </w:rPr>
+              <w:t>returnDate</w:t>
+            </w:r>
+            <w:proofErr w:type="spellEnd"/>
           </w:p>
           <w:p>
             <w:pPr>
               <w:pStyle w:val="TableParagraph"/>
               <w:spacing w:line="20" w:lineRule="exact"/>
               <w:ind w:left="165"/>
-              <w:rPr>
+              <w:jc w:val="center"/>
+              <w:rPr>
+                <w:color w:val="00B050"/>
                 <w:sz w:val="2"/>
               </w:rPr>
             </w:pPr>
             <w:r>
               <w:rPr>
                 <w:noProof/>
+                <w:color w:val="00B050"/>
                 <w:sz w:val="2"/>
               </w:rPr>
               <mc:AlternateContent>
@@ -12146,7 +12257,7 @@
                 </mc:Choice>
                 <mc:Fallback>
                   <w:pict>
-                    <v:group w14:anchorId="3893C8A4" id="Group 145" o:spid="_x0000_s1026" style="width:140.15pt;height:.6pt;mso-position-horizontal-relative:char;mso-position-vertical-relative:line" coordsize="17799,76" o:gfxdata="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">
+                    <v:group w14:anchorId="57D56F51" id="Group 145" o:spid="_x0000_s1026" style="width:140.15pt;height:.6pt;mso-position-horizontal-relative:char;mso-position-vertical-relative:line" coordsize="17799,76" o:gfxdata="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">
                       <v:shape id="Graphic 146" o:spid="_x0000_s1027" style="position:absolute;top:36;width:17799;height:12;visibility:visible;mso-wrap-style:square;v-text-anchor:top" coordsize="1779905,1270" o:gfxdata="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" path="m,l1779910,e" filled="f" strokecolor="#ccd3de" strokeweight=".20156mm">
                         <v:path arrowok="t"/>
                       </v:shape>
@@ -12173,23 +12284,37 @@
             <w:pPr>
               <w:pStyle w:val="TableParagraph"/>
               <w:spacing w:before="135"/>
-              <w:rPr>
+              <w:jc w:val="center"/>
+              <w:rPr>
+                <w:color w:val="00B050"/>
                 <w:sz w:val="20"/>
               </w:rPr>
             </w:pPr>
+            <w:proofErr w:type="spellStart"/>
+            <w:r>
+              <w:rPr>
+                <w:color w:val="00B050"/>
+                <w:sz w:val="20"/>
+              </w:rPr>
+              <w:t>DateTime</w:t>
+            </w:r>
+            <w:proofErr w:type="spellEnd"/>
           </w:p>
           <w:p>
             <w:pPr>
               <w:pStyle w:val="TableParagraph"/>
               <w:spacing w:line="20" w:lineRule="exact"/>
               <w:ind w:left="165"/>
-              <w:rPr>
+              <w:jc w:val="center"/>
+              <w:rPr>
+                <w:color w:val="00B050"/>
                 <w:sz w:val="2"/>
               </w:rPr>
             </w:pPr>
             <w:r>
               <w:rPr>
                 <w:noProof/>
+                <w:color w:val="00B050"/>
                 <w:sz w:val="2"/>
               </w:rPr>
               <mc:AlternateContent>
@@ -12263,7 +12388,7 @@
                 </mc:Choice>
                 <mc:Fallback>
                   <w:pict>
-                    <v:group w14:anchorId="2C42AB56" id="Group 147" o:spid="_x0000_s1026" style="width:60.1pt;height:.6pt;mso-position-horizontal-relative:char;mso-position-vertical-relative:line" coordsize="7632,76" o:gfxdata="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">
+                    <v:group w14:anchorId="68D7A9B7" id="Group 147" o:spid="_x0000_s1026" style="width:60.1pt;height:.6pt;mso-position-horizontal-relative:char;mso-position-vertical-relative:line" coordsize="7632,76" o:gfxdata="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">
                       <v:shape id="Graphic 148" o:spid="_x0000_s1027" style="position:absolute;top:36;width:7632;height:12;visibility:visible;mso-wrap-style:square;v-text-anchor:top" coordsize="763270,1270" o:gfxdata="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" path="m,l762818,e" filled="f" strokecolor="#ccd3de" strokeweight=".20156mm">
                         <v:path arrowok="t"/>
                       </v:shape>
@@ -12290,23 +12415,35 @@
             <w:pPr>
               <w:pStyle w:val="TableParagraph"/>
               <w:spacing w:before="135"/>
-              <w:rPr>
+              <w:jc w:val="center"/>
+              <w:rPr>
+                <w:color w:val="00B050"/>
                 <w:sz w:val="20"/>
               </w:rPr>
             </w:pPr>
+            <w:r>
+              <w:rPr>
+                <w:color w:val="00B050"/>
+                <w:sz w:val="20"/>
+              </w:rPr>
+              <w:t>User Input</w:t>
+            </w:r>
           </w:p>
           <w:p>
             <w:pPr>
               <w:pStyle w:val="TableParagraph"/>
               <w:spacing w:line="20" w:lineRule="exact"/>
               <w:ind w:left="165"/>
-              <w:rPr>
+              <w:jc w:val="center"/>
+              <w:rPr>
+                <w:color w:val="00B050"/>
                 <w:sz w:val="2"/>
               </w:rPr>
             </w:pPr>
             <w:r>
               <w:rPr>
                 <w:noProof/>
+                <w:color w:val="00B050"/>
                 <w:sz w:val="2"/>
               </w:rPr>
               <mc:AlternateContent>
@@ -12380,7 +12517,7 @@
                 </mc:Choice>
                 <mc:Fallback>
                   <w:pict>
-                    <v:group w14:anchorId="747A06DD" id="Group 149" o:spid="_x0000_s1026" style="width:100.15pt;height:.6pt;mso-position-horizontal-relative:char;mso-position-vertical-relative:line" coordsize="12719,76" o:gfxdata="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">
+                    <v:group w14:anchorId="4FBC5542" id="Group 149" o:spid="_x0000_s1026" style="width:100.15pt;height:.6pt;mso-position-horizontal-relative:char;mso-position-vertical-relative:line" coordsize="12719,76" o:gfxdata="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">
                       <v:shape id="Graphic 150" o:spid="_x0000_s1027" style="position:absolute;top:36;width:12719;height:12;visibility:visible;mso-wrap-style:square;v-text-anchor:top" coordsize="1271905,1270" o:gfxdata="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" path="m,l1271364,e" filled="f" strokecolor="#ccd3de" strokeweight=".20156mm">
                         <v:path arrowok="t"/>
                       </v:shape>
@@ -12411,23 +12548,37 @@
             <w:pPr>
               <w:pStyle w:val="TableParagraph"/>
               <w:spacing w:before="135"/>
-              <w:rPr>
+              <w:jc w:val="center"/>
+              <w:rPr>
+                <w:color w:val="00B050"/>
                 <w:sz w:val="20"/>
               </w:rPr>
             </w:pPr>
+            <w:proofErr w:type="spellStart"/>
+            <w:r>
+              <w:rPr>
+                <w:color w:val="00B050"/>
+                <w:sz w:val="20"/>
+              </w:rPr>
+              <w:t>fineAmount</w:t>
+            </w:r>
+            <w:proofErr w:type="spellEnd"/>
           </w:p>
           <w:p>
             <w:pPr>
               <w:pStyle w:val="TableParagraph"/>
               <w:spacing w:line="20" w:lineRule="exact"/>
               <w:ind w:left="165"/>
-              <w:rPr>
+              <w:jc w:val="center"/>
+              <w:rPr>
+                <w:color w:val="00B050"/>
                 <w:sz w:val="2"/>
               </w:rPr>
             </w:pPr>
             <w:r>
               <w:rPr>
                 <w:noProof/>
+                <w:color w:val="00B050"/>
                 <w:sz w:val="2"/>
               </w:rPr>
               <mc:AlternateContent>
@@ -12501,7 +12652,7 @@
                 </mc:Choice>
                 <mc:Fallback>
                   <w:pict>
-                    <v:group w14:anchorId="354DCE16" id="Group 151" o:spid="_x0000_s1026" style="width:140.15pt;height:.6pt;mso-position-horizontal-relative:char;mso-position-vertical-relative:line" coordsize="17799,76" o:gfxdata="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">
+                    <v:group w14:anchorId="7A508165" id="Group 151" o:spid="_x0000_s1026" style="width:140.15pt;height:.6pt;mso-position-horizontal-relative:char;mso-position-vertical-relative:line" coordsize="17799,76" o:gfxdata="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">
                       <v:shape id="Graphic 152" o:spid="_x0000_s1027" style="position:absolute;top:36;width:17799;height:12;visibility:visible;mso-wrap-style:square;v-text-anchor:top" coordsize="1779905,1270" o:gfxdata="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" path="m,l1779910,e" filled="f" strokecolor="#ccd3de" strokeweight=".20156mm">
                         <v:path arrowok="t"/>
                       </v:shape>
@@ -12527,23 +12678,35 @@
             <w:pPr>
               <w:pStyle w:val="TableParagraph"/>
               <w:spacing w:before="135"/>
-              <w:rPr>
+              <w:jc w:val="center"/>
+              <w:rPr>
+                <w:color w:val="00B050"/>
                 <w:sz w:val="20"/>
               </w:rPr>
             </w:pPr>
+            <w:r>
+              <w:rPr>
+                <w:color w:val="00B050"/>
+                <w:sz w:val="20"/>
+              </w:rPr>
+              <w:t>double</w:t>
+            </w:r>
           </w:p>
           <w:p>
             <w:pPr>
               <w:pStyle w:val="TableParagraph"/>
               <w:spacing w:line="20" w:lineRule="exact"/>
               <w:ind w:left="165"/>
-              <w:rPr>
+              <w:jc w:val="center"/>
+              <w:rPr>
+                <w:color w:val="00B050"/>
                 <w:sz w:val="2"/>
               </w:rPr>
             </w:pPr>
             <w:r>
               <w:rPr>
                 <w:noProof/>
+                <w:color w:val="00B050"/>
                 <w:sz w:val="2"/>
               </w:rPr>
               <mc:AlternateContent>
@@ -12617,7 +12780,7 @@
                 </mc:Choice>
                 <mc:Fallback>
                   <w:pict>
-                    <v:group w14:anchorId="6627B1F1" id="Group 153" o:spid="_x0000_s1026" style="width:60.1pt;height:.6pt;mso-position-horizontal-relative:char;mso-position-vertical-relative:line" coordsize="7632,76" o:gfxdata="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">
+                    <v:group w14:anchorId="7D249C52" id="Group 153" o:spid="_x0000_s1026" style="width:60.1pt;height:.6pt;mso-position-horizontal-relative:char;mso-position-vertical-relative:line" coordsize="7632,76" o:gfxdata="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">
                       <v:shape id="Graphic 154" o:spid="_x0000_s1027" style="position:absolute;top:36;width:7632;height:12;visibility:visible;mso-wrap-style:square;v-text-anchor:top" coordsize="763270,1270" o:gfxdata="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" path="m,l762818,e" filled="f" strokecolor="#ccd3de" strokeweight=".20156mm">
                         <v:path arrowok="t"/>
                       </v:shape>
@@ -12643,23 +12806,35 @@
             <w:pPr>
               <w:pStyle w:val="TableParagraph"/>
               <w:spacing w:before="135"/>
-              <w:rPr>
+              <w:jc w:val="center"/>
+              <w:rPr>
+                <w:color w:val="00B050"/>
                 <w:sz w:val="20"/>
               </w:rPr>
             </w:pPr>
+            <w:r>
+              <w:rPr>
+                <w:color w:val="00B050"/>
+                <w:sz w:val="20"/>
+              </w:rPr>
+              <w:t>Calculated</w:t>
+            </w:r>
           </w:p>
           <w:p>
             <w:pPr>
               <w:pStyle w:val="TableParagraph"/>
               <w:spacing w:line="20" w:lineRule="exact"/>
               <w:ind w:left="165"/>
-              <w:rPr>
+              <w:jc w:val="center"/>
+              <w:rPr>
+                <w:color w:val="00B050"/>
                 <w:sz w:val="2"/>
               </w:rPr>
             </w:pPr>
             <w:r>
               <w:rPr>
                 <w:noProof/>
+                <w:color w:val="00B050"/>
                 <w:sz w:val="2"/>
               </w:rPr>
               <mc:AlternateContent>
@@ -12733,7 +12908,7 @@
                 </mc:Choice>
                 <mc:Fallback>
                   <w:pict>
-                    <v:group w14:anchorId="067361EE" id="Group 155" o:spid="_x0000_s1026" style="width:100.15pt;height:.6pt;mso-position-horizontal-relative:char;mso-position-vertical-relative:line" coordsize="12719,76" o:gfxdata="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">
+                    <v:group w14:anchorId="659BCEC3" id="Group 155" o:spid="_x0000_s1026" style="width:100.15pt;height:.6pt;mso-position-horizontal-relative:char;mso-position-vertical-relative:line" coordsize="12719,76" o:gfxdata="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">
                       <v:shape id="Graphic 156" o:spid="_x0000_s1027" style="position:absolute;top:36;width:12719;height:12;visibility:visible;mso-wrap-style:square;v-text-anchor:top" coordsize="1271905,1270" o:gfxdata="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" path="m,l1271364,e" filled="f" strokecolor="#ccd3de" strokeweight=".20156mm">
                         <v:path arrowok="t"/>
                       </v:shape>
@@ -13056,7 +13231,7 @@
                 </mc:Choice>
                 <mc:Fallback>
                   <w:pict>
-                    <v:group w14:anchorId="5F2D86C4" id="Group 157" o:spid="_x0000_s1026" style="width:140.15pt;height:.6pt;mso-position-horizontal-relative:char;mso-position-vertical-relative:line" coordsize="17799,76" o:gfxdata="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">
+                    <v:group w14:anchorId="16639C70" id="Group 157" o:spid="_x0000_s1026" style="width:140.15pt;height:.6pt;mso-position-horizontal-relative:char;mso-position-vertical-relative:line" coordsize="17799,76" o:gfxdata="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">
                       <v:shape id="Graphic 158" o:spid="_x0000_s1027" style="position:absolute;top:36;width:17799;height:12;visibility:visible;mso-wrap-style:square;v-text-anchor:top" coordsize="1779905,1270" o:gfxdata="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" path="m,l1779910,e" filled="f" strokecolor="#ccd3de" strokeweight=".20156mm">
                         <v:path arrowok="t"/>
                       </v:shape>
@@ -13172,7 +13347,7 @@
                 </mc:Choice>
                 <mc:Fallback>
                   <w:pict>
-                    <v:group w14:anchorId="7C4ABEF5" id="Group 159" o:spid="_x0000_s1026" style="width:60.1pt;height:.6pt;mso-position-horizontal-relative:char;mso-position-vertical-relative:line" coordsize="7632,76" o:gfxdata="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">
+                    <v:group w14:anchorId="4BFFECD4" id="Group 159" o:spid="_x0000_s1026" style="width:60.1pt;height:.6pt;mso-position-horizontal-relative:char;mso-position-vertical-relative:line" coordsize="7632,76" o:gfxdata="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">
                       <v:shape id="Graphic 160" o:spid="_x0000_s1027" style="position:absolute;top:36;width:7632;height:12;visibility:visible;mso-wrap-style:square;v-text-anchor:top" coordsize="763270,1270" o:gfxdata="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" path="m,l762818,e" filled="f" strokecolor="#ccd3de" strokeweight=".20156mm">
                         <v:path arrowok="t"/>
                       </v:shape>
@@ -13288,7 +13463,7 @@
                 </mc:Choice>
                 <mc:Fallback>
                   <w:pict>
-                    <v:group w14:anchorId="235CDAEF" id="Group 161" o:spid="_x0000_s1026" style="width:100.15pt;height:.6pt;mso-position-horizontal-relative:char;mso-position-vertical-relative:line" coordsize="12719,76" o:gfxdata="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">
+                    <v:group w14:anchorId="1179179F" id="Group 161" o:spid="_x0000_s1026" style="width:100.15pt;height:.6pt;mso-position-horizontal-relative:char;mso-position-vertical-relative:line" coordsize="12719,76" o:gfxdata="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">
                       <v:shape id="Graphic 162" o:spid="_x0000_s1027" style="position:absolute;top:36;width:12719;height:12;visibility:visible;mso-wrap-style:square;v-text-anchor:top" coordsize="1271905,1270" o:gfxdata="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" path="m,l1271364,e" filled="f" strokecolor="#ccd3de" strokeweight=".20156mm">
                         <v:path arrowok="t"/>
                       </v:shape>
@@ -13410,7 +13585,7 @@
                 </mc:Choice>
                 <mc:Fallback>
                   <w:pict>
-                    <v:group w14:anchorId="0B5B7C34" id="Group 163" o:spid="_x0000_s1026" style="width:140.15pt;height:.6pt;mso-position-horizontal-relative:char;mso-position-vertical-relative:line" coordsize="17799,76" o:gfxdata="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">
+                    <v:group w14:anchorId="227ACAEF" id="Group 163" o:spid="_x0000_s1026" style="width:140.15pt;height:.6pt;mso-position-horizontal-relative:char;mso-position-vertical-relative:line" coordsize="17799,76" o:gfxdata="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">
                       <v:shape id="Graphic 164" o:spid="_x0000_s1027" style="position:absolute;top:36;width:17799;height:12;visibility:visible;mso-wrap-style:square;v-text-anchor:top" coordsize="1779905,1270" o:gfxdata="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" path="m,l1779910,e" filled="f" strokecolor="#ccd3de" strokeweight=".20156mm">
                         <v:path arrowok="t"/>
                       </v:shape>
@@ -13527,7 +13702,7 @@
                 </mc:Choice>
                 <mc:Fallback>
                   <w:pict>
-                    <v:group w14:anchorId="7C41EB7A" id="Group 165" o:spid="_x0000_s1026" style="width:60.1pt;height:.6pt;mso-position-horizontal-relative:char;mso-position-vertical-relative:line" coordsize="7632,76" o:gfxdata="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">
+                    <v:group w14:anchorId="782C2D24" id="Group 165" o:spid="_x0000_s1026" style="width:60.1pt;height:.6pt;mso-position-horizontal-relative:char;mso-position-vertical-relative:line" coordsize="7632,76" o:gfxdata="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">
                       <v:shape id="Graphic 166" o:spid="_x0000_s1027" style="position:absolute;top:36;width:7632;height:12;visibility:visible;mso-wrap-style:square;v-text-anchor:top" coordsize="763270,1270" o:gfxdata="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" path="m,l762818,e" filled="f" strokecolor="#ccd3de" strokeweight=".20156mm">
                         <v:path arrowok="t"/>
                       </v:shape>
@@ -13644,7 +13819,7 @@
                 </mc:Choice>
                 <mc:Fallback>
                   <w:pict>
-                    <v:group w14:anchorId="0F20B711" id="Group 167" o:spid="_x0000_s1026" style="width:100.15pt;height:.6pt;mso-position-horizontal-relative:char;mso-position-vertical-relative:line" coordsize="12719,76" o:gfxdata="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">
+                    <v:group w14:anchorId="1F4F0430" id="Group 167" o:spid="_x0000_s1026" style="width:100.15pt;height:.6pt;mso-position-horizontal-relative:char;mso-position-vertical-relative:line" coordsize="12719,76" o:gfxdata="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">
                       <v:shape id="Graphic 168" o:spid="_x0000_s1027" style="position:absolute;top:36;width:12719;height:12;visibility:visible;mso-wrap-style:square;v-text-anchor:top" coordsize="1271905,1270" o:gfxdata="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" path="m,l1271364,e" filled="f" strokecolor="#ccd3de" strokeweight=".20156mm">
                         <v:path arrowok="t"/>
                       </v:shape>
@@ -13765,7 +13940,7 @@
                 </mc:Choice>
                 <mc:Fallback>
                   <w:pict>
-                    <v:group w14:anchorId="1633A605" id="Group 169" o:spid="_x0000_s1026" style="width:140.15pt;height:.6pt;mso-position-horizontal-relative:char;mso-position-vertical-relative:line" coordsize="17799,76" o:gfxdata="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">
+                    <v:group w14:anchorId="56628BA8" id="Group 169" o:spid="_x0000_s1026" style="width:140.15pt;height:.6pt;mso-position-horizontal-relative:char;mso-position-vertical-relative:line" coordsize="17799,76" o:gfxdata="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">
                       <v:shape id="Graphic 170" o:spid="_x0000_s1027" style="position:absolute;top:36;width:17799;height:12;visibility:visible;mso-wrap-style:square;v-text-anchor:top" coordsize="1779905,1270" o:gfxdata="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" path="m,l1779910,e" filled="f" strokecolor="#ccd3de" strokeweight=".20156mm">
                         <v:path arrowok="t"/>
                       </v:shape>
@@ -13881,7 +14056,7 @@
                 </mc:Choice>
                 <mc:Fallback>
                   <w:pict>
-                    <v:group w14:anchorId="702EFFC0" id="Group 171" o:spid="_x0000_s1026" style="width:60.1pt;height:.6pt;mso-position-horizontal-relative:char;mso-position-vertical-relative:line" coordsize="7632,76" o:gfxdata="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">
+                    <v:group w14:anchorId="3318B099" id="Group 171" o:spid="_x0000_s1026" style="width:60.1pt;height:.6pt;mso-position-horizontal-relative:char;mso-position-vertical-relative:line" coordsize="7632,76" o:gfxdata="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">
                       <v:shape id="Graphic 172" o:spid="_x0000_s1027" style="position:absolute;top:36;width:7632;height:12;visibility:visible;mso-wrap-style:square;v-text-anchor:top" coordsize="763270,1270" o:gfxdata="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" path="m,l762818,e" filled="f" strokecolor="#ccd3de" strokeweight=".20156mm">
                         <v:path arrowok="t"/>
                       </v:shape>
@@ -13997,7 +14172,7 @@
                 </mc:Choice>
                 <mc:Fallback>
                   <w:pict>
-                    <v:group w14:anchorId="53112C15" id="Group 173" o:spid="_x0000_s1026" style="width:100.15pt;height:.6pt;mso-position-horizontal-relative:char;mso-position-vertical-relative:line" coordsize="12719,76" o:gfxdata="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">
+                    <v:group w14:anchorId="3027F13E" id="Group 173" o:spid="_x0000_s1026" style="width:100.15pt;height:.6pt;mso-position-horizontal-relative:char;mso-position-vertical-relative:line" coordsize="12719,76" o:gfxdata="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">
                       <v:shape id="Graphic 174" o:spid="_x0000_s1027" style="position:absolute;top:36;width:12719;height:12;visibility:visible;mso-wrap-style:square;v-text-anchor:top" coordsize="1271905,1270" o:gfxdata="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" path="m,l1271364,e" filled="f" strokecolor="#ccd3de" strokeweight=".20156mm">
                         <v:path arrowok="t"/>
                       </v:shape>
@@ -14119,7 +14294,7 @@
                 </mc:Choice>
                 <mc:Fallback>
                   <w:pict>
-                    <v:group w14:anchorId="63D380CC" id="Group 175" o:spid="_x0000_s1026" style="width:140.15pt;height:.6pt;mso-position-horizontal-relative:char;mso-position-vertical-relative:line" coordsize="17799,76" o:gfxdata="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">
+                    <v:group w14:anchorId="21862AEF" id="Group 175" o:spid="_x0000_s1026" style="width:140.15pt;height:.6pt;mso-position-horizontal-relative:char;mso-position-vertical-relative:line" coordsize="17799,76" o:gfxdata="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">
                       <v:shape id="Graphic 176" o:spid="_x0000_s1027" style="position:absolute;top:36;width:17799;height:12;visibility:visible;mso-wrap-style:square;v-text-anchor:top" coordsize="1779905,1270" o:gfxdata="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" path="m,l1779910,e" filled="f" strokecolor="#ccd3de" strokeweight=".20156mm">
                         <v:path arrowok="t"/>
                       </v:shape>
@@ -14236,7 +14411,7 @@
                 </mc:Choice>
                 <mc:Fallback>
                   <w:pict>
-                    <v:group w14:anchorId="29641C06" id="Group 177" o:spid="_x0000_s1026" style="width:60.1pt;height:.6pt;mso-position-horizontal-relative:char;mso-position-vertical-relative:line" coordsize="7632,76" o:gfxdata="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">
+                    <v:group w14:anchorId="2FEEBFDD" id="Group 177" o:spid="_x0000_s1026" style="width:60.1pt;height:.6pt;mso-position-horizontal-relative:char;mso-position-vertical-relative:line" coordsize="7632,76" o:gfxdata="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">
                       <v:shape id="Graphic 178" o:spid="_x0000_s1027" style="position:absolute;top:36;width:7632;height:12;visibility:visible;mso-wrap-style:square;v-text-anchor:top" coordsize="763270,1270" o:gfxdata="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" path="m,l762818,e" filled="f" strokecolor="#ccd3de" strokeweight=".20156mm">
                         <v:path arrowok="t"/>
                       </v:shape>
@@ -14353,7 +14528,7 @@
                 </mc:Choice>
                 <mc:Fallback>
                   <w:pict>
-                    <v:group w14:anchorId="6128D282" id="Group 179" o:spid="_x0000_s1026" style="width:100.15pt;height:.6pt;mso-position-horizontal-relative:char;mso-position-vertical-relative:line" coordsize="12719,76" o:gfxdata="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">
+                    <v:group w14:anchorId="29585BD0" id="Group 179" o:spid="_x0000_s1026" style="width:100.15pt;height:.6pt;mso-position-horizontal-relative:char;mso-position-vertical-relative:line" coordsize="12719,76" o:gfxdata="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">
                       <v:shape id="Graphic 180" o:spid="_x0000_s1027" style="position:absolute;top:36;width:12719;height:12;visibility:visible;mso-wrap-style:square;v-text-anchor:top" coordsize="1271905,1270" o:gfxdata="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" path="m,l1271364,e" filled="f" strokecolor="#ccd3de" strokeweight=".20156mm">
                         <v:path arrowok="t"/>
                       </v:shape>
@@ -14474,7 +14649,7 @@
                 </mc:Choice>
                 <mc:Fallback>
                   <w:pict>
-                    <v:group w14:anchorId="7ABFF3B7" id="Group 181" o:spid="_x0000_s1026" style="width:140.15pt;height:.6pt;mso-position-horizontal-relative:char;mso-position-vertical-relative:line" coordsize="17799,76" o:gfxdata="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">
+                    <v:group w14:anchorId="5E3E350A" id="Group 181" o:spid="_x0000_s1026" style="width:140.15pt;height:.6pt;mso-position-horizontal-relative:char;mso-position-vertical-relative:line" coordsize="17799,76" o:gfxdata="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">
                       <v:shape id="Graphic 182" o:spid="_x0000_s1027" style="position:absolute;top:36;width:17799;height:12;visibility:visible;mso-wrap-style:square;v-text-anchor:top" coordsize="1779905,1270" o:gfxdata="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" path="m,l1779910,e" filled="f" strokecolor="#ccd3de" strokeweight=".20156mm">
                         <v:path arrowok="t"/>
                       </v:shape>
@@ -14590,7 +14765,7 @@
                 </mc:Choice>
                 <mc:Fallback>
                   <w:pict>
-                    <v:group w14:anchorId="02AFCC1E" id="Group 183" o:spid="_x0000_s1026" style="width:60.1pt;height:.6pt;mso-position-horizontal-relative:char;mso-position-vertical-relative:line" coordsize="7632,76" o:gfxdata="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">
+                    <v:group w14:anchorId="1DDA1071" id="Group 183" o:spid="_x0000_s1026" style="width:60.1pt;height:.6pt;mso-position-horizontal-relative:char;mso-position-vertical-relative:line" coordsize="7632,76" o:gfxdata="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">
                       <v:shape id="Graphic 184" o:spid="_x0000_s1027" style="position:absolute;top:36;width:7632;height:12;visibility:visible;mso-wrap-style:square;v-text-anchor:top" coordsize="763270,1270" o:gfxdata="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" path="m,l762818,e" filled="f" strokecolor="#ccd3de" strokeweight=".20156mm">
                         <v:path arrowok="t"/>
                       </v:shape>
@@ -14706,7 +14881,7 @@
                 </mc:Choice>
                 <mc:Fallback>
                   <w:pict>
-                    <v:group w14:anchorId="7AC57293" id="Group 185" o:spid="_x0000_s1026" style="width:100.15pt;height:.6pt;mso-position-horizontal-relative:char;mso-position-vertical-relative:line" coordsize="12719,76" o:gfxdata="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">
+                    <v:group w14:anchorId="38339BD6" id="Group 185" o:spid="_x0000_s1026" style="width:100.15pt;height:.6pt;mso-position-horizontal-relative:char;mso-position-vertical-relative:line" coordsize="12719,76" o:gfxdata="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">
                       <v:shape id="Graphic 186" o:spid="_x0000_s1027" style="position:absolute;top:36;width:12719;height:12;visibility:visible;mso-wrap-style:square;v-text-anchor:top" coordsize="1271905,1270" o:gfxdata="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" path="m,l1271364,e" filled="f" strokecolor="#ccd3de" strokeweight=".20156mm">
                         <v:path arrowok="t"/>
                       </v:shape>
@@ -14828,7 +15003,7 @@
                 </mc:Choice>
                 <mc:Fallback>
                   <w:pict>
-                    <v:group w14:anchorId="1E804250" id="Group 187" o:spid="_x0000_s1026" style="width:140.15pt;height:.6pt;mso-position-horizontal-relative:char;mso-position-vertical-relative:line" coordsize="17799,76" o:gfxdata="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">
+                    <v:group w14:anchorId="1E2DA98D" id="Group 187" o:spid="_x0000_s1026" style="width:140.15pt;height:.6pt;mso-position-horizontal-relative:char;mso-position-vertical-relative:line" coordsize="17799,76" o:gfxdata="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">
                       <v:shape id="Graphic 188" o:spid="_x0000_s1027" style="position:absolute;top:36;width:17799;height:12;visibility:visible;mso-wrap-style:square;v-text-anchor:top" coordsize="1779905,1270" o:gfxdata="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" path="m,l1779910,e" filled="f" strokecolor="#ccd3de" strokeweight=".20156mm">
                         <v:path arrowok="t"/>
                       </v:shape>
@@ -14945,7 +15120,7 @@
                 </mc:Choice>
                 <mc:Fallback>
                   <w:pict>
-                    <v:group w14:anchorId="1F8A36EF" id="Group 189" o:spid="_x0000_s1026" style="width:60.1pt;height:.6pt;mso-position-horizontal-relative:char;mso-position-vertical-relative:line" coordsize="7632,76" o:gfxdata="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">
+                    <v:group w14:anchorId="18E6CC3D" id="Group 189" o:spid="_x0000_s1026" style="width:60.1pt;height:.6pt;mso-position-horizontal-relative:char;mso-position-vertical-relative:line" coordsize="7632,76" o:gfxdata="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">
                       <v:shape id="Graphic 190" o:spid="_x0000_s1027" style="position:absolute;top:36;width:7632;height:12;visibility:visible;mso-wrap-style:square;v-text-anchor:top" coordsize="763270,1270" o:gfxdata="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" path="m,l762818,e" filled="f" strokecolor="#ccd3de" strokeweight=".20156mm">
                         <v:path arrowok="t"/>
                       </v:shape>
@@ -15062,7 +15237,7 @@
                 </mc:Choice>
                 <mc:Fallback>
                   <w:pict>
-                    <v:group w14:anchorId="7F059CD3" id="Group 191" o:spid="_x0000_s1026" style="width:100.15pt;height:.6pt;mso-position-horizontal-relative:char;mso-position-vertical-relative:line" coordsize="12719,76" o:gfxdata="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">
+                    <v:group w14:anchorId="4841C6BB" id="Group 191" o:spid="_x0000_s1026" style="width:100.15pt;height:.6pt;mso-position-horizontal-relative:char;mso-position-vertical-relative:line" coordsize="12719,76" o:gfxdata="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">
                       <v:shape id="Graphic 192" o:spid="_x0000_s1027" style="position:absolute;top:36;width:12719;height:12;visibility:visible;mso-wrap-style:square;v-text-anchor:top" coordsize="1271905,1270" o:gfxdata="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" path="m,l1271364,e" filled="f" strokecolor="#ccd3de" strokeweight=".20156mm">
                         <v:path arrowok="t"/>
                       </v:shape>
@@ -15183,7 +15358,7 @@
                 </mc:Choice>
                 <mc:Fallback>
                   <w:pict>
-                    <v:group w14:anchorId="4B308349" id="Group 193" o:spid="_x0000_s1026" style="width:140.15pt;height:.6pt;mso-position-horizontal-relative:char;mso-position-vertical-relative:line" coordsize="17799,76" o:gfxdata="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">
+                    <v:group w14:anchorId="3C8314A7" id="Group 193" o:spid="_x0000_s1026" style="width:140.15pt;height:.6pt;mso-position-horizontal-relative:char;mso-position-vertical-relative:line" coordsize="17799,76" o:gfxdata="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">
                       <v:shape id="Graphic 194" o:spid="_x0000_s1027" style="position:absolute;top:36;width:17799;height:12;visibility:visible;mso-wrap-style:square;v-text-anchor:top" coordsize="1779905,1270" o:gfxdata="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" path="m,l1779910,e" filled="f" strokecolor="#ccd3de" strokeweight=".20156mm">
                         <v:path arrowok="t"/>
                       </v:shape>
@@ -15299,7 +15474,7 @@
                 </mc:Choice>
                 <mc:Fallback>
                   <w:pict>
-                    <v:group w14:anchorId="2788BA86" id="Group 195" o:spid="_x0000_s1026" style="width:60.1pt;height:.6pt;mso-position-horizontal-relative:char;mso-position-vertical-relative:line" coordsize="7632,76" o:gfxdata="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">
+                    <v:group w14:anchorId="23702083" id="Group 195" o:spid="_x0000_s1026" style="width:60.1pt;height:.6pt;mso-position-horizontal-relative:char;mso-position-vertical-relative:line" coordsize="7632,76" o:gfxdata="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">
                       <v:shape id="Graphic 196" o:spid="_x0000_s1027" style="position:absolute;top:36;width:7632;height:12;visibility:visible;mso-wrap-style:square;v-text-anchor:top" coordsize="763270,1270" o:gfxdata="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" path="m,l762818,e" filled="f" strokecolor="#ccd3de" strokeweight=".20156mm">
                         <v:path arrowok="t"/>
                       </v:shape>
@@ -15415,7 +15590,7 @@
                 </mc:Choice>
                 <mc:Fallback>
                   <w:pict>
-                    <v:group w14:anchorId="5D86681B" id="Group 197" o:spid="_x0000_s1026" style="width:100.15pt;height:.6pt;mso-position-horizontal-relative:char;mso-position-vertical-relative:line" coordsize="12719,76" o:gfxdata="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">
+                    <v:group w14:anchorId="67BBAE86" id="Group 197" o:spid="_x0000_s1026" style="width:100.15pt;height:.6pt;mso-position-horizontal-relative:char;mso-position-vertical-relative:line" coordsize="12719,76" o:gfxdata="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">
                       <v:shape id="Graphic 198" o:spid="_x0000_s1027" style="position:absolute;top:36;width:12719;height:12;visibility:visible;mso-wrap-style:square;v-text-anchor:top" coordsize="1271905,1270" o:gfxdata="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" path="m,l1271364,e" filled="f" strokecolor="#ccd3de" strokeweight=".20156mm">
                         <v:path arrowok="t"/>
                       </v:shape>
@@ -15502,25 +15677,7 @@
                                 <w:color w:val="596475"/>
                                 <w:sz w:val="18"/>
                               </w:rPr>
-                              <w:t xml:space="preserve">If you identify more than 4 entities, </w:t>
-                            </w:r>
-                            <w:proofErr w:type="gramStart"/>
-                            <w:r>
-                              <w:rPr>
-                                <w:i/>
-                                <w:color w:val="596475"/>
-                                <w:sz w:val="18"/>
-                              </w:rPr>
-                              <w:t>continue on</w:t>
-                            </w:r>
-                            <w:proofErr w:type="gramEnd"/>
-                            <w:r>
-                              <w:rPr>
-                                <w:i/>
-                                <w:color w:val="596475"/>
-                                <w:sz w:val="18"/>
-                              </w:rPr>
-                              <w:t xml:space="preserve"> the back of this sheet or add extra rows </w:t>
+                              <w:t xml:space="preserve">If you identify more than 4 entities, continue on the back of this sheet or add extra rows </w:t>
                             </w:r>
                             <w:r>
                               <w:rPr>
@@ -15565,25 +15722,7 @@
                           <w:color w:val="596475"/>
                           <w:sz w:val="18"/>
                         </w:rPr>
-                        <w:t xml:space="preserve">If you identify more than 4 entities, </w:t>
-                      </w:r>
-                      <w:proofErr w:type="gramStart"/>
-                      <w:r>
-                        <w:rPr>
-                          <w:i/>
-                          <w:color w:val="596475"/>
-                          <w:sz w:val="18"/>
-                        </w:rPr>
-                        <w:t>continue on</w:t>
-                      </w:r>
-                      <w:proofErr w:type="gramEnd"/>
-                      <w:r>
-                        <w:rPr>
-                          <w:i/>
-                          <w:color w:val="596475"/>
-                          <w:sz w:val="18"/>
-                        </w:rPr>
-                        <w:t xml:space="preserve"> the back of this sheet or add extra rows </w:t>
+                        <w:t xml:space="preserve">If you identify more than 4 entities, continue on the back of this sheet or add extra rows </w:t>
                       </w:r>
                       <w:r>
                         <w:rPr>
@@ -15618,21 +15757,7 @@
         <w:rPr>
           <w:color w:val="1A1A2D"/>
         </w:rPr>
-        <w:t xml:space="preserve">Step 2 — Describe </w:t>
-      </w:r>
-      <w:proofErr w:type="gramStart"/>
-      <w:r>
-        <w:rPr>
-          <w:color w:val="1A1A2D"/>
-        </w:rPr>
-        <w:t>the Entity</w:t>
-      </w:r>
-      <w:proofErr w:type="gramEnd"/>
-      <w:r>
-        <w:rPr>
-          <w:color w:val="1A1A2D"/>
-        </w:rPr>
-        <w:t xml:space="preserve"> Relationships (Phase 1 </w:t>
+        <w:t xml:space="preserve">Step 2 — Describe the Entity Relationships (Phase 1 </w:t>
       </w:r>
       <w:r>
         <w:rPr>
@@ -16299,7 +16424,7 @@
                 </mc:Choice>
                 <mc:Fallback>
                   <w:pict>
-                    <v:group w14:anchorId="0082464E" id="Group 201" o:spid="_x0000_s1026" style="width:140.15pt;height:.6pt;mso-position-horizontal-relative:char;mso-position-vertical-relative:line" coordsize="17799,76" o:gfxdata="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">
+                    <v:group w14:anchorId="78491E20" id="Group 201" o:spid="_x0000_s1026" style="width:140.15pt;height:.6pt;mso-position-horizontal-relative:char;mso-position-vertical-relative:line" coordsize="17799,76" o:gfxdata="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">
                       <v:shape id="Graphic 202" o:spid="_x0000_s1027" style="position:absolute;top:36;width:17799;height:12;visibility:visible;mso-wrap-style:square;v-text-anchor:top" coordsize="1779905,1270" o:gfxdata="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" path="m,l1779910,e" filled="f" strokecolor="#ccd3de" strokeweight=".20156mm">
                         <v:path arrowok="t"/>
                       </v:shape>
@@ -16409,7 +16534,7 @@
                 </mc:Choice>
                 <mc:Fallback>
                   <w:pict>
-                    <v:group w14:anchorId="5EA33CF8" id="Group 203" o:spid="_x0000_s1026" style="width:240.3pt;height:.6pt;mso-position-horizontal-relative:char;mso-position-vertical-relative:line" coordsize="30518,76" o:gfxdata="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">
+                    <v:group w14:anchorId="4A607591" id="Group 203" o:spid="_x0000_s1026" style="width:240.3pt;height:.6pt;mso-position-horizontal-relative:char;mso-position-vertical-relative:line" coordsize="30518,76" o:gfxdata="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">
                       <v:shape id="Graphic 204" o:spid="_x0000_s1027" style="position:absolute;top:36;width:30518;height:12;visibility:visible;mso-wrap-style:square;v-text-anchor:top" coordsize="3051810,1270" o:gfxdata="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" path="m,l3051274,e" filled="f" strokecolor="#ccd3de" strokeweight=".20156mm">
                         <v:path arrowok="t"/>
                       </v:shape>
@@ -16550,7 +16675,7 @@
                 </mc:Choice>
                 <mc:Fallback>
                   <w:pict>
-                    <v:group w14:anchorId="46EA48D1" id="Group 205" o:spid="_x0000_s1026" style="width:140.15pt;height:.6pt;mso-position-horizontal-relative:char;mso-position-vertical-relative:line" coordsize="17799,76" o:gfxdata="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">
+                    <v:group w14:anchorId="2B94270A" id="Group 205" o:spid="_x0000_s1026" style="width:140.15pt;height:.6pt;mso-position-horizontal-relative:char;mso-position-vertical-relative:line" coordsize="17799,76" o:gfxdata="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">
                       <v:shape id="Graphic 206" o:spid="_x0000_s1027" style="position:absolute;top:36;width:17799;height:12;visibility:visible;mso-wrap-style:square;v-text-anchor:top" coordsize="1779905,1270" o:gfxdata="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" path="m,l1779910,e" filled="f" strokecolor="#ccd3de" strokeweight=".20156mm">
                         <v:path arrowok="t"/>
                       </v:shape>
@@ -16661,7 +16786,7 @@
                 </mc:Choice>
                 <mc:Fallback>
                   <w:pict>
-                    <v:group w14:anchorId="7EE7BF8E" id="Group 207" o:spid="_x0000_s1026" style="width:240.3pt;height:.6pt;mso-position-horizontal-relative:char;mso-position-vertical-relative:line" coordsize="30518,76" o:gfxdata="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">
+                    <v:group w14:anchorId="260A0FBB" id="Group 207" o:spid="_x0000_s1026" style="width:240.3pt;height:.6pt;mso-position-horizontal-relative:char;mso-position-vertical-relative:line" coordsize="30518,76" o:gfxdata="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">
                       <v:shape id="Graphic 208" o:spid="_x0000_s1027" style="position:absolute;top:36;width:30518;height:12;visibility:visible;mso-wrap-style:square;v-text-anchor:top" coordsize="3051810,1270" o:gfxdata="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" path="m,l3051274,e" filled="f" strokecolor="#ccd3de" strokeweight=".20156mm">
                         <v:path arrowok="t"/>
                       </v:shape>
@@ -16800,7 +16925,7 @@
                 </mc:Choice>
                 <mc:Fallback>
                   <w:pict>
-                    <v:group w14:anchorId="46894A31" id="Group 209" o:spid="_x0000_s1026" style="width:140.15pt;height:.6pt;mso-position-horizontal-relative:char;mso-position-vertical-relative:line" coordsize="17799,76" o:gfxdata="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">
+                    <v:group w14:anchorId="48FD8063" id="Group 209" o:spid="_x0000_s1026" style="width:140.15pt;height:.6pt;mso-position-horizontal-relative:char;mso-position-vertical-relative:line" coordsize="17799,76" o:gfxdata="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">
                       <v:shape id="Graphic 210" o:spid="_x0000_s1027" style="position:absolute;top:36;width:17799;height:12;visibility:visible;mso-wrap-style:square;v-text-anchor:top" coordsize="1779905,1270" o:gfxdata="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" path="m,l1779910,e" filled="f" strokecolor="#ccd3de" strokeweight=".20156mm">
                         <v:path arrowok="t"/>
                       </v:shape>
@@ -16910,7 +17035,7 @@
                 </mc:Choice>
                 <mc:Fallback>
                   <w:pict>
-                    <v:group w14:anchorId="12ED66F9" id="Group 211" o:spid="_x0000_s1026" style="width:240.3pt;height:.6pt;mso-position-horizontal-relative:char;mso-position-vertical-relative:line" coordsize="30518,76" o:gfxdata="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">
+                    <v:group w14:anchorId="7FEAC639" id="Group 211" o:spid="_x0000_s1026" style="width:240.3pt;height:.6pt;mso-position-horizontal-relative:char;mso-position-vertical-relative:line" coordsize="30518,76" o:gfxdata="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">
                       <v:shape id="Graphic 212" o:spid="_x0000_s1027" style="position:absolute;top:36;width:30518;height:12;visibility:visible;mso-wrap-style:square;v-text-anchor:top" coordsize="3051810,1270" o:gfxdata="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" path="m,l3051274,e" filled="f" strokecolor="#ccd3de" strokeweight=".20156mm">
                         <v:path arrowok="t"/>
                       </v:shape>
@@ -17051,7 +17176,7 @@
                 </mc:Choice>
                 <mc:Fallback>
                   <w:pict>
-                    <v:group w14:anchorId="133F4968" id="Group 213" o:spid="_x0000_s1026" style="width:140.15pt;height:.6pt;mso-position-horizontal-relative:char;mso-position-vertical-relative:line" coordsize="17799,76" o:gfxdata="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">
+                    <v:group w14:anchorId="44EACB57" id="Group 213" o:spid="_x0000_s1026" style="width:140.15pt;height:.6pt;mso-position-horizontal-relative:char;mso-position-vertical-relative:line" coordsize="17799,76" o:gfxdata="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">
                       <v:shape id="Graphic 214" o:spid="_x0000_s1027" style="position:absolute;top:36;width:17799;height:12;visibility:visible;mso-wrap-style:square;v-text-anchor:top" coordsize="1779905,1270" o:gfxdata="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" path="m,l1779910,e" filled="f" strokecolor="#ccd3de" strokeweight=".20156mm">
                         <v:path arrowok="t"/>
                       </v:shape>
@@ -17162,7 +17287,7 @@
                 </mc:Choice>
                 <mc:Fallback>
                   <w:pict>
-                    <v:group w14:anchorId="502B8AD3" id="Group 215" o:spid="_x0000_s1026" style="width:240.3pt;height:.6pt;mso-position-horizontal-relative:char;mso-position-vertical-relative:line" coordsize="30518,76" o:gfxdata="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">
+                    <v:group w14:anchorId="0E49D283" id="Group 215" o:spid="_x0000_s1026" style="width:240.3pt;height:.6pt;mso-position-horizontal-relative:char;mso-position-vertical-relative:line" coordsize="30518,76" o:gfxdata="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">
                       <v:shape id="Graphic 216" o:spid="_x0000_s1027" style="position:absolute;top:36;width:30518;height:12;visibility:visible;mso-wrap-style:square;v-text-anchor:top" coordsize="3051810,1270" o:gfxdata="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" path="m,l3051274,e" filled="f" strokecolor="#ccd3de" strokeweight=".20156mm">
                         <v:path arrowok="t"/>
                       </v:shape>
@@ -17301,7 +17426,7 @@
                 </mc:Choice>
                 <mc:Fallback>
                   <w:pict>
-                    <v:group w14:anchorId="3BE8E89D" id="Group 217" o:spid="_x0000_s1026" style="width:140.15pt;height:.6pt;mso-position-horizontal-relative:char;mso-position-vertical-relative:line" coordsize="17799,76" o:gfxdata="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">
+                    <v:group w14:anchorId="3FDF75EA" id="Group 217" o:spid="_x0000_s1026" style="width:140.15pt;height:.6pt;mso-position-horizontal-relative:char;mso-position-vertical-relative:line" coordsize="17799,76" o:gfxdata="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">
                       <v:shape id="Graphic 218" o:spid="_x0000_s1027" style="position:absolute;top:36;width:17799;height:12;visibility:visible;mso-wrap-style:square;v-text-anchor:top" coordsize="1779905,1270" o:gfxdata="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" path="m,l1779910,e" filled="f" strokecolor="#ccd3de" strokeweight=".20156mm">
                         <v:path arrowok="t"/>
                       </v:shape>
@@ -17411,7 +17536,7 @@
                 </mc:Choice>
                 <mc:Fallback>
                   <w:pict>
-                    <v:group w14:anchorId="097C5D46" id="Group 219" o:spid="_x0000_s1026" style="width:240.3pt;height:.6pt;mso-position-horizontal-relative:char;mso-position-vertical-relative:line" coordsize="30518,76" o:gfxdata="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">
+                    <v:group w14:anchorId="519BC7D8" id="Group 219" o:spid="_x0000_s1026" style="width:240.3pt;height:.6pt;mso-position-horizontal-relative:char;mso-position-vertical-relative:line" coordsize="30518,76" o:gfxdata="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">
                       <v:shape id="Graphic 220" o:spid="_x0000_s1027" style="position:absolute;top:36;width:30518;height:12;visibility:visible;mso-wrap-style:square;v-text-anchor:top" coordsize="3051810,1270" o:gfxdata="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" path="m,l3051274,e" filled="f" strokecolor="#ccd3de" strokeweight=".20156mm">
                         <v:path arrowok="t"/>
                       </v:shape>
@@ -17552,7 +17677,7 @@
                 </mc:Choice>
                 <mc:Fallback>
                   <w:pict>
-                    <v:group w14:anchorId="28A4E8B6" id="Group 221" o:spid="_x0000_s1026" style="width:140.15pt;height:.6pt;mso-position-horizontal-relative:char;mso-position-vertical-relative:line" coordsize="17799,76" o:gfxdata="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">
+                    <v:group w14:anchorId="4C6212B6" id="Group 221" o:spid="_x0000_s1026" style="width:140.15pt;height:.6pt;mso-position-horizontal-relative:char;mso-position-vertical-relative:line" coordsize="17799,76" o:gfxdata="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">
                       <v:shape id="Graphic 222" o:spid="_x0000_s1027" style="position:absolute;top:36;width:17799;height:12;visibility:visible;mso-wrap-style:square;v-text-anchor:top" coordsize="1779905,1270" o:gfxdata="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" path="m,l1779910,e" filled="f" strokecolor="#ccd3de" strokeweight=".20156mm">
                         <v:path arrowok="t"/>
                       </v:shape>
@@ -17663,7 +17788,7 @@
                 </mc:Choice>
                 <mc:Fallback>
                   <w:pict>
-                    <v:group w14:anchorId="3D2015E1" id="Group 223" o:spid="_x0000_s1026" style="width:240.3pt;height:.6pt;mso-position-horizontal-relative:char;mso-position-vertical-relative:line" coordsize="30518,76" o:gfxdata="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">
+                    <v:group w14:anchorId="440F71DD" id="Group 223" o:spid="_x0000_s1026" style="width:240.3pt;height:.6pt;mso-position-horizontal-relative:char;mso-position-vertical-relative:line" coordsize="30518,76" o:gfxdata="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">
                       <v:shape id="Graphic 224" o:spid="_x0000_s1027" style="position:absolute;top:36;width:30518;height:12;visibility:visible;mso-wrap-style:square;v-text-anchor:top" coordsize="3051810,1270" o:gfxdata="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" path="m,l3051274,e" filled="f" strokecolor="#ccd3de" strokeweight=".20156mm">
                         <v:path arrowok="t"/>
                       </v:shape>
@@ -17802,7 +17927,7 @@
                 </mc:Choice>
                 <mc:Fallback>
                   <w:pict>
-                    <v:group w14:anchorId="209E6469" id="Group 225" o:spid="_x0000_s1026" style="width:140.15pt;height:.6pt;mso-position-horizontal-relative:char;mso-position-vertical-relative:line" coordsize="17799,76" o:gfxdata="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">
+                    <v:group w14:anchorId="7B648490" id="Group 225" o:spid="_x0000_s1026" style="width:140.15pt;height:.6pt;mso-position-horizontal-relative:char;mso-position-vertical-relative:line" coordsize="17799,76" o:gfxdata="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">
                       <v:shape id="Graphic 226" o:spid="_x0000_s1027" style="position:absolute;top:36;width:17799;height:12;visibility:visible;mso-wrap-style:square;v-text-anchor:top" coordsize="1779905,1270" o:gfxdata="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" path="m,l1779910,e" filled="f" strokecolor="#ccd3de" strokeweight=".20156mm">
                         <v:path arrowok="t"/>
                       </v:shape>
@@ -17912,7 +18037,7 @@
                 </mc:Choice>
                 <mc:Fallback>
                   <w:pict>
-                    <v:group w14:anchorId="4E2638D3" id="Group 227" o:spid="_x0000_s1026" style="width:240.3pt;height:.6pt;mso-position-horizontal-relative:char;mso-position-vertical-relative:line" coordsize="30518,76" o:gfxdata="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">
+                    <v:group w14:anchorId="51034B55" id="Group 227" o:spid="_x0000_s1026" style="width:240.3pt;height:.6pt;mso-position-horizontal-relative:char;mso-position-vertical-relative:line" coordsize="30518,76" o:gfxdata="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">
                       <v:shape id="Graphic 228" o:spid="_x0000_s1027" style="position:absolute;top:36;width:30518;height:12;visibility:visible;mso-wrap-style:square;v-text-anchor:top" coordsize="3051810,1270" o:gfxdata="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" path="m,l3051274,e" filled="f" strokecolor="#ccd3de" strokeweight=".20156mm">
                         <v:path arrowok="t"/>
                       </v:shape>
@@ -18053,7 +18178,7 @@
                 </mc:Choice>
                 <mc:Fallback>
                   <w:pict>
-                    <v:group w14:anchorId="079727A8" id="Group 229" o:spid="_x0000_s1026" style="width:140.15pt;height:.6pt;mso-position-horizontal-relative:char;mso-position-vertical-relative:line" coordsize="17799,76" o:gfxdata="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">
+                    <v:group w14:anchorId="5811D4FF" id="Group 229" o:spid="_x0000_s1026" style="width:140.15pt;height:.6pt;mso-position-horizontal-relative:char;mso-position-vertical-relative:line" coordsize="17799,76" o:gfxdata="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">
                       <v:shape id="Graphic 230" o:spid="_x0000_s1027" style="position:absolute;top:36;width:17799;height:12;visibility:visible;mso-wrap-style:square;v-text-anchor:top" coordsize="1779905,1270" o:gfxdata="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" path="m,l1779910,e" filled="f" strokecolor="#ccd3de" strokeweight=".20156mm">
                         <v:path arrowok="t"/>
                       </v:shape>
@@ -18164,7 +18289,7 @@
                 </mc:Choice>
                 <mc:Fallback>
                   <w:pict>
-                    <v:group w14:anchorId="7619E359" id="Group 231" o:spid="_x0000_s1026" style="width:240.3pt;height:.6pt;mso-position-horizontal-relative:char;mso-position-vertical-relative:line" coordsize="30518,76" o:gfxdata="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">
+                    <v:group w14:anchorId="67D41F00" id="Group 231" o:spid="_x0000_s1026" style="width:240.3pt;height:.6pt;mso-position-horizontal-relative:char;mso-position-vertical-relative:line" coordsize="30518,76" o:gfxdata="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">
                       <v:shape id="Graphic 232" o:spid="_x0000_s1027" style="position:absolute;top:36;width:30518;height:12;visibility:visible;mso-wrap-style:square;v-text-anchor:top" coordsize="3051810,1270" o:gfxdata="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" path="m,l3051274,e" filled="f" strokecolor="#ccd3de" strokeweight=".20156mm">
                         <v:path arrowok="t"/>
                       </v:shape>
@@ -18303,7 +18428,7 @@
                 </mc:Choice>
                 <mc:Fallback>
                   <w:pict>
-                    <v:group w14:anchorId="50FAA397" id="Group 233" o:spid="_x0000_s1026" style="width:140.15pt;height:.6pt;mso-position-horizontal-relative:char;mso-position-vertical-relative:line" coordsize="17799,76" o:gfxdata="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">
+                    <v:group w14:anchorId="4AD1FE4D" id="Group 233" o:spid="_x0000_s1026" style="width:140.15pt;height:.6pt;mso-position-horizontal-relative:char;mso-position-vertical-relative:line" coordsize="17799,76" o:gfxdata="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">
                       <v:shape id="Graphic 234" o:spid="_x0000_s1027" style="position:absolute;top:36;width:17799;height:12;visibility:visible;mso-wrap-style:square;v-text-anchor:top" coordsize="1779905,1270" o:gfxdata="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" path="m,l1779910,e" filled="f" strokecolor="#ccd3de" strokeweight=".20156mm">
                         <v:path arrowok="t"/>
                       </v:shape>
@@ -18413,7 +18538,7 @@
                 </mc:Choice>
                 <mc:Fallback>
                   <w:pict>
-                    <v:group w14:anchorId="38071DDE" id="Group 235" o:spid="_x0000_s1026" style="width:240.3pt;height:.6pt;mso-position-horizontal-relative:char;mso-position-vertical-relative:line" coordsize="30518,76" o:gfxdata="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">
+                    <v:group w14:anchorId="669AE5CF" id="Group 235" o:spid="_x0000_s1026" style="width:240.3pt;height:.6pt;mso-position-horizontal-relative:char;mso-position-vertical-relative:line" coordsize="30518,76" o:gfxdata="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">
                       <v:shape id="Graphic 236" o:spid="_x0000_s1027" style="position:absolute;top:36;width:30518;height:12;visibility:visible;mso-wrap-style:square;v-text-anchor:top" coordsize="3051810,1270" o:gfxdata="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" path="m,l3051274,e" filled="f" strokecolor="#ccd3de" strokeweight=".20156mm">
                         <v:path arrowok="t"/>
                       </v:shape>
@@ -18554,7 +18679,7 @@
                 </mc:Choice>
                 <mc:Fallback>
                   <w:pict>
-                    <v:group w14:anchorId="54833FCB" id="Group 237" o:spid="_x0000_s1026" style="width:140.15pt;height:.6pt;mso-position-horizontal-relative:char;mso-position-vertical-relative:line" coordsize="17799,76" o:gfxdata="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">
+                    <v:group w14:anchorId="09EA6E70" id="Group 237" o:spid="_x0000_s1026" style="width:140.15pt;height:.6pt;mso-position-horizontal-relative:char;mso-position-vertical-relative:line" coordsize="17799,76" o:gfxdata="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">
                       <v:shape id="Graphic 238" o:spid="_x0000_s1027" style="position:absolute;top:36;width:17799;height:12;visibility:visible;mso-wrap-style:square;v-text-anchor:top" coordsize="1779905,1270" o:gfxdata="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" path="m,l1779910,e" filled="f" strokecolor="#ccd3de" strokeweight=".20156mm">
                         <v:path arrowok="t"/>
                       </v:shape>
@@ -18665,7 +18790,7 @@
                 </mc:Choice>
                 <mc:Fallback>
                   <w:pict>
-                    <v:group w14:anchorId="56AB1DDC" id="Group 239" o:spid="_x0000_s1026" style="width:240.3pt;height:.6pt;mso-position-horizontal-relative:char;mso-position-vertical-relative:line" coordsize="30518,76" o:gfxdata="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">
+                    <v:group w14:anchorId="5FF25715" id="Group 239" o:spid="_x0000_s1026" style="width:240.3pt;height:.6pt;mso-position-horizontal-relative:char;mso-position-vertical-relative:line" coordsize="30518,76" o:gfxdata="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">
                       <v:shape id="Graphic 240" o:spid="_x0000_s1027" style="position:absolute;top:36;width:30518;height:12;visibility:visible;mso-wrap-style:square;v-text-anchor:top" coordsize="3051810,1270" o:gfxdata="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" path="m,l3051274,e" filled="f" strokecolor="#ccd3de" strokeweight=".20156mm">
                         <v:path arrowok="t"/>
                       </v:shape>
@@ -20508,7 +20633,7 @@
                 </mc:Choice>
                 <mc:Fallback>
                   <w:pict>
-                    <v:group w14:anchorId="43185003" id="Group 247" o:spid="_x0000_s1026" style="width:110.15pt;height:.6pt;mso-position-horizontal-relative:char;mso-position-vertical-relative:line" coordsize="13989,76" o:gfxdata="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">
+                    <v:group w14:anchorId="3C6911A4" id="Group 247" o:spid="_x0000_s1026" style="width:110.15pt;height:.6pt;mso-position-horizontal-relative:char;mso-position-vertical-relative:line" coordsize="13989,76" o:gfxdata="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">
                       <v:shape id="Graphic 248" o:spid="_x0000_s1027" style="position:absolute;top:36;width:13989;height:12;visibility:visible;mso-wrap-style:square;v-text-anchor:top" coordsize="1398905,1270" o:gfxdata="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" path="m,l1398500,e" filled="f" strokecolor="#ccd3de" strokeweight=".20156mm">
                         <v:path arrowok="t"/>
                       </v:shape>
@@ -20680,7 +20805,7 @@
                 </mc:Choice>
                 <mc:Fallback>
                   <w:pict>
-                    <v:group w14:anchorId="197446AA" id="Group 249" o:spid="_x0000_s1026" style="width:110.15pt;height:.6pt;mso-position-horizontal-relative:char;mso-position-vertical-relative:line" coordsize="13989,76" o:gfxdata="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">
+                    <v:group w14:anchorId="608701A3" id="Group 249" o:spid="_x0000_s1026" style="width:110.15pt;height:.6pt;mso-position-horizontal-relative:char;mso-position-vertical-relative:line" coordsize="13989,76" o:gfxdata="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">
                       <v:shape id="Graphic 250" o:spid="_x0000_s1027" style="position:absolute;top:36;width:13989;height:12;visibility:visible;mso-wrap-style:square;v-text-anchor:top" coordsize="1398905,1270" o:gfxdata="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" path="m,l1398500,e" filled="f" strokecolor="#ccd3de" strokeweight=".20156mm">
                         <v:path arrowok="t"/>
                       </v:shape>
@@ -20849,7 +20974,7 @@
                 </mc:Choice>
                 <mc:Fallback>
                   <w:pict>
-                    <v:group w14:anchorId="0526E85A" id="Group 251" o:spid="_x0000_s1026" style="width:110.15pt;height:.6pt;mso-position-horizontal-relative:char;mso-position-vertical-relative:line" coordsize="13989,76" o:gfxdata="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">
+                    <v:group w14:anchorId="543C54A6" id="Group 251" o:spid="_x0000_s1026" style="width:110.15pt;height:.6pt;mso-position-horizontal-relative:char;mso-position-vertical-relative:line" coordsize="13989,76" o:gfxdata="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">
                       <v:shape id="Graphic 252" o:spid="_x0000_s1027" style="position:absolute;top:36;width:13989;height:12;visibility:visible;mso-wrap-style:square;v-text-anchor:top" coordsize="1398905,1270" o:gfxdata="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" path="m,l1398500,e" filled="f" strokecolor="#ccd3de" strokeweight=".20156mm">
                         <v:path arrowok="t"/>
                       </v:shape>
@@ -21021,7 +21146,7 @@
                 </mc:Choice>
                 <mc:Fallback>
                   <w:pict>
-                    <v:group w14:anchorId="4E7B34C1" id="Group 253" o:spid="_x0000_s1026" style="width:110.15pt;height:.6pt;mso-position-horizontal-relative:char;mso-position-vertical-relative:line" coordsize="13989,76" o:gfxdata="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">
+                    <v:group w14:anchorId="21F15A7D" id="Group 253" o:spid="_x0000_s1026" style="width:110.15pt;height:.6pt;mso-position-horizontal-relative:char;mso-position-vertical-relative:line" coordsize="13989,76" o:gfxdata="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">
                       <v:shape id="Graphic 254" o:spid="_x0000_s1027" style="position:absolute;top:36;width:13989;height:12;visibility:visible;mso-wrap-style:square;v-text-anchor:top" coordsize="1398905,1270" o:gfxdata="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" path="m,l1398500,e" filled="f" strokecolor="#ccd3de" strokeweight=".20156mm">
                         <v:path arrowok="t"/>
                       </v:shape>
@@ -21190,7 +21315,7 @@
                 </mc:Choice>
                 <mc:Fallback>
                   <w:pict>
-                    <v:group w14:anchorId="2D9F5F07" id="Group 255" o:spid="_x0000_s1026" style="width:110.15pt;height:.6pt;mso-position-horizontal-relative:char;mso-position-vertical-relative:line" coordsize="13989,76" o:gfxdata="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">
+                    <v:group w14:anchorId="3B962D25" id="Group 255" o:spid="_x0000_s1026" style="width:110.15pt;height:.6pt;mso-position-horizontal-relative:char;mso-position-vertical-relative:line" coordsize="13989,76" o:gfxdata="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">
                       <v:shape id="Graphic 256" o:spid="_x0000_s1027" style="position:absolute;top:36;width:13989;height:12;visibility:visible;mso-wrap-style:square;v-text-anchor:top" coordsize="1398905,1270" o:gfxdata="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" path="m,l1398500,e" filled="f" strokecolor="#ccd3de" strokeweight=".20156mm">
                         <v:path arrowok="t"/>
                       </v:shape>
@@ -21362,7 +21487,7 @@
                 </mc:Choice>
                 <mc:Fallback>
                   <w:pict>
-                    <v:group w14:anchorId="4EBB9254" id="Group 257" o:spid="_x0000_s1026" style="width:110.15pt;height:.6pt;mso-position-horizontal-relative:char;mso-position-vertical-relative:line" coordsize="13989,76" o:gfxdata="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">
+                    <v:group w14:anchorId="2138CB57" id="Group 257" o:spid="_x0000_s1026" style="width:110.15pt;height:.6pt;mso-position-horizontal-relative:char;mso-position-vertical-relative:line" coordsize="13989,76" o:gfxdata="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">
                       <v:shape id="Graphic 258" o:spid="_x0000_s1027" style="position:absolute;top:36;width:13989;height:12;visibility:visible;mso-wrap-style:square;v-text-anchor:top" coordsize="1398905,1270" o:gfxdata="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" path="m,l1398500,e" filled="f" strokecolor="#ccd3de" strokeweight=".20156mm">
                         <v:path arrowok="t"/>
                       </v:shape>
@@ -21715,7 +21840,7 @@
                 </mc:Choice>
                 <mc:Fallback>
                   <w:pict>
-                    <v:group w14:anchorId="3564227F" id="Group 259" o:spid="_x0000_s1026" style="width:110.15pt;height:.6pt;mso-position-horizontal-relative:char;mso-position-vertical-relative:line" coordsize="13989,76" o:gfxdata="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">
+                    <v:group w14:anchorId="784D8409" id="Group 259" o:spid="_x0000_s1026" style="width:110.15pt;height:.6pt;mso-position-horizontal-relative:char;mso-position-vertical-relative:line" coordsize="13989,76" o:gfxdata="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">
                       <v:shape id="Graphic 260" o:spid="_x0000_s1027" style="position:absolute;top:36;width:13989;height:12;visibility:visible;mso-wrap-style:square;v-text-anchor:top" coordsize="1398905,1270" o:gfxdata="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" path="m,l1398500,e" filled="f" strokecolor="#ccd3de" strokeweight=".20156mm">
                         <v:path arrowok="t"/>
                       </v:shape>
@@ -21887,7 +22012,7 @@
                 </mc:Choice>
                 <mc:Fallback>
                   <w:pict>
-                    <v:group w14:anchorId="6250A4AF" id="Group 261" o:spid="_x0000_s1026" style="width:110.15pt;height:.6pt;mso-position-horizontal-relative:char;mso-position-vertical-relative:line" coordsize="13989,76" o:gfxdata="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">
+                    <v:group w14:anchorId="65D497E2" id="Group 261" o:spid="_x0000_s1026" style="width:110.15pt;height:.6pt;mso-position-horizontal-relative:char;mso-position-vertical-relative:line" coordsize="13989,76" o:gfxdata="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">
                       <v:shape id="Graphic 262" o:spid="_x0000_s1027" style="position:absolute;top:36;width:13989;height:12;visibility:visible;mso-wrap-style:square;v-text-anchor:top" coordsize="1398905,1270" o:gfxdata="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" path="m,l1398500,e" filled="f" strokecolor="#ccd3de" strokeweight=".20156mm">
                         <v:path arrowok="t"/>
                       </v:shape>
@@ -22056,7 +22181,7 @@
                 </mc:Choice>
                 <mc:Fallback>
                   <w:pict>
-                    <v:group w14:anchorId="00A40FAD" id="Group 263" o:spid="_x0000_s1026" style="width:110.15pt;height:.6pt;mso-position-horizontal-relative:char;mso-position-vertical-relative:line" coordsize="13989,76" o:gfxdata="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">
+                    <v:group w14:anchorId="758AD901" id="Group 263" o:spid="_x0000_s1026" style="width:110.15pt;height:.6pt;mso-position-horizontal-relative:char;mso-position-vertical-relative:line" coordsize="13989,76" o:gfxdata="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">
                       <v:shape id="Graphic 264" o:spid="_x0000_s1027" style="position:absolute;top:36;width:13989;height:12;visibility:visible;mso-wrap-style:square;v-text-anchor:top" coordsize="1398905,1270" o:gfxdata="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" path="m,l1398500,e" filled="f" strokecolor="#ccd3de" strokeweight=".20156mm">
                         <v:path arrowok="t"/>
                       </v:shape>
@@ -22228,7 +22353,7 @@
                 </mc:Choice>
                 <mc:Fallback>
                   <w:pict>
-                    <v:group w14:anchorId="6E77F0D5" id="Group 265" o:spid="_x0000_s1026" style="width:110.15pt;height:.6pt;mso-position-horizontal-relative:char;mso-position-vertical-relative:line" coordsize="13989,76" o:gfxdata="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">
+                    <v:group w14:anchorId="076C2629" id="Group 265" o:spid="_x0000_s1026" style="width:110.15pt;height:.6pt;mso-position-horizontal-relative:char;mso-position-vertical-relative:line" coordsize="13989,76" o:gfxdata="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">
                       <v:shape id="Graphic 266" o:spid="_x0000_s1027" style="position:absolute;top:36;width:13989;height:12;visibility:visible;mso-wrap-style:square;v-text-anchor:top" coordsize="1398905,1270" o:gfxdata="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" path="m,l1398500,e" filled="f" strokecolor="#ccd3de" strokeweight=".20156mm">
                         <v:path arrowok="t"/>
                       </v:shape>
@@ -22397,7 +22522,7 @@
                 </mc:Choice>
                 <mc:Fallback>
                   <w:pict>
-                    <v:group w14:anchorId="0D2514CC" id="Group 267" o:spid="_x0000_s1026" style="width:110.15pt;height:.6pt;mso-position-horizontal-relative:char;mso-position-vertical-relative:line" coordsize="13989,76" o:gfxdata="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">
+                    <v:group w14:anchorId="7272503B" id="Group 267" o:spid="_x0000_s1026" style="width:110.15pt;height:.6pt;mso-position-horizontal-relative:char;mso-position-vertical-relative:line" coordsize="13989,76" o:gfxdata="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">
                       <v:shape id="Graphic 268" o:spid="_x0000_s1027" style="position:absolute;top:36;width:13989;height:12;visibility:visible;mso-wrap-style:square;v-text-anchor:top" coordsize="1398905,1270" o:gfxdata="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" path="m,l1398500,e" filled="f" strokecolor="#ccd3de" strokeweight=".20156mm">
                         <v:path arrowok="t"/>
                       </v:shape>
@@ -22569,7 +22694,7 @@
                 </mc:Choice>
                 <mc:Fallback>
                   <w:pict>
-                    <v:group w14:anchorId="159BD6FA" id="Group 269" o:spid="_x0000_s1026" style="width:110.15pt;height:.6pt;mso-position-horizontal-relative:char;mso-position-vertical-relative:line" coordsize="13989,76" o:gfxdata="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">
+                    <v:group w14:anchorId="680BF8C8" id="Group 269" o:spid="_x0000_s1026" style="width:110.15pt;height:.6pt;mso-position-horizontal-relative:char;mso-position-vertical-relative:line" coordsize="13989,76" o:gfxdata="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">
                       <v:shape id="Graphic 270" o:spid="_x0000_s1027" style="position:absolute;top:36;width:13989;height:12;visibility:visible;mso-wrap-style:square;v-text-anchor:top" coordsize="1398905,1270" o:gfxdata="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" path="m,l1398500,e" filled="f" strokecolor="#ccd3de" strokeweight=".20156mm">
                         <v:path arrowok="t"/>
                       </v:shape>
@@ -22913,7 +23038,7 @@
                 </mc:Choice>
                 <mc:Fallback>
                   <w:pict>
-                    <v:group w14:anchorId="58318CB6" id="Group 271" o:spid="_x0000_s1026" style="width:110.15pt;height:.6pt;mso-position-horizontal-relative:char;mso-position-vertical-relative:line" coordsize="13989,76" o:gfxdata="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">
+                    <v:group w14:anchorId="3CD4018C" id="Group 271" o:spid="_x0000_s1026" style="width:110.15pt;height:.6pt;mso-position-horizontal-relative:char;mso-position-vertical-relative:line" coordsize="13989,76" o:gfxdata="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">
                       <v:shape id="Graphic 272" o:spid="_x0000_s1027" style="position:absolute;top:36;width:13989;height:12;visibility:visible;mso-wrap-style:square;v-text-anchor:top" coordsize="1398905,1270" o:gfxdata="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" path="m,l1398500,e" filled="f" strokecolor="#ccd3de" strokeweight=".20156mm">
                         <v:path arrowok="t"/>
                       </v:shape>
@@ -23085,7 +23210,7 @@
                 </mc:Choice>
                 <mc:Fallback>
                   <w:pict>
-                    <v:group w14:anchorId="7E77190B" id="Group 273" o:spid="_x0000_s1026" style="width:110.15pt;height:.6pt;mso-position-horizontal-relative:char;mso-position-vertical-relative:line" coordsize="13989,76" o:gfxdata="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">
+                    <v:group w14:anchorId="78B3E208" id="Group 273" o:spid="_x0000_s1026" style="width:110.15pt;height:.6pt;mso-position-horizontal-relative:char;mso-position-vertical-relative:line" coordsize="13989,76" o:gfxdata="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">
                       <v:shape id="Graphic 274" o:spid="_x0000_s1027" style="position:absolute;top:36;width:13989;height:12;visibility:visible;mso-wrap-style:square;v-text-anchor:top" coordsize="1398905,1270" o:gfxdata="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" path="m,l1398500,e" filled="f" strokecolor="#ccd3de" strokeweight=".20156mm">
                         <v:path arrowok="t"/>
                       </v:shape>
@@ -23254,7 +23379,7 @@
                 </mc:Choice>
                 <mc:Fallback>
                   <w:pict>
-                    <v:group w14:anchorId="677E8CF2" id="Group 275" o:spid="_x0000_s1026" style="width:110.15pt;height:.6pt;mso-position-horizontal-relative:char;mso-position-vertical-relative:line" coordsize="13989,76" o:gfxdata="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">
+                    <v:group w14:anchorId="7E8433BC" id="Group 275" o:spid="_x0000_s1026" style="width:110.15pt;height:.6pt;mso-position-horizontal-relative:char;mso-position-vertical-relative:line" coordsize="13989,76" o:gfxdata="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">
                       <v:shape id="Graphic 276" o:spid="_x0000_s1027" style="position:absolute;top:36;width:13989;height:12;visibility:visible;mso-wrap-style:square;v-text-anchor:top" coordsize="1398905,1270" o:gfxdata="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" path="m,l1398500,e" filled="f" strokecolor="#ccd3de" strokeweight=".20156mm">
                         <v:path arrowok="t"/>
                       </v:shape>
@@ -23426,7 +23551,7 @@
                 </mc:Choice>
                 <mc:Fallback>
                   <w:pict>
-                    <v:group w14:anchorId="4DCE4890" id="Group 277" o:spid="_x0000_s1026" style="width:110.15pt;height:.6pt;mso-position-horizontal-relative:char;mso-position-vertical-relative:line" coordsize="13989,76" o:gfxdata="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">
+                    <v:group w14:anchorId="22932EBA" id="Group 277" o:spid="_x0000_s1026" style="width:110.15pt;height:.6pt;mso-position-horizontal-relative:char;mso-position-vertical-relative:line" coordsize="13989,76" o:gfxdata="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">
                       <v:shape id="Graphic 278" o:spid="_x0000_s1027" style="position:absolute;top:36;width:13989;height:12;visibility:visible;mso-wrap-style:square;v-text-anchor:top" coordsize="1398905,1270" o:gfxdata="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" path="m,l1398500,e" filled="f" strokecolor="#ccd3de" strokeweight=".20156mm">
                         <v:path arrowok="t"/>
                       </v:shape>
@@ -23595,7 +23720,7 @@
                 </mc:Choice>
                 <mc:Fallback>
                   <w:pict>
-                    <v:group w14:anchorId="67B91EAB" id="Group 279" o:spid="_x0000_s1026" style="width:110.15pt;height:.6pt;mso-position-horizontal-relative:char;mso-position-vertical-relative:line" coordsize="13989,76" o:gfxdata="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">
+                    <v:group w14:anchorId="14A8DC2D" id="Group 279" o:spid="_x0000_s1026" style="width:110.15pt;height:.6pt;mso-position-horizontal-relative:char;mso-position-vertical-relative:line" coordsize="13989,76" o:gfxdata="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">
                       <v:shape id="Graphic 280" o:spid="_x0000_s1027" style="position:absolute;top:36;width:13989;height:12;visibility:visible;mso-wrap-style:square;v-text-anchor:top" coordsize="1398905,1270" o:gfxdata="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" path="m,l1398500,e" filled="f" strokecolor="#ccd3de" strokeweight=".20156mm">
                         <v:path arrowok="t"/>
                       </v:shape>
@@ -23767,7 +23892,7 @@
                 </mc:Choice>
                 <mc:Fallback>
                   <w:pict>
-                    <v:group w14:anchorId="7D5664CA" id="Group 281" o:spid="_x0000_s1026" style="width:110.15pt;height:.6pt;mso-position-horizontal-relative:char;mso-position-vertical-relative:line" coordsize="13989,76" o:gfxdata="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">
+                    <v:group w14:anchorId="1AA8CBFF" id="Group 281" o:spid="_x0000_s1026" style="width:110.15pt;height:.6pt;mso-position-horizontal-relative:char;mso-position-vertical-relative:line" coordsize="13989,76" o:gfxdata="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">
                       <v:shape id="Graphic 282" o:spid="_x0000_s1027" style="position:absolute;top:36;width:13989;height:12;visibility:visible;mso-wrap-style:square;v-text-anchor:top" coordsize="1398905,1270" o:gfxdata="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" path="m,l1398500,e" filled="f" strokecolor="#ccd3de" strokeweight=".20156mm">
                         <v:path arrowok="t"/>
                       </v:shape>
@@ -23936,7 +24061,7 @@
                 </mc:Choice>
                 <mc:Fallback>
                   <w:pict>
-                    <v:group w14:anchorId="648F8E78" id="Group 283" o:spid="_x0000_s1026" style="width:110.15pt;height:.6pt;mso-position-horizontal-relative:char;mso-position-vertical-relative:line" coordsize="13989,76" o:gfxdata="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">
+                    <v:group w14:anchorId="79F90CAC" id="Group 283" o:spid="_x0000_s1026" style="width:110.15pt;height:.6pt;mso-position-horizontal-relative:char;mso-position-vertical-relative:line" coordsize="13989,76" o:gfxdata="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">
                       <v:shape id="Graphic 284" o:spid="_x0000_s1027" style="position:absolute;top:36;width:13989;height:12;visibility:visible;mso-wrap-style:square;v-text-anchor:top" coordsize="1398905,1270" o:gfxdata="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" path="m,l1398500,e" filled="f" strokecolor="#ccd3de" strokeweight=".20156mm">
                         <v:path arrowok="t"/>
                       </v:shape>
@@ -24106,7 +24231,7 @@
                 </mc:Choice>
                 <mc:Fallback>
                   <w:pict>
-                    <v:group w14:anchorId="65F5BCFC" id="Group 285" o:spid="_x0000_s1026" style="width:110.15pt;height:.6pt;mso-position-horizontal-relative:char;mso-position-vertical-relative:line" coordsize="13989,76" o:gfxdata="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">
+                    <v:group w14:anchorId="0F4F79B3" id="Group 285" o:spid="_x0000_s1026" style="width:110.15pt;height:.6pt;mso-position-horizontal-relative:char;mso-position-vertical-relative:line" coordsize="13989,76" o:gfxdata="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">
                       <v:shape id="Graphic 286" o:spid="_x0000_s1027" style="position:absolute;top:36;width:13989;height:12;visibility:visible;mso-wrap-style:square;v-text-anchor:top" coordsize="1398905,1270" o:gfxdata="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" path="m,l1398500,e" filled="f" strokecolor="#ccd3de" strokeweight=".20156mm">
                         <v:path arrowok="t"/>
                       </v:shape>
@@ -24461,7 +24586,7 @@
                 </mc:Choice>
                 <mc:Fallback>
                   <w:pict>
-                    <v:group w14:anchorId="540A0A17" id="Group 287" o:spid="_x0000_s1026" style="width:110.15pt;height:.6pt;mso-position-horizontal-relative:char;mso-position-vertical-relative:line" coordsize="13989,76" o:gfxdata="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">
+                    <v:group w14:anchorId="201A43F1" id="Group 287" o:spid="_x0000_s1026" style="width:110.15pt;height:.6pt;mso-position-horizontal-relative:char;mso-position-vertical-relative:line" coordsize="13989,76" o:gfxdata="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">
                       <v:shape id="Graphic 288" o:spid="_x0000_s1027" style="position:absolute;top:36;width:13989;height:12;visibility:visible;mso-wrap-style:square;v-text-anchor:top" coordsize="1398905,1270" o:gfxdata="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" path="m,l1398500,e" filled="f" strokecolor="#ccd3de" strokeweight=".20156mm">
                         <v:path arrowok="t"/>
                       </v:shape>
@@ -24633,7 +24758,7 @@
                 </mc:Choice>
                 <mc:Fallback>
                   <w:pict>
-                    <v:group w14:anchorId="7EC83AF2" id="Group 289" o:spid="_x0000_s1026" style="width:110.15pt;height:.6pt;mso-position-horizontal-relative:char;mso-position-vertical-relative:line" coordsize="13989,76" o:gfxdata="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">
+                    <v:group w14:anchorId="436BE2A9" id="Group 289" o:spid="_x0000_s1026" style="width:110.15pt;height:.6pt;mso-position-horizontal-relative:char;mso-position-vertical-relative:line" coordsize="13989,76" o:gfxdata="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">
                       <v:shape id="Graphic 290" o:spid="_x0000_s1027" style="position:absolute;top:36;width:13989;height:12;visibility:visible;mso-wrap-style:square;v-text-anchor:top" coordsize="1398905,1270" o:gfxdata="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" path="m,l1398500,e" filled="f" strokecolor="#ccd3de" strokeweight=".20156mm">
                         <v:path arrowok="t"/>
                       </v:shape>
@@ -24802,7 +24927,7 @@
                 </mc:Choice>
                 <mc:Fallback>
                   <w:pict>
-                    <v:group w14:anchorId="223729FD" id="Group 291" o:spid="_x0000_s1026" style="width:110.15pt;height:.6pt;mso-position-horizontal-relative:char;mso-position-vertical-relative:line" coordsize="13989,76" o:gfxdata="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">
+                    <v:group w14:anchorId="4372EAD1" id="Group 291" o:spid="_x0000_s1026" style="width:110.15pt;height:.6pt;mso-position-horizontal-relative:char;mso-position-vertical-relative:line" coordsize="13989,76" o:gfxdata="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">
                       <v:shape id="Graphic 292" o:spid="_x0000_s1027" style="position:absolute;top:36;width:13989;height:12;visibility:visible;mso-wrap-style:square;v-text-anchor:top" coordsize="1398905,1270" o:gfxdata="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" path="m,l1398500,e" filled="f" strokecolor="#ccd3de" strokeweight=".20156mm">
                         <v:path arrowok="t"/>
                       </v:shape>
@@ -24974,7 +25099,7 @@
                 </mc:Choice>
                 <mc:Fallback>
                   <w:pict>
-                    <v:group w14:anchorId="2735D22C" id="Group 293" o:spid="_x0000_s1026" style="width:110.15pt;height:.6pt;mso-position-horizontal-relative:char;mso-position-vertical-relative:line" coordsize="13989,76" o:gfxdata="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">
+                    <v:group w14:anchorId="7540CCD4" id="Group 293" o:spid="_x0000_s1026" style="width:110.15pt;height:.6pt;mso-position-horizontal-relative:char;mso-position-vertical-relative:line" coordsize="13989,76" o:gfxdata="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">
                       <v:shape id="Graphic 294" o:spid="_x0000_s1027" style="position:absolute;top:36;width:13989;height:12;visibility:visible;mso-wrap-style:square;v-text-anchor:top" coordsize="1398905,1270" o:gfxdata="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" path="m,l1398500,e" filled="f" strokecolor="#ccd3de" strokeweight=".20156mm">
                         <v:path arrowok="t"/>
                       </v:shape>
@@ -25143,7 +25268,7 @@
                 </mc:Choice>
                 <mc:Fallback>
                   <w:pict>
-                    <v:group w14:anchorId="459E03EA" id="Group 295" o:spid="_x0000_s1026" style="width:110.15pt;height:.6pt;mso-position-horizontal-relative:char;mso-position-vertical-relative:line" coordsize="13989,76" o:gfxdata="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">
+                    <v:group w14:anchorId="2F3C7FC8" id="Group 295" o:spid="_x0000_s1026" style="width:110.15pt;height:.6pt;mso-position-horizontal-relative:char;mso-position-vertical-relative:line" coordsize="13989,76" o:gfxdata="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">
                       <v:shape id="Graphic 296" o:spid="_x0000_s1027" style="position:absolute;top:36;width:13989;height:12;visibility:visible;mso-wrap-style:square;v-text-anchor:top" coordsize="1398905,1270" o:gfxdata="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" path="m,l1398500,e" filled="f" strokecolor="#ccd3de" strokeweight=".20156mm">
                         <v:path arrowok="t"/>
                       </v:shape>
@@ -25315,7 +25440,7 @@
                 </mc:Choice>
                 <mc:Fallback>
                   <w:pict>
-                    <v:group w14:anchorId="31871580" id="Group 297" o:spid="_x0000_s1026" style="width:110.15pt;height:.6pt;mso-position-horizontal-relative:char;mso-position-vertical-relative:line" coordsize="13989,76" o:gfxdata="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">
+                    <v:group w14:anchorId="79205DF0" id="Group 297" o:spid="_x0000_s1026" style="width:110.15pt;height:.6pt;mso-position-horizontal-relative:char;mso-position-vertical-relative:line" coordsize="13989,76" o:gfxdata="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">
                       <v:shape id="Graphic 298" o:spid="_x0000_s1027" style="position:absolute;top:36;width:13989;height:12;visibility:visible;mso-wrap-style:square;v-text-anchor:top" coordsize="1398905,1270" o:gfxdata="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" path="m,l1398500,e" filled="f" strokecolor="#ccd3de" strokeweight=".20156mm">
                         <v:path arrowok="t"/>
                       </v:shape>
@@ -25484,7 +25609,7 @@
                 </mc:Choice>
                 <mc:Fallback>
                   <w:pict>
-                    <v:group w14:anchorId="3B3866C9" id="Group 299" o:spid="_x0000_s1026" style="width:110.15pt;height:.6pt;mso-position-horizontal-relative:char;mso-position-vertical-relative:line" coordsize="13989,76" o:gfxdata="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">
+                    <v:group w14:anchorId="2B93BC81" id="Group 299" o:spid="_x0000_s1026" style="width:110.15pt;height:.6pt;mso-position-horizontal-relative:char;mso-position-vertical-relative:line" coordsize="13989,76" o:gfxdata="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">
                       <v:shape id="Graphic 300" o:spid="_x0000_s1027" style="position:absolute;top:36;width:13989;height:12;visibility:visible;mso-wrap-style:square;v-text-anchor:top" coordsize="1398905,1270" o:gfxdata="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" path="m,l1398500,e" filled="f" strokecolor="#ccd3de" strokeweight=".20156mm">
                         <v:path arrowok="t"/>
                       </v:shape>
@@ -25513,21 +25638,7 @@
         <w:rPr>
           <w:color w:val="1A1A2D"/>
         </w:rPr>
-        <w:t xml:space="preserve">Step 2 — Describe </w:t>
-      </w:r>
-      <w:proofErr w:type="gramStart"/>
-      <w:r>
-        <w:rPr>
-          <w:color w:val="1A1A2D"/>
-        </w:rPr>
-        <w:t>the Entity</w:t>
-      </w:r>
-      <w:proofErr w:type="gramEnd"/>
-      <w:r>
-        <w:rPr>
-          <w:color w:val="1A1A2D"/>
-        </w:rPr>
-        <w:t xml:space="preserve"> </w:t>
+        <w:t xml:space="preserve">Step 2 — Describe the Entity </w:t>
       </w:r>
       <w:r>
         <w:rPr>
@@ -26179,7 +26290,7 @@
                 </mc:Choice>
                 <mc:Fallback>
                   <w:pict>
-                    <v:group w14:anchorId="699A2B2A" id="Group 302" o:spid="_x0000_s1026" style="width:140.15pt;height:.6pt;mso-position-horizontal-relative:char;mso-position-vertical-relative:line" coordsize="17799,76" o:gfxdata="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">
+                    <v:group w14:anchorId="6ED8592E" id="Group 302" o:spid="_x0000_s1026" style="width:140.15pt;height:.6pt;mso-position-horizontal-relative:char;mso-position-vertical-relative:line" coordsize="17799,76" o:gfxdata="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">
                       <v:shape id="Graphic 303" o:spid="_x0000_s1027" style="position:absolute;top:36;width:17799;height:12;visibility:visible;mso-wrap-style:square;v-text-anchor:top" coordsize="1779905,1270" o:gfxdata="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" path="m,l1779910,e" filled="f" strokecolor="#ccd3de" strokeweight=".20156mm">
                         <v:path arrowok="t"/>
                       </v:shape>
@@ -26289,7 +26400,7 @@
                 </mc:Choice>
                 <mc:Fallback>
                   <w:pict>
-                    <v:group w14:anchorId="4A2C2CA1" id="Group 304" o:spid="_x0000_s1026" style="width:240.3pt;height:.6pt;mso-position-horizontal-relative:char;mso-position-vertical-relative:line" coordsize="30518,76" o:gfxdata="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">
+                    <v:group w14:anchorId="36492075" id="Group 304" o:spid="_x0000_s1026" style="width:240.3pt;height:.6pt;mso-position-horizontal-relative:char;mso-position-vertical-relative:line" coordsize="30518,76" o:gfxdata="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">
                       <v:shape id="Graphic 305" o:spid="_x0000_s1027" style="position:absolute;top:36;width:30518;height:12;visibility:visible;mso-wrap-style:square;v-text-anchor:top" coordsize="3051810,1270" o:gfxdata="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" path="m,l3051274,e" filled="f" strokecolor="#ccd3de" strokeweight=".20156mm">
                         <v:path arrowok="t"/>
                       </v:shape>
@@ -26429,7 +26540,7 @@
                 </mc:Choice>
                 <mc:Fallback>
                   <w:pict>
-                    <v:group w14:anchorId="7547D3CE" id="Group 306" o:spid="_x0000_s1026" style="width:140.15pt;height:.6pt;mso-position-horizontal-relative:char;mso-position-vertical-relative:line" coordsize="17799,76" o:gfxdata="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">
+                    <v:group w14:anchorId="5C13F8E9" id="Group 306" o:spid="_x0000_s1026" style="width:140.15pt;height:.6pt;mso-position-horizontal-relative:char;mso-position-vertical-relative:line" coordsize="17799,76" o:gfxdata="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">
                       <v:shape id="Graphic 307" o:spid="_x0000_s1027" style="position:absolute;top:36;width:17799;height:12;visibility:visible;mso-wrap-style:square;v-text-anchor:top" coordsize="1779905,1270" o:gfxdata="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" path="m,l1779910,e" filled="f" strokecolor="#ccd3de" strokeweight=".20156mm">
                         <v:path arrowok="t"/>
                       </v:shape>
@@ -26540,7 +26651,7 @@
                 </mc:Choice>
                 <mc:Fallback>
                   <w:pict>
-                    <v:group w14:anchorId="7F95DDEC" id="Group 308" o:spid="_x0000_s1026" style="width:240.3pt;height:.6pt;mso-position-horizontal-relative:char;mso-position-vertical-relative:line" coordsize="30518,76" o:gfxdata="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">
+                    <v:group w14:anchorId="46FB7B04" id="Group 308" o:spid="_x0000_s1026" style="width:240.3pt;height:.6pt;mso-position-horizontal-relative:char;mso-position-vertical-relative:line" coordsize="30518,76" o:gfxdata="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">
                       <v:shape id="Graphic 309" o:spid="_x0000_s1027" style="position:absolute;top:36;width:30518;height:12;visibility:visible;mso-wrap-style:square;v-text-anchor:top" coordsize="3051810,1270" o:gfxdata="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" path="m,l3051274,e" filled="f" strokecolor="#ccd3de" strokeweight=".20156mm">
                         <v:path arrowok="t"/>
                       </v:shape>
@@ -26678,7 +26789,7 @@
                 </mc:Choice>
                 <mc:Fallback>
                   <w:pict>
-                    <v:group w14:anchorId="01F40925" id="Group 310" o:spid="_x0000_s1026" style="width:140.15pt;height:.6pt;mso-position-horizontal-relative:char;mso-position-vertical-relative:line" coordsize="17799,76" o:gfxdata="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">
+                    <v:group w14:anchorId="6355E55F" id="Group 310" o:spid="_x0000_s1026" style="width:140.15pt;height:.6pt;mso-position-horizontal-relative:char;mso-position-vertical-relative:line" coordsize="17799,76" o:gfxdata="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">
                       <v:shape id="Graphic 311" o:spid="_x0000_s1027" style="position:absolute;top:36;width:17799;height:12;visibility:visible;mso-wrap-style:square;v-text-anchor:top" coordsize="1779905,1270" o:gfxdata="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" path="m,l1779910,e" filled="f" strokecolor="#ccd3de" strokeweight=".20156mm">
                         <v:path arrowok="t"/>
                       </v:shape>
@@ -26788,7 +26899,7 @@
                 </mc:Choice>
                 <mc:Fallback>
                   <w:pict>
-                    <v:group w14:anchorId="27E2A51A" id="Group 312" o:spid="_x0000_s1026" style="width:240.3pt;height:.6pt;mso-position-horizontal-relative:char;mso-position-vertical-relative:line" coordsize="30518,76" o:gfxdata="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">
+                    <v:group w14:anchorId="25D9F648" id="Group 312" o:spid="_x0000_s1026" style="width:240.3pt;height:.6pt;mso-position-horizontal-relative:char;mso-position-vertical-relative:line" coordsize="30518,76" o:gfxdata="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">
                       <v:shape id="Graphic 313" o:spid="_x0000_s1027" style="position:absolute;top:36;width:30518;height:12;visibility:visible;mso-wrap-style:square;v-text-anchor:top" coordsize="3051810,1270" o:gfxdata="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" path="m,l3051274,e" filled="f" strokecolor="#ccd3de" strokeweight=".20156mm">
                         <v:path arrowok="t"/>
                       </v:shape>
@@ -26928,7 +27039,7 @@
                 </mc:Choice>
                 <mc:Fallback>
                   <w:pict>
-                    <v:group w14:anchorId="1DFD6748" id="Group 314" o:spid="_x0000_s1026" style="width:140.15pt;height:.6pt;mso-position-horizontal-relative:char;mso-position-vertical-relative:line" coordsize="17799,76" o:gfxdata="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">
+                    <v:group w14:anchorId="39FA3521" id="Group 314" o:spid="_x0000_s1026" style="width:140.15pt;height:.6pt;mso-position-horizontal-relative:char;mso-position-vertical-relative:line" coordsize="17799,76" o:gfxdata="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">
                       <v:shape id="Graphic 315" o:spid="_x0000_s1027" style="position:absolute;top:36;width:17799;height:12;visibility:visible;mso-wrap-style:square;v-text-anchor:top" coordsize="1779905,1270" o:gfxdata="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" path="m,l1779910,e" filled="f" strokecolor="#ccd3de" strokeweight=".20156mm">
                         <v:path arrowok="t"/>
                       </v:shape>
@@ -27039,7 +27150,7 @@
                 </mc:Choice>
                 <mc:Fallback>
                   <w:pict>
-                    <v:group w14:anchorId="0380C190" id="Group 316" o:spid="_x0000_s1026" style="width:240.3pt;height:.6pt;mso-position-horizontal-relative:char;mso-position-vertical-relative:line" coordsize="30518,76" o:gfxdata="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">
+                    <v:group w14:anchorId="4D31891F" id="Group 316" o:spid="_x0000_s1026" style="width:240.3pt;height:.6pt;mso-position-horizontal-relative:char;mso-position-vertical-relative:line" coordsize="30518,76" o:gfxdata="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">
                       <v:shape id="Graphic 317" o:spid="_x0000_s1027" style="position:absolute;top:36;width:30518;height:12;visibility:visible;mso-wrap-style:square;v-text-anchor:top" coordsize="3051810,1270" o:gfxdata="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" path="m,l3051274,e" filled="f" strokecolor="#ccd3de" strokeweight=".20156mm">
                         <v:path arrowok="t"/>
                       </v:shape>
@@ -27177,7 +27288,7 @@
                 </mc:Choice>
                 <mc:Fallback>
                   <w:pict>
-                    <v:group w14:anchorId="30D9E63D" id="Group 318" o:spid="_x0000_s1026" style="width:140.15pt;height:.6pt;mso-position-horizontal-relative:char;mso-position-vertical-relative:line" coordsize="17799,76" o:gfxdata="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">
+                    <v:group w14:anchorId="4BA0E75B" id="Group 318" o:spid="_x0000_s1026" style="width:140.15pt;height:.6pt;mso-position-horizontal-relative:char;mso-position-vertical-relative:line" coordsize="17799,76" o:gfxdata="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">
                       <v:shape id="Graphic 319" o:spid="_x0000_s1027" style="position:absolute;top:36;width:17799;height:12;visibility:visible;mso-wrap-style:square;v-text-anchor:top" coordsize="1779905,1270" o:gfxdata="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" path="m,l1779910,e" filled="f" strokecolor="#ccd3de" strokeweight=".20156mm">
                         <v:path arrowok="t"/>
                       </v:shape>
@@ -27287,7 +27398,7 @@
                 </mc:Choice>
                 <mc:Fallback>
                   <w:pict>
-                    <v:group w14:anchorId="62D206CC" id="Group 320" o:spid="_x0000_s1026" style="width:240.3pt;height:.6pt;mso-position-horizontal-relative:char;mso-position-vertical-relative:line" coordsize="30518,76" o:gfxdata="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">
+                    <v:group w14:anchorId="43062680" id="Group 320" o:spid="_x0000_s1026" style="width:240.3pt;height:.6pt;mso-position-horizontal-relative:char;mso-position-vertical-relative:line" coordsize="30518,76" o:gfxdata="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">
                       <v:shape id="Graphic 321" o:spid="_x0000_s1027" style="position:absolute;top:36;width:30518;height:12;visibility:visible;mso-wrap-style:square;v-text-anchor:top" coordsize="3051810,1270" o:gfxdata="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" path="m,l3051274,e" filled="f" strokecolor="#ccd3de" strokeweight=".20156mm">
                         <v:path arrowok="t"/>
                       </v:shape>
@@ -27427,7 +27538,7 @@
                 </mc:Choice>
                 <mc:Fallback>
                   <w:pict>
-                    <v:group w14:anchorId="05EBA13E" id="Group 322" o:spid="_x0000_s1026" style="width:140.15pt;height:.6pt;mso-position-horizontal-relative:char;mso-position-vertical-relative:line" coordsize="17799,76" o:gfxdata="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">
+                    <v:group w14:anchorId="1693FDA5" id="Group 322" o:spid="_x0000_s1026" style="width:140.15pt;height:.6pt;mso-position-horizontal-relative:char;mso-position-vertical-relative:line" coordsize="17799,76" o:gfxdata="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">
                       <v:shape id="Graphic 323" o:spid="_x0000_s1027" style="position:absolute;top:36;width:17799;height:12;visibility:visible;mso-wrap-style:square;v-text-anchor:top" coordsize="1779905,1270" o:gfxdata="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" path="m,l1779910,e" filled="f" strokecolor="#ccd3de" strokeweight=".20156mm">
                         <v:path arrowok="t"/>
                       </v:shape>
@@ -27538,7 +27649,7 @@
                 </mc:Choice>
                 <mc:Fallback>
                   <w:pict>
-                    <v:group w14:anchorId="198691A0" id="Group 324" o:spid="_x0000_s1026" style="width:240.3pt;height:.6pt;mso-position-horizontal-relative:char;mso-position-vertical-relative:line" coordsize="30518,76" o:gfxdata="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">
+                    <v:group w14:anchorId="7E87053D" id="Group 324" o:spid="_x0000_s1026" style="width:240.3pt;height:.6pt;mso-position-horizontal-relative:char;mso-position-vertical-relative:line" coordsize="30518,76" o:gfxdata="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">
                       <v:shape id="Graphic 325" o:spid="_x0000_s1027" style="position:absolute;top:36;width:30518;height:12;visibility:visible;mso-wrap-style:square;v-text-anchor:top" coordsize="3051810,1270" o:gfxdata="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" path="m,l3051274,e" filled="f" strokecolor="#ccd3de" strokeweight=".20156mm">
                         <v:path arrowok="t"/>
                       </v:shape>
@@ -27676,7 +27787,7 @@
                 </mc:Choice>
                 <mc:Fallback>
                   <w:pict>
-                    <v:group w14:anchorId="2E87E749" id="Group 326" o:spid="_x0000_s1026" style="width:140.15pt;height:.6pt;mso-position-horizontal-relative:char;mso-position-vertical-relative:line" coordsize="17799,76" o:gfxdata="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">
+                    <v:group w14:anchorId="15673958" id="Group 326" o:spid="_x0000_s1026" style="width:140.15pt;height:.6pt;mso-position-horizontal-relative:char;mso-position-vertical-relative:line" coordsize="17799,76" o:gfxdata="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">
                       <v:shape id="Graphic 327" o:spid="_x0000_s1027" style="position:absolute;top:36;width:17799;height:12;visibility:visible;mso-wrap-style:square;v-text-anchor:top" coordsize="1779905,1270" o:gfxdata="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" path="m,l1779910,e" filled="f" strokecolor="#ccd3de" strokeweight=".20156mm">
                         <v:path arrowok="t"/>
                       </v:shape>
@@ -27786,7 +27897,7 @@
                 </mc:Choice>
                 <mc:Fallback>
                   <w:pict>
-                    <v:group w14:anchorId="34A6A518" id="Group 328" o:spid="_x0000_s1026" style="width:240.3pt;height:.6pt;mso-position-horizontal-relative:char;mso-position-vertical-relative:line" coordsize="30518,76" o:gfxdata="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">
+                    <v:group w14:anchorId="52157077" id="Group 328" o:spid="_x0000_s1026" style="width:240.3pt;height:.6pt;mso-position-horizontal-relative:char;mso-position-vertical-relative:line" coordsize="30518,76" o:gfxdata="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">
                       <v:shape id="Graphic 329" o:spid="_x0000_s1027" style="position:absolute;top:36;width:30518;height:12;visibility:visible;mso-wrap-style:square;v-text-anchor:top" coordsize="3051810,1270" o:gfxdata="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" path="m,l3051274,e" filled="f" strokecolor="#ccd3de" strokeweight=".20156mm">
                         <v:path arrowok="t"/>
                       </v:shape>
@@ -28063,7 +28174,7 @@
                 </mc:Choice>
                 <mc:Fallback>
                   <w:pict>
-                    <v:group w14:anchorId="1A3C9F09" id="Group 330" o:spid="_x0000_s1026" style="width:140.15pt;height:.6pt;mso-position-horizontal-relative:char;mso-position-vertical-relative:line" coordsize="17799,76" o:gfxdata="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">
+                    <v:group w14:anchorId="08C4A87B" id="Group 330" o:spid="_x0000_s1026" style="width:140.15pt;height:.6pt;mso-position-horizontal-relative:char;mso-position-vertical-relative:line" coordsize="17799,76" o:gfxdata="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">
                       <v:shape id="Graphic 331" o:spid="_x0000_s1027" style="position:absolute;top:36;width:17799;height:12;visibility:visible;mso-wrap-style:square;v-text-anchor:top" coordsize="1779905,1270" o:gfxdata="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" path="m,l1779910,e" filled="f" strokecolor="#ccd3de" strokeweight=".20156mm">
                         <v:path arrowok="t"/>
                       </v:shape>
@@ -28173,7 +28284,7 @@
                 </mc:Choice>
                 <mc:Fallback>
                   <w:pict>
-                    <v:group w14:anchorId="0BE840F1" id="Group 332" o:spid="_x0000_s1026" style="width:240.3pt;height:.6pt;mso-position-horizontal-relative:char;mso-position-vertical-relative:line" coordsize="30518,76" o:gfxdata="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">
+                    <v:group w14:anchorId="63642E45" id="Group 332" o:spid="_x0000_s1026" style="width:240.3pt;height:.6pt;mso-position-horizontal-relative:char;mso-position-vertical-relative:line" coordsize="30518,76" o:gfxdata="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">
                       <v:shape id="Graphic 333" o:spid="_x0000_s1027" style="position:absolute;top:36;width:30518;height:12;visibility:visible;mso-wrap-style:square;v-text-anchor:top" coordsize="3051810,1270" o:gfxdata="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" path="m,l3051274,e" filled="f" strokecolor="#ccd3de" strokeweight=".20156mm">
                         <v:path arrowok="t"/>
                       </v:shape>
@@ -28313,7 +28424,7 @@
                 </mc:Choice>
                 <mc:Fallback>
                   <w:pict>
-                    <v:group w14:anchorId="14914432" id="Group 334" o:spid="_x0000_s1026" style="width:140.15pt;height:.6pt;mso-position-horizontal-relative:char;mso-position-vertical-relative:line" coordsize="17799,76" o:gfxdata="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">
+                    <v:group w14:anchorId="4756D1DF" id="Group 334" o:spid="_x0000_s1026" style="width:140.15pt;height:.6pt;mso-position-horizontal-relative:char;mso-position-vertical-relative:line" coordsize="17799,76" o:gfxdata="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">
                       <v:shape id="Graphic 335" o:spid="_x0000_s1027" style="position:absolute;top:36;width:17799;height:12;visibility:visible;mso-wrap-style:square;v-text-anchor:top" coordsize="1779905,1270" o:gfxdata="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" path="m,l1779910,e" filled="f" strokecolor="#ccd3de" strokeweight=".20156mm">
                         <v:path arrowok="t"/>
                       </v:shape>
@@ -28424,7 +28535,7 @@
                 </mc:Choice>
                 <mc:Fallback>
                   <w:pict>
-                    <v:group w14:anchorId="6969B600" id="Group 336" o:spid="_x0000_s1026" style="width:240.3pt;height:.6pt;mso-position-horizontal-relative:char;mso-position-vertical-relative:line" coordsize="30518,76" o:gfxdata="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">
+                    <v:group w14:anchorId="4E660082" id="Group 336" o:spid="_x0000_s1026" style="width:240.3pt;height:.6pt;mso-position-horizontal-relative:char;mso-position-vertical-relative:line" coordsize="30518,76" o:gfxdata="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">
                       <v:shape id="Graphic 337" o:spid="_x0000_s1027" style="position:absolute;top:36;width:30518;height:12;visibility:visible;mso-wrap-style:square;v-text-anchor:top" coordsize="3051810,1270" o:gfxdata="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" path="m,l3051274,e" filled="f" strokecolor="#ccd3de" strokeweight=".20156mm">
                         <v:path arrowok="t"/>
                       </v:shape>
@@ -28553,7 +28664,7 @@
         </mc:Choice>
         <mc:Fallback>
           <w:pict>
-            <v:shape w14:anchorId="2AF1135F" id="Graphic 7" o:spid="_x0000_s1026" style="position:absolute;margin-left:0;margin-top:817.8pt;width:595.3pt;height:24.1pt;z-index:-16494080;visibility:visible;mso-wrap-style:square;mso-wrap-distance-left:0;mso-wrap-distance-top:0;mso-wrap-distance-right:0;mso-wrap-distance-bottom:0;mso-position-horizontal:absolute;mso-position-horizontal-relative:page;mso-position-vertical:absolute;mso-position-vertical-relative:page;v-text-anchor:top" coordsize="7560309,306070" o:gfxdata="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" path="m7560005,l,,,306000r7560005,l7560005,xe" fillcolor="#0c1a2a" stroked="f">
+            <v:shape w14:anchorId="0283EFB8" id="Graphic 7" o:spid="_x0000_s1026" style="position:absolute;margin-left:0;margin-top:817.8pt;width:595.3pt;height:24.1pt;z-index:-16494080;visibility:visible;mso-wrap-style:square;mso-wrap-distance-left:0;mso-wrap-distance-top:0;mso-wrap-distance-right:0;mso-wrap-distance-bottom:0;mso-position-horizontal:absolute;mso-position-horizontal-relative:page;mso-position-vertical:absolute;mso-position-vertical-relative:page;v-text-anchor:top" coordsize="7560309,306070" o:gfxdata="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" path="m7560005,l,,,306000r7560005,l7560005,xe" fillcolor="#0c1a2a" stroked="f">
               <v:path arrowok="t"/>
               <w10:wrap anchorx="page" anchory="page"/>
             </v:shape>
@@ -29079,7 +29190,7 @@
         </mc:Choice>
         <mc:Fallback>
           <w:pict>
-            <v:shape w14:anchorId="2E36557E" id="Graphic 4" o:spid="_x0000_s1026" style="position:absolute;margin-left:0;margin-top:0;width:595.3pt;height:31.2pt;z-index:-16495616;visibility:visible;mso-wrap-style:square;mso-wrap-distance-left:0;mso-wrap-distance-top:0;mso-wrap-distance-right:0;mso-wrap-distance-bottom:0;mso-position-horizontal:absolute;mso-position-horizontal-relative:page;mso-position-vertical:absolute;mso-position-vertical-relative:page;v-text-anchor:top" coordsize="7560309,396240" o:gfxdata="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" path="m7560005,l,,,395999r7560005,l7560005,xe" fillcolor="#0c1a2a" stroked="f">
+            <v:shape w14:anchorId="4CA09006" id="Graphic 4" o:spid="_x0000_s1026" style="position:absolute;margin-left:0;margin-top:0;width:595.3pt;height:31.2pt;z-index:-16495616;visibility:visible;mso-wrap-style:square;mso-wrap-distance-left:0;mso-wrap-distance-top:0;mso-wrap-distance-right:0;mso-wrap-distance-bottom:0;mso-position-horizontal:absolute;mso-position-horizontal-relative:page;mso-position-vertical:absolute;mso-position-vertical-relative:page;v-text-anchor:top" coordsize="7560309,396240" o:gfxdata="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" path="m7560005,l,,,395999r7560005,l7560005,xe" fillcolor="#0c1a2a" stroked="f">
               <v:path arrowok="t"/>
               <w10:wrap anchorx="page" anchory="page"/>
             </v:shape>

</xml_diff>